<commit_message>
feat: actualizar plantilla de acta de conformidad
</commit_message>
<xml_diff>
--- a/pesaje/analytica/Report/PrintActaConformidad.docx
+++ b/pesaje/analytica/Report/PrintActaConformidad.docx
@@ -18,8 +18,8 @@
         <w:tblLook w:val="04A0" w:firstRow="1" w:lastRow="0" w:firstColumn="1" w:lastColumn="0" w:noHBand="0" w:noVBand="1"/>
       </w:tblPr>
       <w:tblGrid>
-        <w:gridCol w:w="2482"/>
-        <w:gridCol w:w="3755"/>
+        <w:gridCol w:w="2410"/>
+        <w:gridCol w:w="5528"/>
         <w:gridCol w:w="1210"/>
       </w:tblGrid>
       <w:tr>
@@ -28,7 +28,7 @@
         </w:trPr>
         <w:tc>
           <w:tcPr>
-            <w:tcW w:w="6237" w:type="dxa"/>
+            <w:tcW w:w="7938" w:type="dxa"/>
             <w:gridSpan w:val="2"/>
             <w:tcBorders>
               <w:bottom w:val="single" w:sz="4" w:space="0" w:color="auto"/>
@@ -44,12 +44,16 @@
               <w:rPr>
                 <w:b/>
                 <w:bCs/>
+                <w:sz w:val="16"/>
+                <w:szCs w:val="16"/>
               </w:rPr>
             </w:pPr>
             <w:r>
               <w:rPr>
                 <w:b/>
                 <w:bCs/>
+                <w:sz w:val="16"/>
+                <w:szCs w:val="16"/>
               </w:rPr>
               <w:t>ACTA DE CONFORMIDAD DE DESCARGA DE LOTES</w:t>
             </w:r>
@@ -69,12 +73,16 @@
               <w:rPr>
                 <w:b/>
                 <w:bCs/>
+                <w:sz w:val="16"/>
+                <w:szCs w:val="16"/>
               </w:rPr>
             </w:pPr>
             <w:r>
               <w:rPr>
                 <w:b/>
                 <w:bCs/>
+                <w:sz w:val="16"/>
+                <w:szCs w:val="16"/>
               </w:rPr>
               <w:fldChar w:fldCharType="begin"/>
             </w:r>
@@ -82,6 +90,8 @@
               <w:rPr>
                 <w:b/>
                 <w:bCs/>
+                <w:sz w:val="16"/>
+                <w:szCs w:val="16"/>
               </w:rPr>
               <w:instrText xml:space="preserve"> MERGEFIELD  nro_acta  \* MERGEFORMAT </w:instrText>
             </w:r>
@@ -89,6 +99,8 @@
               <w:rPr>
                 <w:b/>
                 <w:bCs/>
+                <w:sz w:val="16"/>
+                <w:szCs w:val="16"/>
               </w:rPr>
               <w:fldChar w:fldCharType="separate"/>
             </w:r>
@@ -97,6 +109,8 @@
                 <w:b/>
                 <w:bCs/>
                 <w:noProof/>
+                <w:sz w:val="16"/>
+                <w:szCs w:val="16"/>
               </w:rPr>
               <w:t>«nro_acta»</w:t>
             </w:r>
@@ -104,6 +118,8 @@
               <w:rPr>
                 <w:b/>
                 <w:bCs/>
+                <w:sz w:val="16"/>
+                <w:szCs w:val="16"/>
               </w:rPr>
               <w:fldChar w:fldCharType="end"/>
             </w:r>
@@ -116,7 +132,7 @@
         </w:trPr>
         <w:tc>
           <w:tcPr>
-            <w:tcW w:w="2482" w:type="dxa"/>
+            <w:tcW w:w="2410" w:type="dxa"/>
             <w:tcBorders>
               <w:top w:val="single" w:sz="4" w:space="0" w:color="auto"/>
               <w:left w:val="single" w:sz="4" w:space="0" w:color="auto"/>
@@ -133,12 +149,16 @@
               <w:rPr>
                 <w:b/>
                 <w:bCs/>
+                <w:sz w:val="16"/>
+                <w:szCs w:val="16"/>
               </w:rPr>
             </w:pPr>
             <w:r>
               <w:rPr>
                 <w:b/>
                 <w:bCs/>
+                <w:sz w:val="16"/>
+                <w:szCs w:val="16"/>
               </w:rPr>
               <w:t>Fecha de descarga</w:t>
             </w:r>
@@ -146,7 +166,7 @@
         </w:tc>
         <w:tc>
           <w:tcPr>
-            <w:tcW w:w="3755" w:type="dxa"/>
+            <w:tcW w:w="5528" w:type="dxa"/>
             <w:tcBorders>
               <w:top w:val="single" w:sz="4" w:space="0" w:color="auto"/>
               <w:left w:val="single" w:sz="4" w:space="0" w:color="auto"/>
@@ -160,15 +180,48 @@
                 <w:tab w:val="left" w:pos="284"/>
               </w:tabs>
               <w:ind w:right="-1"/>
-            </w:pPr>
-            <w:fldSimple w:instr=" MERGEFIELD  fecha_descarga  \* MERGEFORMAT ">
-              <w:r>
-                <w:rPr>
-                  <w:noProof/>
-                </w:rPr>
-                <w:t>«fecha_descarga»</w:t>
-              </w:r>
-            </w:fldSimple>
+              <w:rPr>
+                <w:sz w:val="16"/>
+                <w:szCs w:val="16"/>
+              </w:rPr>
+            </w:pPr>
+            <w:r>
+              <w:rPr>
+                <w:sz w:val="16"/>
+                <w:szCs w:val="16"/>
+              </w:rPr>
+              <w:fldChar w:fldCharType="begin"/>
+            </w:r>
+            <w:r>
+              <w:rPr>
+                <w:sz w:val="16"/>
+                <w:szCs w:val="16"/>
+              </w:rPr>
+              <w:instrText xml:space="preserve"> MERGEFIELD  fecha_descarga  \* MERGEFORMAT </w:instrText>
+            </w:r>
+            <w:r>
+              <w:rPr>
+                <w:sz w:val="16"/>
+                <w:szCs w:val="16"/>
+              </w:rPr>
+              <w:fldChar w:fldCharType="separate"/>
+            </w:r>
+            <w:r>
+              <w:rPr>
+                <w:noProof/>
+                <w:sz w:val="16"/>
+                <w:szCs w:val="16"/>
+              </w:rPr>
+              <w:t>«fecha_descarga»</w:t>
+            </w:r>
+            <w:r>
+              <w:rPr>
+                <w:noProof/>
+                <w:sz w:val="16"/>
+                <w:szCs w:val="16"/>
+              </w:rPr>
+              <w:fldChar w:fldCharType="end"/>
+            </w:r>
           </w:p>
         </w:tc>
         <w:tc>
@@ -184,6 +237,10 @@
                 <w:tab w:val="left" w:pos="284"/>
               </w:tabs>
               <w:ind w:right="-1"/>
+              <w:rPr>
+                <w:sz w:val="16"/>
+                <w:szCs w:val="16"/>
+              </w:rPr>
             </w:pPr>
           </w:p>
         </w:tc>
@@ -194,7 +251,7 @@
         </w:trPr>
         <w:tc>
           <w:tcPr>
-            <w:tcW w:w="2482" w:type="dxa"/>
+            <w:tcW w:w="2410" w:type="dxa"/>
             <w:tcBorders>
               <w:top w:val="single" w:sz="4" w:space="0" w:color="auto"/>
               <w:left w:val="single" w:sz="4" w:space="0" w:color="auto"/>
@@ -211,12 +268,16 @@
               <w:rPr>
                 <w:b/>
                 <w:bCs/>
+                <w:sz w:val="16"/>
+                <w:szCs w:val="16"/>
               </w:rPr>
             </w:pPr>
             <w:r>
               <w:rPr>
                 <w:b/>
                 <w:bCs/>
+                <w:sz w:val="16"/>
+                <w:szCs w:val="16"/>
               </w:rPr>
               <w:t>Hora</w:t>
             </w:r>
@@ -224,7 +285,7 @@
         </w:tc>
         <w:tc>
           <w:tcPr>
-            <w:tcW w:w="3755" w:type="dxa"/>
+            <w:tcW w:w="5528" w:type="dxa"/>
             <w:tcBorders>
               <w:top w:val="single" w:sz="4" w:space="0" w:color="auto"/>
               <w:left w:val="single" w:sz="4" w:space="0" w:color="auto"/>
@@ -238,15 +299,48 @@
                 <w:tab w:val="left" w:pos="284"/>
               </w:tabs>
               <w:ind w:right="-1"/>
-            </w:pPr>
-            <w:fldSimple w:instr=" MERGEFIELD  hora_descarga  \* MERGEFORMAT ">
-              <w:r>
-                <w:rPr>
-                  <w:noProof/>
-                </w:rPr>
-                <w:t>«hora_descarga»</w:t>
-              </w:r>
-            </w:fldSimple>
+              <w:rPr>
+                <w:sz w:val="16"/>
+                <w:szCs w:val="16"/>
+              </w:rPr>
+            </w:pPr>
+            <w:r>
+              <w:rPr>
+                <w:sz w:val="16"/>
+                <w:szCs w:val="16"/>
+              </w:rPr>
+              <w:fldChar w:fldCharType="begin"/>
+            </w:r>
+            <w:r>
+              <w:rPr>
+                <w:sz w:val="16"/>
+                <w:szCs w:val="16"/>
+              </w:rPr>
+              <w:instrText xml:space="preserve"> MERGEFIELD  hora_descarga  \* MERGEFORMAT </w:instrText>
+            </w:r>
+            <w:r>
+              <w:rPr>
+                <w:sz w:val="16"/>
+                <w:szCs w:val="16"/>
+              </w:rPr>
+              <w:fldChar w:fldCharType="separate"/>
+            </w:r>
+            <w:r>
+              <w:rPr>
+                <w:noProof/>
+                <w:sz w:val="16"/>
+                <w:szCs w:val="16"/>
+              </w:rPr>
+              <w:t>«hora_descarga»</w:t>
+            </w:r>
+            <w:r>
+              <w:rPr>
+                <w:noProof/>
+                <w:sz w:val="16"/>
+                <w:szCs w:val="16"/>
+              </w:rPr>
+              <w:fldChar w:fldCharType="end"/>
+            </w:r>
           </w:p>
         </w:tc>
         <w:tc>
@@ -262,6 +356,10 @@
                 <w:tab w:val="left" w:pos="284"/>
               </w:tabs>
               <w:ind w:right="-1"/>
+              <w:rPr>
+                <w:sz w:val="16"/>
+                <w:szCs w:val="16"/>
+              </w:rPr>
             </w:pPr>
           </w:p>
         </w:tc>
@@ -272,7 +370,7 @@
         </w:trPr>
         <w:tc>
           <w:tcPr>
-            <w:tcW w:w="2482" w:type="dxa"/>
+            <w:tcW w:w="2410" w:type="dxa"/>
             <w:tcBorders>
               <w:top w:val="single" w:sz="4" w:space="0" w:color="auto"/>
               <w:left w:val="single" w:sz="4" w:space="0" w:color="auto"/>
@@ -289,12 +387,16 @@
               <w:rPr>
                 <w:b/>
                 <w:bCs/>
+                <w:sz w:val="16"/>
+                <w:szCs w:val="16"/>
               </w:rPr>
             </w:pPr>
             <w:r>
               <w:rPr>
                 <w:b/>
                 <w:bCs/>
+                <w:sz w:val="16"/>
+                <w:szCs w:val="16"/>
               </w:rPr>
               <w:t>Lugar de descarga</w:t>
             </w:r>
@@ -302,7 +404,7 @@
         </w:tc>
         <w:tc>
           <w:tcPr>
-            <w:tcW w:w="3755" w:type="dxa"/>
+            <w:tcW w:w="5528" w:type="dxa"/>
             <w:tcBorders>
               <w:top w:val="single" w:sz="4" w:space="0" w:color="auto"/>
               <w:left w:val="single" w:sz="4" w:space="0" w:color="auto"/>
@@ -316,15 +418,48 @@
                 <w:tab w:val="left" w:pos="284"/>
               </w:tabs>
               <w:ind w:right="-1"/>
-            </w:pPr>
-            <w:fldSimple w:instr=" MERGEFIELD  sucursal  \* MERGEFORMAT ">
-              <w:r>
-                <w:rPr>
-                  <w:noProof/>
-                </w:rPr>
-                <w:t>«sucursal»</w:t>
-              </w:r>
-            </w:fldSimple>
+              <w:rPr>
+                <w:sz w:val="16"/>
+                <w:szCs w:val="16"/>
+              </w:rPr>
+            </w:pPr>
+            <w:r>
+              <w:rPr>
+                <w:sz w:val="16"/>
+                <w:szCs w:val="16"/>
+              </w:rPr>
+              <w:fldChar w:fldCharType="begin"/>
+            </w:r>
+            <w:r>
+              <w:rPr>
+                <w:sz w:val="16"/>
+                <w:szCs w:val="16"/>
+              </w:rPr>
+              <w:instrText xml:space="preserve"> MERGEFIELD  sucursal  \* MERGEFORMAT </w:instrText>
+            </w:r>
+            <w:r>
+              <w:rPr>
+                <w:sz w:val="16"/>
+                <w:szCs w:val="16"/>
+              </w:rPr>
+              <w:fldChar w:fldCharType="separate"/>
+            </w:r>
+            <w:r>
+              <w:rPr>
+                <w:noProof/>
+                <w:sz w:val="16"/>
+                <w:szCs w:val="16"/>
+              </w:rPr>
+              <w:t>«sucursal»</w:t>
+            </w:r>
+            <w:r>
+              <w:rPr>
+                <w:noProof/>
+                <w:sz w:val="16"/>
+                <w:szCs w:val="16"/>
+              </w:rPr>
+              <w:fldChar w:fldCharType="end"/>
+            </w:r>
           </w:p>
         </w:tc>
         <w:tc>
@@ -340,6 +475,10 @@
                 <w:tab w:val="left" w:pos="284"/>
               </w:tabs>
               <w:ind w:right="-1"/>
+              <w:rPr>
+                <w:sz w:val="16"/>
+                <w:szCs w:val="16"/>
+              </w:rPr>
             </w:pPr>
           </w:p>
         </w:tc>
@@ -350,7 +489,7 @@
         </w:trPr>
         <w:tc>
           <w:tcPr>
-            <w:tcW w:w="2482" w:type="dxa"/>
+            <w:tcW w:w="2410" w:type="dxa"/>
             <w:tcBorders>
               <w:top w:val="single" w:sz="4" w:space="0" w:color="auto"/>
               <w:left w:val="single" w:sz="4" w:space="0" w:color="auto"/>
@@ -367,12 +506,16 @@
               <w:rPr>
                 <w:b/>
                 <w:bCs/>
+                <w:sz w:val="16"/>
+                <w:szCs w:val="16"/>
               </w:rPr>
             </w:pPr>
             <w:r>
               <w:rPr>
                 <w:b/>
                 <w:bCs/>
+                <w:sz w:val="16"/>
+                <w:szCs w:val="16"/>
               </w:rPr>
               <w:t>Empresa Transportista</w:t>
             </w:r>
@@ -380,7 +523,7 @@
         </w:tc>
         <w:tc>
           <w:tcPr>
-            <w:tcW w:w="3755" w:type="dxa"/>
+            <w:tcW w:w="5528" w:type="dxa"/>
             <w:tcBorders>
               <w:top w:val="single" w:sz="4" w:space="0" w:color="auto"/>
               <w:left w:val="single" w:sz="4" w:space="0" w:color="auto"/>
@@ -394,15 +537,48 @@
                 <w:tab w:val="left" w:pos="284"/>
               </w:tabs>
               <w:ind w:right="-1"/>
-            </w:pPr>
-            <w:fldSimple w:instr=" MERGEFIELD  transportista  \* MERGEFORMAT ">
-              <w:r>
-                <w:rPr>
-                  <w:noProof/>
-                </w:rPr>
-                <w:t>«transportista»</w:t>
-              </w:r>
-            </w:fldSimple>
+              <w:rPr>
+                <w:sz w:val="16"/>
+                <w:szCs w:val="16"/>
+              </w:rPr>
+            </w:pPr>
+            <w:r>
+              <w:rPr>
+                <w:sz w:val="16"/>
+                <w:szCs w:val="16"/>
+              </w:rPr>
+              <w:fldChar w:fldCharType="begin"/>
+            </w:r>
+            <w:r>
+              <w:rPr>
+                <w:sz w:val="16"/>
+                <w:szCs w:val="16"/>
+              </w:rPr>
+              <w:instrText xml:space="preserve"> MERGEFIELD  transportista  \* MERGEFORMAT </w:instrText>
+            </w:r>
+            <w:r>
+              <w:rPr>
+                <w:sz w:val="16"/>
+                <w:szCs w:val="16"/>
+              </w:rPr>
+              <w:fldChar w:fldCharType="separate"/>
+            </w:r>
+            <w:r>
+              <w:rPr>
+                <w:noProof/>
+                <w:sz w:val="16"/>
+                <w:szCs w:val="16"/>
+              </w:rPr>
+              <w:t>«transportista»</w:t>
+            </w:r>
+            <w:r>
+              <w:rPr>
+                <w:noProof/>
+                <w:sz w:val="16"/>
+                <w:szCs w:val="16"/>
+              </w:rPr>
+              <w:fldChar w:fldCharType="end"/>
+            </w:r>
           </w:p>
         </w:tc>
         <w:tc>
@@ -418,6 +594,10 @@
                 <w:tab w:val="left" w:pos="284"/>
               </w:tabs>
               <w:ind w:right="-1"/>
+              <w:rPr>
+                <w:sz w:val="16"/>
+                <w:szCs w:val="16"/>
+              </w:rPr>
             </w:pPr>
           </w:p>
         </w:tc>
@@ -428,7 +608,7 @@
         </w:trPr>
         <w:tc>
           <w:tcPr>
-            <w:tcW w:w="2482" w:type="dxa"/>
+            <w:tcW w:w="2410" w:type="dxa"/>
             <w:tcBorders>
               <w:top w:val="single" w:sz="4" w:space="0" w:color="auto"/>
               <w:left w:val="single" w:sz="4" w:space="0" w:color="auto"/>
@@ -445,12 +625,16 @@
               <w:rPr>
                 <w:b/>
                 <w:bCs/>
+                <w:sz w:val="16"/>
+                <w:szCs w:val="16"/>
               </w:rPr>
             </w:pPr>
             <w:r>
               <w:rPr>
                 <w:b/>
                 <w:bCs/>
+                <w:sz w:val="16"/>
+                <w:szCs w:val="16"/>
               </w:rPr>
               <w:t>Conductor</w:t>
             </w:r>
@@ -458,7 +642,7 @@
         </w:tc>
         <w:tc>
           <w:tcPr>
-            <w:tcW w:w="3755" w:type="dxa"/>
+            <w:tcW w:w="5528" w:type="dxa"/>
             <w:tcBorders>
               <w:top w:val="single" w:sz="4" w:space="0" w:color="auto"/>
               <w:left w:val="single" w:sz="4" w:space="0" w:color="auto"/>
@@ -472,15 +656,48 @@
                 <w:tab w:val="left" w:pos="284"/>
               </w:tabs>
               <w:ind w:right="-1"/>
-            </w:pPr>
-            <w:fldSimple w:instr=" MERGEFIELD  nom_conductor  \* MERGEFORMAT ">
-              <w:r>
-                <w:rPr>
-                  <w:noProof/>
-                </w:rPr>
-                <w:t>«nom_conductor»</w:t>
-              </w:r>
-            </w:fldSimple>
+              <w:rPr>
+                <w:sz w:val="16"/>
+                <w:szCs w:val="16"/>
+              </w:rPr>
+            </w:pPr>
+            <w:r>
+              <w:rPr>
+                <w:sz w:val="16"/>
+                <w:szCs w:val="16"/>
+              </w:rPr>
+              <w:fldChar w:fldCharType="begin"/>
+            </w:r>
+            <w:r>
+              <w:rPr>
+                <w:sz w:val="16"/>
+                <w:szCs w:val="16"/>
+              </w:rPr>
+              <w:instrText xml:space="preserve"> MERGEFIELD  nom_conductor  \* MERGEFORMAT </w:instrText>
+            </w:r>
+            <w:r>
+              <w:rPr>
+                <w:sz w:val="16"/>
+                <w:szCs w:val="16"/>
+              </w:rPr>
+              <w:fldChar w:fldCharType="separate"/>
+            </w:r>
+            <w:r>
+              <w:rPr>
+                <w:noProof/>
+                <w:sz w:val="16"/>
+                <w:szCs w:val="16"/>
+              </w:rPr>
+              <w:t>«nom_conductor»</w:t>
+            </w:r>
+            <w:r>
+              <w:rPr>
+                <w:noProof/>
+                <w:sz w:val="16"/>
+                <w:szCs w:val="16"/>
+              </w:rPr>
+              <w:fldChar w:fldCharType="end"/>
+            </w:r>
           </w:p>
         </w:tc>
         <w:tc>
@@ -496,6 +713,10 @@
                 <w:tab w:val="left" w:pos="284"/>
               </w:tabs>
               <w:ind w:right="-1"/>
+              <w:rPr>
+                <w:sz w:val="16"/>
+                <w:szCs w:val="16"/>
+              </w:rPr>
             </w:pPr>
           </w:p>
         </w:tc>
@@ -506,7 +727,7 @@
         </w:trPr>
         <w:tc>
           <w:tcPr>
-            <w:tcW w:w="2482" w:type="dxa"/>
+            <w:tcW w:w="2410" w:type="dxa"/>
             <w:tcBorders>
               <w:top w:val="single" w:sz="4" w:space="0" w:color="auto"/>
               <w:left w:val="single" w:sz="4" w:space="0" w:color="auto"/>
@@ -523,12 +744,16 @@
               <w:rPr>
                 <w:b/>
                 <w:bCs/>
+                <w:sz w:val="16"/>
+                <w:szCs w:val="16"/>
               </w:rPr>
             </w:pPr>
             <w:r>
               <w:rPr>
                 <w:b/>
                 <w:bCs/>
+                <w:sz w:val="16"/>
+                <w:szCs w:val="16"/>
               </w:rPr>
               <w:t>DNI</w:t>
             </w:r>
@@ -536,7 +761,7 @@
         </w:tc>
         <w:tc>
           <w:tcPr>
-            <w:tcW w:w="3755" w:type="dxa"/>
+            <w:tcW w:w="5528" w:type="dxa"/>
             <w:tcBorders>
               <w:top w:val="single" w:sz="4" w:space="0" w:color="auto"/>
               <w:left w:val="single" w:sz="4" w:space="0" w:color="auto"/>
@@ -550,15 +775,48 @@
                 <w:tab w:val="left" w:pos="284"/>
               </w:tabs>
               <w:ind w:right="-1"/>
-            </w:pPr>
-            <w:fldSimple w:instr=" MERGEFIELD  doc_conductor  \* MERGEFORMAT ">
-              <w:r>
-                <w:rPr>
-                  <w:noProof/>
-                </w:rPr>
-                <w:t>«doc_conductor»</w:t>
-              </w:r>
-            </w:fldSimple>
+              <w:rPr>
+                <w:sz w:val="16"/>
+                <w:szCs w:val="16"/>
+              </w:rPr>
+            </w:pPr>
+            <w:r>
+              <w:rPr>
+                <w:sz w:val="16"/>
+                <w:szCs w:val="16"/>
+              </w:rPr>
+              <w:fldChar w:fldCharType="begin"/>
+            </w:r>
+            <w:r>
+              <w:rPr>
+                <w:sz w:val="16"/>
+                <w:szCs w:val="16"/>
+              </w:rPr>
+              <w:instrText xml:space="preserve"> MERGEFIELD  doc_conductor  \* MERGEFORMAT </w:instrText>
+            </w:r>
+            <w:r>
+              <w:rPr>
+                <w:sz w:val="16"/>
+                <w:szCs w:val="16"/>
+              </w:rPr>
+              <w:fldChar w:fldCharType="separate"/>
+            </w:r>
+            <w:r>
+              <w:rPr>
+                <w:noProof/>
+                <w:sz w:val="16"/>
+                <w:szCs w:val="16"/>
+              </w:rPr>
+              <w:t>«doc_conductor»</w:t>
+            </w:r>
+            <w:r>
+              <w:rPr>
+                <w:noProof/>
+                <w:sz w:val="16"/>
+                <w:szCs w:val="16"/>
+              </w:rPr>
+              <w:fldChar w:fldCharType="end"/>
+            </w:r>
           </w:p>
         </w:tc>
         <w:tc>
@@ -574,6 +832,10 @@
                 <w:tab w:val="left" w:pos="284"/>
               </w:tabs>
               <w:ind w:right="-1"/>
+              <w:rPr>
+                <w:sz w:val="16"/>
+                <w:szCs w:val="16"/>
+              </w:rPr>
             </w:pPr>
           </w:p>
         </w:tc>
@@ -584,7 +846,7 @@
         </w:trPr>
         <w:tc>
           <w:tcPr>
-            <w:tcW w:w="2482" w:type="dxa"/>
+            <w:tcW w:w="2410" w:type="dxa"/>
             <w:tcBorders>
               <w:top w:val="single" w:sz="4" w:space="0" w:color="auto"/>
               <w:left w:val="single" w:sz="4" w:space="0" w:color="auto"/>
@@ -601,12 +863,16 @@
               <w:rPr>
                 <w:b/>
                 <w:bCs/>
+                <w:sz w:val="16"/>
+                <w:szCs w:val="16"/>
               </w:rPr>
             </w:pPr>
             <w:r>
               <w:rPr>
                 <w:b/>
                 <w:bCs/>
+                <w:sz w:val="16"/>
+                <w:szCs w:val="16"/>
               </w:rPr>
               <w:t>Placa de Vehículo</w:t>
             </w:r>
@@ -614,7 +880,7 @@
         </w:tc>
         <w:tc>
           <w:tcPr>
-            <w:tcW w:w="3755" w:type="dxa"/>
+            <w:tcW w:w="5528" w:type="dxa"/>
             <w:tcBorders>
               <w:top w:val="single" w:sz="4" w:space="0" w:color="auto"/>
               <w:left w:val="single" w:sz="4" w:space="0" w:color="auto"/>
@@ -628,15 +894,48 @@
                 <w:tab w:val="left" w:pos="284"/>
               </w:tabs>
               <w:ind w:right="-1"/>
-            </w:pPr>
-            <w:fldSimple w:instr=" MERGEFIELD  nro_placa  \* MERGEFORMAT ">
-              <w:r>
-                <w:rPr>
-                  <w:noProof/>
-                </w:rPr>
-                <w:t>«nro_placa»</w:t>
-              </w:r>
-            </w:fldSimple>
+              <w:rPr>
+                <w:sz w:val="16"/>
+                <w:szCs w:val="16"/>
+              </w:rPr>
+            </w:pPr>
+            <w:r>
+              <w:rPr>
+                <w:sz w:val="16"/>
+                <w:szCs w:val="16"/>
+              </w:rPr>
+              <w:fldChar w:fldCharType="begin"/>
+            </w:r>
+            <w:r>
+              <w:rPr>
+                <w:sz w:val="16"/>
+                <w:szCs w:val="16"/>
+              </w:rPr>
+              <w:instrText xml:space="preserve"> MERGEFIELD  nro_placa  \* MERGEFORMAT </w:instrText>
+            </w:r>
+            <w:r>
+              <w:rPr>
+                <w:sz w:val="16"/>
+                <w:szCs w:val="16"/>
+              </w:rPr>
+              <w:fldChar w:fldCharType="separate"/>
+            </w:r>
+            <w:r>
+              <w:rPr>
+                <w:noProof/>
+                <w:sz w:val="16"/>
+                <w:szCs w:val="16"/>
+              </w:rPr>
+              <w:t>«nro_placa»</w:t>
+            </w:r>
+            <w:r>
+              <w:rPr>
+                <w:noProof/>
+                <w:sz w:val="16"/>
+                <w:szCs w:val="16"/>
+              </w:rPr>
+              <w:fldChar w:fldCharType="end"/>
+            </w:r>
           </w:p>
         </w:tc>
         <w:tc>
@@ -652,6 +951,10 @@
                 <w:tab w:val="left" w:pos="284"/>
               </w:tabs>
               <w:ind w:right="-1"/>
+              <w:rPr>
+                <w:sz w:val="16"/>
+                <w:szCs w:val="16"/>
+              </w:rPr>
             </w:pPr>
           </w:p>
         </w:tc>
@@ -918,14 +1221,6 @@
         <w:ind w:right="-1"/>
       </w:pPr>
     </w:p>
-    <w:p>
-      <w:pPr>
-        <w:tabs>
-          <w:tab w:val="left" w:pos="284"/>
-        </w:tabs>
-        <w:ind w:right="-1"/>
-      </w:pPr>
-    </w:p>
     <w:tbl>
       <w:tblPr>
         <w:tblStyle w:val="Tablaconcuadrcula"/>
@@ -954,6 +1249,10 @@
                 <w:tab w:val="left" w:pos="284"/>
               </w:tabs>
               <w:ind w:right="-1"/>
+              <w:rPr>
+                <w:sz w:val="16"/>
+                <w:szCs w:val="16"/>
+              </w:rPr>
             </w:pPr>
           </w:p>
         </w:tc>
@@ -969,8 +1268,16 @@
                 <w:tab w:val="left" w:pos="284"/>
               </w:tabs>
               <w:ind w:right="-1"/>
-            </w:pPr>
-            <w:r>
+              <w:rPr>
+                <w:sz w:val="16"/>
+                <w:szCs w:val="16"/>
+              </w:rPr>
+            </w:pPr>
+            <w:r>
+              <w:rPr>
+                <w:sz w:val="16"/>
+                <w:szCs w:val="16"/>
+              </w:rPr>
               <w:t>Por medio de la presente, doy conformidad al proceso de descarga de lotes y sacos transportados correspondientes al vehículo detallado en el presente documento, dejando constancia de la recepción conforme de la carga según el detalle consignado a continuación.</w:t>
             </w:r>
           </w:p>
@@ -1323,7 +1630,7 @@
       </w:tblGrid>
       <w:tr>
         <w:trPr>
-          <w:trHeight w:val="655"/>
+          <w:trHeight w:val="220"/>
         </w:trPr>
         <w:tc>
           <w:tcPr>
@@ -1352,7 +1659,7 @@
                 <w:sz w:val="16"/>
                 <w:szCs w:val="16"/>
               </w:rPr>
-              <w:instrText xml:space="preserve"> MERGEFIELD  nro_item  \* MERGEFORMAT </w:instrText>
+              <w:instrText xml:space="preserve"> MERGEFIELD  item  \* MERGEFORMAT </w:instrText>
             </w:r>
             <w:r>
               <w:rPr>
@@ -1367,7 +1674,52 @@
                 <w:sz w:val="16"/>
                 <w:szCs w:val="16"/>
               </w:rPr>
-              <w:t>«nro_item»</w:t>
+              <w:t>«item»</w:t>
+            </w:r>
+            <w:r>
+              <w:rPr>
+                <w:sz w:val="16"/>
+                <w:szCs w:val="16"/>
+              </w:rPr>
+              <w:fldChar w:fldCharType="end"/>
+            </w:r>
+          </w:p>
+        </w:tc>
+        <w:tc>
+          <w:tcPr>
+            <w:tcW w:w="1701" w:type="dxa"/>
+          </w:tcPr>
+          <w:p>
+            <w:pPr>
+              <w:tabs>
+                <w:tab w:val="left" w:pos="284"/>
+              </w:tabs>
+              <w:ind w:right="-1"/>
+              <w:rPr>
+                <w:sz w:val="16"/>
+                <w:szCs w:val="16"/>
+              </w:rPr>
+            </w:pPr>
+            <w:r>
+              <w:rPr>
+                <w:sz w:val="16"/>
+                <w:szCs w:val="16"/>
+              </w:rPr>
+              <w:fldChar w:fldCharType="begin"/>
+            </w:r>
+            <w:r>
+              <w:rPr>
+                <w:sz w:val="16"/>
+                <w:szCs w:val="16"/>
+              </w:rPr>
+              <w:instrText xml:space="preserve"> MERGEFIELD  nro_lote  \* MERGEFORMAT </w:instrText>
+            </w:r>
+            <w:r>
+              <w:rPr>
+                <w:sz w:val="16"/>
+                <w:szCs w:val="16"/>
+              </w:rPr>
+              <w:fldChar w:fldCharType="separate"/>
             </w:r>
             <w:r>
               <w:rPr>
@@ -1375,13 +1727,21 @@
                 <w:sz w:val="16"/>
                 <w:szCs w:val="16"/>
               </w:rPr>
+              <w:t>«nro_lote»</w:t>
+            </w:r>
+            <w:r>
+              <w:rPr>
+                <w:noProof/>
+                <w:sz w:val="16"/>
+                <w:szCs w:val="16"/>
+              </w:rPr>
               <w:fldChar w:fldCharType="end"/>
             </w:r>
           </w:p>
         </w:tc>
         <w:tc>
           <w:tcPr>
-            <w:tcW w:w="1701" w:type="dxa"/>
+            <w:tcW w:w="1418" w:type="dxa"/>
           </w:tcPr>
           <w:p>
             <w:pPr>
@@ -1406,7 +1766,7 @@
                 <w:sz w:val="16"/>
                 <w:szCs w:val="16"/>
               </w:rPr>
-              <w:instrText xml:space="preserve"> MERGEFIELD  nro_lote  \* MERGEFORMAT </w:instrText>
+              <w:instrText xml:space="preserve"> MERGEFIELD  cant_minero  \* MERGEFORMAT </w:instrText>
             </w:r>
             <w:r>
               <w:rPr>
@@ -1421,7 +1781,52 @@
                 <w:sz w:val="16"/>
                 <w:szCs w:val="16"/>
               </w:rPr>
-              <w:t>«nro_lote»</w:t>
+              <w:t>«cant_minero»</w:t>
+            </w:r>
+            <w:r>
+              <w:rPr>
+                <w:sz w:val="16"/>
+                <w:szCs w:val="16"/>
+              </w:rPr>
+              <w:fldChar w:fldCharType="end"/>
+            </w:r>
+          </w:p>
+        </w:tc>
+        <w:tc>
+          <w:tcPr>
+            <w:tcW w:w="1417" w:type="dxa"/>
+          </w:tcPr>
+          <w:p>
+            <w:pPr>
+              <w:tabs>
+                <w:tab w:val="left" w:pos="284"/>
+              </w:tabs>
+              <w:ind w:right="-1"/>
+              <w:rPr>
+                <w:sz w:val="16"/>
+                <w:szCs w:val="16"/>
+              </w:rPr>
+            </w:pPr>
+            <w:r>
+              <w:rPr>
+                <w:sz w:val="16"/>
+                <w:szCs w:val="16"/>
+              </w:rPr>
+              <w:fldChar w:fldCharType="begin"/>
+            </w:r>
+            <w:r>
+              <w:rPr>
+                <w:sz w:val="16"/>
+                <w:szCs w:val="16"/>
+              </w:rPr>
+              <w:instrText xml:space="preserve"> MERGEFIELD  cant  \* MERGEFORMAT </w:instrText>
+            </w:r>
+            <w:r>
+              <w:rPr>
+                <w:sz w:val="16"/>
+                <w:szCs w:val="16"/>
+              </w:rPr>
+              <w:fldChar w:fldCharType="separate"/>
             </w:r>
             <w:r>
               <w:rPr>
@@ -1429,111 +1834,10 @@
                 <w:sz w:val="16"/>
                 <w:szCs w:val="16"/>
               </w:rPr>
-              <w:fldChar w:fldCharType="end"/>
-            </w:r>
-          </w:p>
-        </w:tc>
-        <w:tc>
-          <w:tcPr>
-            <w:tcW w:w="1418" w:type="dxa"/>
-          </w:tcPr>
-          <w:p>
-            <w:pPr>
-              <w:tabs>
-                <w:tab w:val="left" w:pos="284"/>
-              </w:tabs>
-              <w:ind w:right="-1"/>
-              <w:rPr>
-                <w:sz w:val="16"/>
-                <w:szCs w:val="16"/>
-              </w:rPr>
-            </w:pPr>
-            <w:r>
-              <w:rPr>
-                <w:sz w:val="16"/>
-                <w:szCs w:val="16"/>
-              </w:rPr>
-              <w:fldChar w:fldCharType="begin"/>
-            </w:r>
-            <w:r>
-              <w:rPr>
-                <w:sz w:val="16"/>
-                <w:szCs w:val="16"/>
-              </w:rPr>
-              <w:instrText xml:space="preserve"> MERGEFIELD  cant_presentacion_minero  \* MERGEFORMAT </w:instrText>
-            </w:r>
-            <w:r>
-              <w:rPr>
-                <w:sz w:val="16"/>
-                <w:szCs w:val="16"/>
-              </w:rPr>
-              <w:fldChar w:fldCharType="separate"/>
-            </w:r>
-            <w:r>
-              <w:rPr>
-                <w:noProof/>
-                <w:sz w:val="16"/>
-                <w:szCs w:val="16"/>
-              </w:rPr>
-              <w:t>«cant_presentacion_minero»</w:t>
-            </w:r>
-            <w:r>
-              <w:rPr>
-                <w:noProof/>
-                <w:sz w:val="16"/>
-                <w:szCs w:val="16"/>
-              </w:rPr>
-              <w:fldChar w:fldCharType="end"/>
-            </w:r>
-          </w:p>
-        </w:tc>
-        <w:tc>
-          <w:tcPr>
-            <w:tcW w:w="1417" w:type="dxa"/>
-          </w:tcPr>
-          <w:p>
-            <w:pPr>
-              <w:tabs>
-                <w:tab w:val="left" w:pos="284"/>
-              </w:tabs>
-              <w:ind w:right="-1"/>
-              <w:rPr>
-                <w:sz w:val="16"/>
-                <w:szCs w:val="16"/>
-              </w:rPr>
-            </w:pPr>
-            <w:r>
-              <w:rPr>
-                <w:sz w:val="16"/>
-                <w:szCs w:val="16"/>
-              </w:rPr>
-              <w:fldChar w:fldCharType="begin"/>
-            </w:r>
-            <w:r>
-              <w:rPr>
-                <w:sz w:val="16"/>
-                <w:szCs w:val="16"/>
-              </w:rPr>
-              <w:instrText xml:space="preserve"> MERGEFIELD  cant_presentacion  \* MERGEFORMAT </w:instrText>
-            </w:r>
-            <w:r>
-              <w:rPr>
-                <w:sz w:val="16"/>
-                <w:szCs w:val="16"/>
-              </w:rPr>
-              <w:fldChar w:fldCharType="separate"/>
-            </w:r>
-            <w:r>
-              <w:rPr>
-                <w:noProof/>
-                <w:sz w:val="16"/>
-                <w:szCs w:val="16"/>
-              </w:rPr>
-              <w:t>«cant_presentacion»</w:t>
-            </w:r>
-            <w:r>
-              <w:rPr>
-                <w:noProof/>
+              <w:t>«cant»</w:t>
+            </w:r>
+            <w:r>
+              <w:rPr>
                 <w:sz w:val="16"/>
                 <w:szCs w:val="16"/>
               </w:rPr>
@@ -1893,7 +2197,7 @@
       </w:tblGrid>
       <w:tr>
         <w:trPr>
-          <w:trHeight w:val="655"/>
+          <w:trHeight w:val="230"/>
         </w:trPr>
         <w:tc>
           <w:tcPr>
@@ -1923,19 +2227,6 @@
               </w:rPr>
               <w:t>TOTAL</w:t>
             </w:r>
-          </w:p>
-          <w:p>
-            <w:pPr>
-              <w:tabs>
-                <w:tab w:val="left" w:pos="284"/>
-              </w:tabs>
-              <w:ind w:right="-1"/>
-              <w:jc w:val="center"/>
-              <w:rPr>
-                <w:sz w:val="16"/>
-                <w:szCs w:val="16"/>
-              </w:rPr>
-            </w:pPr>
             <w:r>
               <w:rPr>
                 <w:sz w:val="16"/>
@@ -2000,7 +2291,7 @@
                 <w:sz w:val="16"/>
                 <w:szCs w:val="16"/>
               </w:rPr>
-              <w:instrText xml:space="preserve"> MERGEFIELD  total_cant_presentacion_minero  \* MERGEFORMAT </w:instrText>
+              <w:instrText xml:space="preserve"> MERGEFIELD  total_cant_m  \* MERGEFORMAT </w:instrText>
             </w:r>
             <w:r>
               <w:rPr>
@@ -2015,11 +2306,10 @@
                 <w:sz w:val="16"/>
                 <w:szCs w:val="16"/>
               </w:rPr>
-              <w:t>«total_cant_presentacion_minero»</w:t>
-            </w:r>
-            <w:r>
-              <w:rPr>
-                <w:noProof/>
+              <w:t>«total_cant_m»</w:t>
+            </w:r>
+            <w:r>
+              <w:rPr>
                 <w:sz w:val="16"/>
                 <w:szCs w:val="16"/>
               </w:rPr>
@@ -2061,7 +2351,7 @@
                 <w:sz w:val="16"/>
                 <w:szCs w:val="16"/>
               </w:rPr>
-              <w:instrText xml:space="preserve"> MERGEFIELD  total_cant_presentacion  \* MERGEFORMAT </w:instrText>
+              <w:instrText xml:space="preserve"> MERGEFIELD  total_cant  \* MERGEFORMAT </w:instrText>
             </w:r>
             <w:r>
               <w:rPr>
@@ -2076,11 +2366,10 @@
                 <w:sz w:val="16"/>
                 <w:szCs w:val="16"/>
               </w:rPr>
-              <w:t>«total_cant_presentacion»</w:t>
-            </w:r>
-            <w:r>
-              <w:rPr>
-                <w:noProof/>
+              <w:t>«total_cant»</w:t>
+            </w:r>
+            <w:r>
+              <w:rPr>
                 <w:sz w:val="16"/>
                 <w:szCs w:val="16"/>
               </w:rPr>
@@ -2122,7 +2411,7 @@
                 <w:sz w:val="16"/>
                 <w:szCs w:val="16"/>
               </w:rPr>
-              <w:instrText xml:space="preserve"> MERGEFIELD  total_tmh  \* MERGEFORMAT </w:instrText>
+              <w:instrText xml:space="preserve"> MERGEFIELD  total  \* MERGEFORMAT </w:instrText>
             </w:r>
             <w:r>
               <w:rPr>
@@ -2137,11 +2426,10 @@
                 <w:sz w:val="16"/>
                 <w:szCs w:val="16"/>
               </w:rPr>
-              <w:t>«total_tmh»</w:t>
-            </w:r>
-            <w:r>
-              <w:rPr>
-                <w:noProof/>
+              <w:t>«total»</w:t>
+            </w:r>
+            <w:r>
+              <w:rPr>
                 <w:sz w:val="16"/>
                 <w:szCs w:val="16"/>
               </w:rPr>
@@ -2256,7 +2544,7 @@
         <w:tblStyle w:val="Tablaconcuadrcula"/>
         <w:tblpPr w:leftFromText="141" w:rightFromText="141" w:vertAnchor="text" w:tblpY="1"/>
         <w:tblOverlap w:val="never"/>
-        <w:tblW w:w="0" w:type="pct"/>
+        <w:tblW w:w="5000" w:type="pct"/>
         <w:tblLayout w:type="fixed"/>
         <w:tblLook w:val="04A0" w:firstRow="1" w:lastRow="0" w:firstColumn="1" w:lastColumn="0" w:noHBand="0" w:noVBand="1"/>
       </w:tblPr>
@@ -2296,12 +2584,16 @@
               <w:rPr>
                 <w:b/>
                 <w:bCs/>
+                <w:sz w:val="16"/>
+                <w:szCs w:val="16"/>
               </w:rPr>
             </w:pPr>
             <w:r>
               <w:rPr>
                 <w:b/>
                 <w:bCs/>
+                <w:sz w:val="16"/>
+                <w:szCs w:val="16"/>
               </w:rPr>
               <w:t>ENCARGADO</w:t>
             </w:r>
@@ -2323,6 +2615,10 @@
                 <w:tab w:val="left" w:pos="284"/>
               </w:tabs>
               <w:ind w:right="-1"/>
+              <w:rPr>
+                <w:sz w:val="16"/>
+                <w:szCs w:val="16"/>
+              </w:rPr>
             </w:pPr>
           </w:p>
         </w:tc>
@@ -2347,12 +2643,16 @@
               <w:rPr>
                 <w:b/>
                 <w:bCs/>
+                <w:sz w:val="16"/>
+                <w:szCs w:val="16"/>
               </w:rPr>
             </w:pPr>
             <w:r>
               <w:rPr>
                 <w:b/>
                 <w:bCs/>
+                <w:sz w:val="16"/>
+                <w:szCs w:val="16"/>
               </w:rPr>
               <w:t>BALANZA</w:t>
             </w:r>
@@ -2374,6 +2674,10 @@
                 <w:tab w:val="left" w:pos="284"/>
               </w:tabs>
               <w:ind w:right="-1"/>
+              <w:rPr>
+                <w:sz w:val="16"/>
+                <w:szCs w:val="16"/>
+              </w:rPr>
             </w:pPr>
           </w:p>
         </w:tc>
@@ -2398,12 +2702,16 @@
               <w:rPr>
                 <w:b/>
                 <w:bCs/>
+                <w:sz w:val="16"/>
+                <w:szCs w:val="16"/>
               </w:rPr>
             </w:pPr>
             <w:r>
               <w:rPr>
                 <w:b/>
                 <w:bCs/>
+                <w:sz w:val="16"/>
+                <w:szCs w:val="16"/>
               </w:rPr>
               <w:t>SUPERVISOR</w:t>
             </w:r>
@@ -2431,8 +2739,16 @@
                 <w:tab w:val="left" w:pos="284"/>
               </w:tabs>
               <w:ind w:right="-1"/>
-            </w:pPr>
-            <w:r>
+              <w:rPr>
+                <w:sz w:val="16"/>
+                <w:szCs w:val="16"/>
+              </w:rPr>
+            </w:pPr>
+            <w:r>
+              <w:rPr>
+                <w:sz w:val="16"/>
+                <w:szCs w:val="16"/>
+              </w:rPr>
               <w:t>Firma y Huella:</w:t>
             </w:r>
           </w:p>
@@ -2453,6 +2769,10 @@
                 <w:tab w:val="left" w:pos="284"/>
               </w:tabs>
               <w:ind w:right="-1"/>
+              <w:rPr>
+                <w:sz w:val="16"/>
+                <w:szCs w:val="16"/>
+              </w:rPr>
             </w:pPr>
           </w:p>
         </w:tc>
@@ -2472,6 +2792,10 @@
                 <w:tab w:val="left" w:pos="284"/>
               </w:tabs>
               <w:ind w:right="-1"/>
+              <w:rPr>
+                <w:sz w:val="16"/>
+                <w:szCs w:val="16"/>
+              </w:rPr>
             </w:pPr>
           </w:p>
         </w:tc>
@@ -2491,8 +2815,16 @@
                 <w:tab w:val="left" w:pos="284"/>
               </w:tabs>
               <w:ind w:right="-1"/>
-            </w:pPr>
-            <w:r>
+              <w:rPr>
+                <w:sz w:val="16"/>
+                <w:szCs w:val="16"/>
+              </w:rPr>
+            </w:pPr>
+            <w:r>
+              <w:rPr>
+                <w:sz w:val="16"/>
+                <w:szCs w:val="16"/>
+              </w:rPr>
               <w:t>Firma y sello:</w:t>
             </w:r>
           </w:p>
@@ -2513,6 +2845,10 @@
                 <w:tab w:val="left" w:pos="284"/>
               </w:tabs>
               <w:ind w:right="-1"/>
+              <w:rPr>
+                <w:sz w:val="16"/>
+                <w:szCs w:val="16"/>
+              </w:rPr>
             </w:pPr>
           </w:p>
         </w:tc>
@@ -2532,6 +2868,10 @@
                 <w:tab w:val="left" w:pos="284"/>
               </w:tabs>
               <w:ind w:right="-1"/>
+              <w:rPr>
+                <w:sz w:val="16"/>
+                <w:szCs w:val="16"/>
+              </w:rPr>
             </w:pPr>
           </w:p>
         </w:tc>
@@ -2551,8 +2891,16 @@
                 <w:tab w:val="left" w:pos="284"/>
               </w:tabs>
               <w:ind w:right="-1"/>
-            </w:pPr>
-            <w:r>
+              <w:rPr>
+                <w:sz w:val="16"/>
+                <w:szCs w:val="16"/>
+              </w:rPr>
+            </w:pPr>
+            <w:r>
+              <w:rPr>
+                <w:sz w:val="16"/>
+                <w:szCs w:val="16"/>
+              </w:rPr>
               <w:t>Firma y sello:</w:t>
             </w:r>
           </w:p>
@@ -2573,6 +2921,10 @@
                 <w:tab w:val="left" w:pos="284"/>
               </w:tabs>
               <w:ind w:right="-1"/>
+              <w:rPr>
+                <w:sz w:val="16"/>
+                <w:szCs w:val="16"/>
+              </w:rPr>
             </w:pPr>
           </w:p>
         </w:tc>
@@ -2598,7 +2950,18 @@
                 <w:tab w:val="left" w:pos="284"/>
               </w:tabs>
               <w:ind w:right="-1"/>
-            </w:pPr>
+              <w:rPr>
+                <w:sz w:val="16"/>
+                <w:szCs w:val="16"/>
+              </w:rPr>
+            </w:pPr>
+            <w:r>
+              <w:rPr>
+                <w:sz w:val="16"/>
+                <w:szCs w:val="16"/>
+              </w:rPr>
+              <w:t>Nombre:</w:t>
+            </w:r>
           </w:p>
         </w:tc>
         <w:tc>
@@ -2617,7 +2980,48 @@
                 <w:tab w:val="left" w:pos="284"/>
               </w:tabs>
               <w:ind w:right="-1"/>
-            </w:pPr>
+              <w:rPr>
+                <w:sz w:val="16"/>
+                <w:szCs w:val="16"/>
+              </w:rPr>
+            </w:pPr>
+            <w:r>
+              <w:rPr>
+                <w:sz w:val="16"/>
+                <w:szCs w:val="16"/>
+              </w:rPr>
+              <w:fldChar w:fldCharType="begin"/>
+            </w:r>
+            <w:r>
+              <w:rPr>
+                <w:sz w:val="16"/>
+                <w:szCs w:val="16"/>
+              </w:rPr>
+              <w:instrText xml:space="preserve"> MERGEFIELD  nom_encargado  \* MERGEFORMAT </w:instrText>
+            </w:r>
+            <w:r>
+              <w:rPr>
+                <w:sz w:val="16"/>
+                <w:szCs w:val="16"/>
+              </w:rPr>
+              <w:fldChar w:fldCharType="separate"/>
+            </w:r>
+            <w:r>
+              <w:rPr>
+                <w:noProof/>
+                <w:sz w:val="16"/>
+                <w:szCs w:val="16"/>
+              </w:rPr>
+              <w:t>«nom_encargado»</w:t>
+            </w:r>
+            <w:r>
+              <w:rPr>
+                <w:noProof/>
+                <w:sz w:val="16"/>
+                <w:szCs w:val="16"/>
+              </w:rPr>
+              <w:fldChar w:fldCharType="end"/>
+            </w:r>
           </w:p>
         </w:tc>
         <w:tc>
@@ -2636,6 +3040,10 @@
                 <w:tab w:val="left" w:pos="284"/>
               </w:tabs>
               <w:ind w:right="-1"/>
+              <w:rPr>
+                <w:sz w:val="16"/>
+                <w:szCs w:val="16"/>
+              </w:rPr>
             </w:pPr>
           </w:p>
         </w:tc>
@@ -2655,6 +3063,10 @@
                 <w:tab w:val="left" w:pos="284"/>
               </w:tabs>
               <w:ind w:right="-1"/>
+              <w:rPr>
+                <w:sz w:val="16"/>
+                <w:szCs w:val="16"/>
+              </w:rPr>
             </w:pPr>
           </w:p>
         </w:tc>
@@ -2674,6 +3086,10 @@
                 <w:tab w:val="left" w:pos="284"/>
               </w:tabs>
               <w:ind w:right="-1"/>
+              <w:rPr>
+                <w:sz w:val="16"/>
+                <w:szCs w:val="16"/>
+              </w:rPr>
             </w:pPr>
           </w:p>
         </w:tc>
@@ -2693,6 +3109,10 @@
                 <w:tab w:val="left" w:pos="284"/>
               </w:tabs>
               <w:ind w:right="-1"/>
+              <w:rPr>
+                <w:sz w:val="16"/>
+                <w:szCs w:val="16"/>
+              </w:rPr>
             </w:pPr>
           </w:p>
         </w:tc>
@@ -2712,6 +3132,10 @@
                 <w:tab w:val="left" w:pos="284"/>
               </w:tabs>
               <w:ind w:right="-1"/>
+              <w:rPr>
+                <w:sz w:val="16"/>
+                <w:szCs w:val="16"/>
+              </w:rPr>
             </w:pPr>
           </w:p>
         </w:tc>
@@ -2731,6 +3155,10 @@
                 <w:tab w:val="left" w:pos="284"/>
               </w:tabs>
               <w:ind w:right="-1"/>
+              <w:rPr>
+                <w:sz w:val="16"/>
+                <w:szCs w:val="16"/>
+              </w:rPr>
             </w:pPr>
           </w:p>
         </w:tc>
@@ -2746,7 +3174,7 @@
             <w:tcBorders>
               <w:top w:val="nil"/>
               <w:left w:val="single" w:sz="4" w:space="0" w:color="auto"/>
-              <w:bottom w:val="nil"/>
+              <w:bottom w:val="single" w:sz="4" w:space="0" w:color="auto"/>
               <w:right w:val="nil"/>
             </w:tcBorders>
           </w:tcPr>
@@ -2756,7 +3184,18 @@
                 <w:tab w:val="left" w:pos="284"/>
               </w:tabs>
               <w:ind w:right="-1"/>
-            </w:pPr>
+              <w:rPr>
+                <w:sz w:val="16"/>
+                <w:szCs w:val="16"/>
+              </w:rPr>
+            </w:pPr>
+            <w:r>
+              <w:rPr>
+                <w:sz w:val="16"/>
+                <w:szCs w:val="16"/>
+              </w:rPr>
+              <w:t>DNI:</w:t>
+            </w:r>
           </w:p>
         </w:tc>
         <w:tc>
@@ -2765,7 +3204,7 @@
             <w:tcBorders>
               <w:top w:val="nil"/>
               <w:left w:val="nil"/>
-              <w:bottom w:val="nil"/>
+              <w:bottom w:val="single" w:sz="4" w:space="0" w:color="auto"/>
               <w:right w:val="single" w:sz="4" w:space="0" w:color="auto"/>
             </w:tcBorders>
           </w:tcPr>
@@ -2775,7 +3214,48 @@
                 <w:tab w:val="left" w:pos="284"/>
               </w:tabs>
               <w:ind w:right="-1"/>
-            </w:pPr>
+              <w:rPr>
+                <w:sz w:val="16"/>
+                <w:szCs w:val="16"/>
+              </w:rPr>
+            </w:pPr>
+            <w:r>
+              <w:rPr>
+                <w:sz w:val="16"/>
+                <w:szCs w:val="16"/>
+              </w:rPr>
+              <w:fldChar w:fldCharType="begin"/>
+            </w:r>
+            <w:r>
+              <w:rPr>
+                <w:sz w:val="16"/>
+                <w:szCs w:val="16"/>
+              </w:rPr>
+              <w:instrText xml:space="preserve"> MERGEFIELD  doc_encargado  \* MERGEFORMAT </w:instrText>
+            </w:r>
+            <w:r>
+              <w:rPr>
+                <w:sz w:val="16"/>
+                <w:szCs w:val="16"/>
+              </w:rPr>
+              <w:fldChar w:fldCharType="separate"/>
+            </w:r>
+            <w:r>
+              <w:rPr>
+                <w:noProof/>
+                <w:sz w:val="16"/>
+                <w:szCs w:val="16"/>
+              </w:rPr>
+              <w:t>«doc_encargado»</w:t>
+            </w:r>
+            <w:r>
+              <w:rPr>
+                <w:noProof/>
+                <w:sz w:val="16"/>
+                <w:szCs w:val="16"/>
+              </w:rPr>
+              <w:fldChar w:fldCharType="end"/>
+            </w:r>
           </w:p>
         </w:tc>
         <w:tc>
@@ -2794,6 +3274,10 @@
                 <w:tab w:val="left" w:pos="284"/>
               </w:tabs>
               <w:ind w:right="-1"/>
+              <w:rPr>
+                <w:sz w:val="16"/>
+                <w:szCs w:val="16"/>
+              </w:rPr>
             </w:pPr>
           </w:p>
         </w:tc>
@@ -2803,7 +3287,7 @@
             <w:tcBorders>
               <w:top w:val="nil"/>
               <w:left w:val="single" w:sz="4" w:space="0" w:color="auto"/>
-              <w:bottom w:val="nil"/>
+              <w:bottom w:val="single" w:sz="4" w:space="0" w:color="auto"/>
               <w:right w:val="nil"/>
             </w:tcBorders>
           </w:tcPr>
@@ -2813,6 +3297,10 @@
                 <w:tab w:val="left" w:pos="284"/>
               </w:tabs>
               <w:ind w:right="-1"/>
+              <w:rPr>
+                <w:sz w:val="16"/>
+                <w:szCs w:val="16"/>
+              </w:rPr>
             </w:pPr>
           </w:p>
         </w:tc>
@@ -2822,7 +3310,7 @@
             <w:tcBorders>
               <w:top w:val="nil"/>
               <w:left w:val="nil"/>
-              <w:bottom w:val="nil"/>
+              <w:bottom w:val="single" w:sz="4" w:space="0" w:color="auto"/>
               <w:right w:val="single" w:sz="4" w:space="0" w:color="auto"/>
             </w:tcBorders>
           </w:tcPr>
@@ -2832,6 +3320,10 @@
                 <w:tab w:val="left" w:pos="284"/>
               </w:tabs>
               <w:ind w:right="-1"/>
+              <w:rPr>
+                <w:sz w:val="16"/>
+                <w:szCs w:val="16"/>
+              </w:rPr>
             </w:pPr>
           </w:p>
         </w:tc>
@@ -2851,383 +3343,16 @@
                 <w:tab w:val="left" w:pos="284"/>
               </w:tabs>
               <w:ind w:right="-1"/>
+              <w:rPr>
+                <w:sz w:val="16"/>
+                <w:szCs w:val="16"/>
+              </w:rPr>
             </w:pPr>
           </w:p>
         </w:tc>
         <w:tc>
           <w:tcPr>
             <w:tcW w:w="1808" w:type="dxa"/>
-            <w:tcBorders>
-              <w:top w:val="nil"/>
-              <w:left w:val="single" w:sz="4" w:space="0" w:color="auto"/>
-              <w:bottom w:val="nil"/>
-              <w:right w:val="nil"/>
-            </w:tcBorders>
-          </w:tcPr>
-          <w:p>
-            <w:pPr>
-              <w:tabs>
-                <w:tab w:val="left" w:pos="284"/>
-              </w:tabs>
-              <w:ind w:right="-1"/>
-            </w:pPr>
-          </w:p>
-        </w:tc>
-        <w:tc>
-          <w:tcPr>
-            <w:tcW w:w="1305" w:type="dxa"/>
-            <w:tcBorders>
-              <w:top w:val="nil"/>
-              <w:left w:val="nil"/>
-              <w:bottom w:val="nil"/>
-              <w:right w:val="single" w:sz="4" w:space="0" w:color="auto"/>
-            </w:tcBorders>
-          </w:tcPr>
-          <w:p>
-            <w:pPr>
-              <w:tabs>
-                <w:tab w:val="left" w:pos="284"/>
-              </w:tabs>
-              <w:ind w:right="-1"/>
-            </w:pPr>
-          </w:p>
-        </w:tc>
-      </w:tr>
-      <w:tr>
-        <w:trPr>
-          <w:cantSplit/>
-          <w:trHeight w:val="568"/>
-        </w:trPr>
-        <w:tc>
-          <w:tcPr>
-            <w:tcW w:w="1466" w:type="dxa"/>
-            <w:tcBorders>
-              <w:top w:val="nil"/>
-              <w:left w:val="single" w:sz="4" w:space="0" w:color="auto"/>
-              <w:bottom w:val="nil"/>
-              <w:right w:val="nil"/>
-            </w:tcBorders>
-          </w:tcPr>
-          <w:p>
-            <w:pPr>
-              <w:tabs>
-                <w:tab w:val="left" w:pos="284"/>
-              </w:tabs>
-              <w:ind w:right="-1"/>
-            </w:pPr>
-          </w:p>
-        </w:tc>
-        <w:tc>
-          <w:tcPr>
-            <w:tcW w:w="2074" w:type="dxa"/>
-            <w:tcBorders>
-              <w:top w:val="nil"/>
-              <w:left w:val="nil"/>
-              <w:bottom w:val="nil"/>
-              <w:right w:val="single" w:sz="4" w:space="0" w:color="auto"/>
-            </w:tcBorders>
-          </w:tcPr>
-          <w:p>
-            <w:pPr>
-              <w:tabs>
-                <w:tab w:val="left" w:pos="284"/>
-              </w:tabs>
-              <w:ind w:right="-1"/>
-            </w:pPr>
-          </w:p>
-        </w:tc>
-        <w:tc>
-          <w:tcPr>
-            <w:tcW w:w="709" w:type="dxa"/>
-            <w:tcBorders>
-              <w:top w:val="nil"/>
-              <w:left w:val="single" w:sz="4" w:space="0" w:color="auto"/>
-              <w:bottom w:val="nil"/>
-              <w:right w:val="single" w:sz="4" w:space="0" w:color="auto"/>
-            </w:tcBorders>
-          </w:tcPr>
-          <w:p>
-            <w:pPr>
-              <w:tabs>
-                <w:tab w:val="left" w:pos="284"/>
-              </w:tabs>
-              <w:ind w:right="-1"/>
-            </w:pPr>
-          </w:p>
-        </w:tc>
-        <w:tc>
-          <w:tcPr>
-            <w:tcW w:w="1676" w:type="dxa"/>
-            <w:tcBorders>
-              <w:top w:val="nil"/>
-              <w:left w:val="single" w:sz="4" w:space="0" w:color="auto"/>
-              <w:bottom w:val="nil"/>
-              <w:right w:val="nil"/>
-            </w:tcBorders>
-          </w:tcPr>
-          <w:p>
-            <w:pPr>
-              <w:tabs>
-                <w:tab w:val="left" w:pos="284"/>
-              </w:tabs>
-              <w:ind w:right="-1"/>
-            </w:pPr>
-          </w:p>
-        </w:tc>
-        <w:tc>
-          <w:tcPr>
-            <w:tcW w:w="1584" w:type="dxa"/>
-            <w:tcBorders>
-              <w:top w:val="nil"/>
-              <w:left w:val="nil"/>
-              <w:bottom w:val="nil"/>
-              <w:right w:val="single" w:sz="4" w:space="0" w:color="auto"/>
-            </w:tcBorders>
-          </w:tcPr>
-          <w:p>
-            <w:pPr>
-              <w:tabs>
-                <w:tab w:val="left" w:pos="284"/>
-              </w:tabs>
-              <w:ind w:right="-1"/>
-            </w:pPr>
-          </w:p>
-        </w:tc>
-        <w:tc>
-          <w:tcPr>
-            <w:tcW w:w="566" w:type="dxa"/>
-            <w:tcBorders>
-              <w:top w:val="nil"/>
-              <w:left w:val="single" w:sz="4" w:space="0" w:color="auto"/>
-              <w:bottom w:val="nil"/>
-              <w:right w:val="single" w:sz="4" w:space="0" w:color="auto"/>
-            </w:tcBorders>
-          </w:tcPr>
-          <w:p>
-            <w:pPr>
-              <w:tabs>
-                <w:tab w:val="left" w:pos="284"/>
-              </w:tabs>
-              <w:ind w:right="-1"/>
-            </w:pPr>
-          </w:p>
-        </w:tc>
-        <w:tc>
-          <w:tcPr>
-            <w:tcW w:w="1808" w:type="dxa"/>
-            <w:tcBorders>
-              <w:top w:val="nil"/>
-              <w:left w:val="single" w:sz="4" w:space="0" w:color="auto"/>
-              <w:bottom w:val="nil"/>
-              <w:right w:val="nil"/>
-            </w:tcBorders>
-          </w:tcPr>
-          <w:p>
-            <w:pPr>
-              <w:tabs>
-                <w:tab w:val="left" w:pos="284"/>
-              </w:tabs>
-              <w:ind w:right="-1"/>
-            </w:pPr>
-          </w:p>
-        </w:tc>
-        <w:tc>
-          <w:tcPr>
-            <w:tcW w:w="1305" w:type="dxa"/>
-            <w:tcBorders>
-              <w:top w:val="nil"/>
-              <w:left w:val="nil"/>
-              <w:bottom w:val="nil"/>
-              <w:right w:val="single" w:sz="4" w:space="0" w:color="auto"/>
-            </w:tcBorders>
-          </w:tcPr>
-          <w:p>
-            <w:pPr>
-              <w:tabs>
-                <w:tab w:val="left" w:pos="284"/>
-              </w:tabs>
-              <w:ind w:right="-1"/>
-            </w:pPr>
-          </w:p>
-        </w:tc>
-      </w:tr>
-      <w:tr>
-        <w:trPr>
-          <w:cantSplit/>
-          <w:trHeight w:val="568"/>
-        </w:trPr>
-        <w:tc>
-          <w:tcPr>
-            <w:tcW w:w="1466" w:type="dxa"/>
-            <w:tcBorders>
-              <w:top w:val="nil"/>
-              <w:left w:val="single" w:sz="4" w:space="0" w:color="auto"/>
-              <w:bottom w:val="nil"/>
-              <w:right w:val="nil"/>
-            </w:tcBorders>
-          </w:tcPr>
-          <w:p>
-            <w:pPr>
-              <w:tabs>
-                <w:tab w:val="left" w:pos="284"/>
-              </w:tabs>
-              <w:ind w:right="-1"/>
-            </w:pPr>
-            <w:r>
-              <w:t>Nombre:</w:t>
-            </w:r>
-          </w:p>
-        </w:tc>
-        <w:tc>
-          <w:tcPr>
-            <w:tcW w:w="2074" w:type="dxa"/>
-            <w:tcBorders>
-              <w:top w:val="nil"/>
-              <w:left w:val="nil"/>
-              <w:bottom w:val="nil"/>
-              <w:right w:val="single" w:sz="4" w:space="0" w:color="auto"/>
-            </w:tcBorders>
-          </w:tcPr>
-          <w:p>
-            <w:pPr>
-              <w:tabs>
-                <w:tab w:val="left" w:pos="284"/>
-              </w:tabs>
-              <w:ind w:right="-1"/>
-            </w:pPr>
-            <w:fldSimple w:instr=" MERGEFIELD  nom_encargado  \* MERGEFORMAT ">
-              <w:r>
-                <w:rPr>
-                  <w:noProof/>
-                </w:rPr>
-                <w:t>«nom_encargado»</w:t>
-              </w:r>
-            </w:fldSimple>
-          </w:p>
-        </w:tc>
-        <w:tc>
-          <w:tcPr>
-            <w:tcW w:w="709" w:type="dxa"/>
-            <w:tcBorders>
-              <w:top w:val="nil"/>
-              <w:left w:val="single" w:sz="4" w:space="0" w:color="auto"/>
-              <w:bottom w:val="nil"/>
-              <w:right w:val="single" w:sz="4" w:space="0" w:color="auto"/>
-            </w:tcBorders>
-          </w:tcPr>
-          <w:p>
-            <w:pPr>
-              <w:tabs>
-                <w:tab w:val="left" w:pos="284"/>
-              </w:tabs>
-              <w:ind w:right="-1"/>
-            </w:pPr>
-          </w:p>
-        </w:tc>
-        <w:tc>
-          <w:tcPr>
-            <w:tcW w:w="1676" w:type="dxa"/>
-            <w:tcBorders>
-              <w:top w:val="nil"/>
-              <w:left w:val="single" w:sz="4" w:space="0" w:color="auto"/>
-              <w:bottom w:val="nil"/>
-              <w:right w:val="nil"/>
-            </w:tcBorders>
-          </w:tcPr>
-          <w:p>
-            <w:pPr>
-              <w:tabs>
-                <w:tab w:val="left" w:pos="284"/>
-              </w:tabs>
-              <w:ind w:right="-1"/>
-            </w:pPr>
-          </w:p>
-        </w:tc>
-        <w:tc>
-          <w:tcPr>
-            <w:tcW w:w="1584" w:type="dxa"/>
-            <w:tcBorders>
-              <w:top w:val="nil"/>
-              <w:left w:val="nil"/>
-              <w:bottom w:val="nil"/>
-              <w:right w:val="single" w:sz="4" w:space="0" w:color="auto"/>
-            </w:tcBorders>
-          </w:tcPr>
-          <w:p>
-            <w:pPr>
-              <w:tabs>
-                <w:tab w:val="left" w:pos="284"/>
-              </w:tabs>
-              <w:ind w:right="-1"/>
-            </w:pPr>
-          </w:p>
-        </w:tc>
-        <w:tc>
-          <w:tcPr>
-            <w:tcW w:w="566" w:type="dxa"/>
-            <w:tcBorders>
-              <w:top w:val="nil"/>
-              <w:left w:val="single" w:sz="4" w:space="0" w:color="auto"/>
-              <w:bottom w:val="nil"/>
-              <w:right w:val="single" w:sz="4" w:space="0" w:color="auto"/>
-            </w:tcBorders>
-          </w:tcPr>
-          <w:p>
-            <w:pPr>
-              <w:tabs>
-                <w:tab w:val="left" w:pos="284"/>
-              </w:tabs>
-              <w:ind w:right="-1"/>
-            </w:pPr>
-          </w:p>
-        </w:tc>
-        <w:tc>
-          <w:tcPr>
-            <w:tcW w:w="1808" w:type="dxa"/>
-            <w:tcBorders>
-              <w:top w:val="nil"/>
-              <w:left w:val="single" w:sz="4" w:space="0" w:color="auto"/>
-              <w:bottom w:val="nil"/>
-              <w:right w:val="nil"/>
-            </w:tcBorders>
-          </w:tcPr>
-          <w:p>
-            <w:pPr>
-              <w:tabs>
-                <w:tab w:val="left" w:pos="284"/>
-              </w:tabs>
-              <w:ind w:right="-1"/>
-            </w:pPr>
-          </w:p>
-        </w:tc>
-        <w:tc>
-          <w:tcPr>
-            <w:tcW w:w="1305" w:type="dxa"/>
-            <w:tcBorders>
-              <w:top w:val="nil"/>
-              <w:left w:val="nil"/>
-              <w:bottom w:val="nil"/>
-              <w:right w:val="single" w:sz="4" w:space="0" w:color="auto"/>
-            </w:tcBorders>
-          </w:tcPr>
-          <w:p>
-            <w:pPr>
-              <w:tabs>
-                <w:tab w:val="left" w:pos="284"/>
-              </w:tabs>
-              <w:ind w:right="-1"/>
-            </w:pPr>
-          </w:p>
-        </w:tc>
-      </w:tr>
-      <w:tr>
-        <w:trPr>
-          <w:cantSplit/>
-          <w:trHeight w:val="568"/>
-        </w:trPr>
-        <w:tc>
-          <w:tcPr>
-            <w:tcW w:w="1466" w:type="dxa"/>
             <w:tcBorders>
               <w:top w:val="nil"/>
               <w:left w:val="single" w:sz="4" w:space="0" w:color="auto"/>
@@ -3241,15 +3366,16 @@
                 <w:tab w:val="left" w:pos="284"/>
               </w:tabs>
               <w:ind w:right="-1"/>
-            </w:pPr>
-            <w:r>
-              <w:t>DNI:</w:t>
-            </w:r>
-          </w:p>
-        </w:tc>
-        <w:tc>
-          <w:tcPr>
-            <w:tcW w:w="2074" w:type="dxa"/>
+              <w:rPr>
+                <w:sz w:val="16"/>
+                <w:szCs w:val="16"/>
+              </w:rPr>
+            </w:pPr>
+          </w:p>
+        </w:tc>
+        <w:tc>
+          <w:tcPr>
+            <w:tcW w:w="1305" w:type="dxa"/>
             <w:tcBorders>
               <w:top w:val="nil"/>
               <w:left w:val="nil"/>
@@ -3263,128 +3389,10 @@
                 <w:tab w:val="left" w:pos="284"/>
               </w:tabs>
               <w:ind w:right="-1"/>
-            </w:pPr>
-            <w:fldSimple w:instr=" MERGEFIELD  doc_encargado  \* MERGEFORMAT ">
-              <w:r>
-                <w:rPr>
-                  <w:noProof/>
-                </w:rPr>
-                <w:t>«doc_encargado»</w:t>
-              </w:r>
-            </w:fldSimple>
-          </w:p>
-        </w:tc>
-        <w:tc>
-          <w:tcPr>
-            <w:tcW w:w="709" w:type="dxa"/>
-            <w:tcBorders>
-              <w:top w:val="nil"/>
-              <w:left w:val="single" w:sz="4" w:space="0" w:color="auto"/>
-              <w:bottom w:val="nil"/>
-              <w:right w:val="single" w:sz="4" w:space="0" w:color="auto"/>
-            </w:tcBorders>
-          </w:tcPr>
-          <w:p>
-            <w:pPr>
-              <w:tabs>
-                <w:tab w:val="left" w:pos="284"/>
-              </w:tabs>
-              <w:ind w:right="-1"/>
-            </w:pPr>
-          </w:p>
-        </w:tc>
-        <w:tc>
-          <w:tcPr>
-            <w:tcW w:w="1676" w:type="dxa"/>
-            <w:tcBorders>
-              <w:top w:val="nil"/>
-              <w:left w:val="single" w:sz="4" w:space="0" w:color="auto"/>
-              <w:bottom w:val="single" w:sz="4" w:space="0" w:color="auto"/>
-              <w:right w:val="nil"/>
-            </w:tcBorders>
-          </w:tcPr>
-          <w:p>
-            <w:pPr>
-              <w:tabs>
-                <w:tab w:val="left" w:pos="284"/>
-              </w:tabs>
-              <w:ind w:right="-1"/>
-            </w:pPr>
-          </w:p>
-        </w:tc>
-        <w:tc>
-          <w:tcPr>
-            <w:tcW w:w="1584" w:type="dxa"/>
-            <w:tcBorders>
-              <w:top w:val="nil"/>
-              <w:left w:val="nil"/>
-              <w:bottom w:val="single" w:sz="4" w:space="0" w:color="auto"/>
-              <w:right w:val="single" w:sz="4" w:space="0" w:color="auto"/>
-            </w:tcBorders>
-          </w:tcPr>
-          <w:p>
-            <w:pPr>
-              <w:tabs>
-                <w:tab w:val="left" w:pos="284"/>
-              </w:tabs>
-              <w:ind w:right="-1"/>
-            </w:pPr>
-          </w:p>
-        </w:tc>
-        <w:tc>
-          <w:tcPr>
-            <w:tcW w:w="566" w:type="dxa"/>
-            <w:tcBorders>
-              <w:top w:val="nil"/>
-              <w:left w:val="single" w:sz="4" w:space="0" w:color="auto"/>
-              <w:bottom w:val="nil"/>
-              <w:right w:val="single" w:sz="4" w:space="0" w:color="auto"/>
-            </w:tcBorders>
-          </w:tcPr>
-          <w:p>
-            <w:pPr>
-              <w:tabs>
-                <w:tab w:val="left" w:pos="284"/>
-              </w:tabs>
-              <w:ind w:right="-1"/>
-            </w:pPr>
-          </w:p>
-        </w:tc>
-        <w:tc>
-          <w:tcPr>
-            <w:tcW w:w="1808" w:type="dxa"/>
-            <w:tcBorders>
-              <w:top w:val="nil"/>
-              <w:left w:val="single" w:sz="4" w:space="0" w:color="auto"/>
-              <w:bottom w:val="single" w:sz="4" w:space="0" w:color="auto"/>
-              <w:right w:val="nil"/>
-            </w:tcBorders>
-          </w:tcPr>
-          <w:p>
-            <w:pPr>
-              <w:tabs>
-                <w:tab w:val="left" w:pos="284"/>
-              </w:tabs>
-              <w:ind w:right="-1"/>
-            </w:pPr>
-          </w:p>
-        </w:tc>
-        <w:tc>
-          <w:tcPr>
-            <w:tcW w:w="1305" w:type="dxa"/>
-            <w:tcBorders>
-              <w:top w:val="nil"/>
-              <w:left w:val="nil"/>
-              <w:bottom w:val="single" w:sz="4" w:space="0" w:color="auto"/>
-              <w:right w:val="single" w:sz="4" w:space="0" w:color="auto"/>
-            </w:tcBorders>
-          </w:tcPr>
-          <w:p>
-            <w:pPr>
-              <w:tabs>
-                <w:tab w:val="left" w:pos="284"/>
-              </w:tabs>
-              <w:ind w:right="-1"/>
+              <w:rPr>
+                <w:sz w:val="16"/>
+                <w:szCs w:val="16"/>
+              </w:rPr>
             </w:pPr>
           </w:p>
         </w:tc>

</xml_diff>

<commit_message>
feat: agregar ruc y tipo representante
</commit_message>
<xml_diff>
--- a/pesaje/analytica/Report/PrintActaConformidad.docx
+++ b/pesaje/analytica/Report/PrintActaConformidad.docx
@@ -972,25 +972,31 @@
           <w:tab w:val="left" w:pos="284"/>
         </w:tabs>
         <w:ind w:right="-1"/>
+        <w:rPr>
+          <w:b/>
+          <w:bCs/>
+        </w:rPr>
       </w:pPr>
       <w:r>
         <w:rPr>
           <w:rFonts w:ascii="Times New Roman" w:hAnsi="Times New Roman" w:cs="Times New Roman"/>
+          <w:b/>
+          <w:bCs/>
           <w:noProof/>
           <w:szCs w:val="24"/>
         </w:rPr>
         <mc:AlternateContent>
           <mc:Choice Requires="wps">
             <w:drawing>
-              <wp:anchor distT="0" distB="0" distL="114300" distR="114300" simplePos="0" relativeHeight="251659264" behindDoc="0" locked="0" layoutInCell="1" allowOverlap="1" wp14:anchorId="36262E0B" wp14:editId="7448243A">
+              <wp:anchor distT="0" distB="0" distL="114300" distR="114300" simplePos="0" relativeHeight="251659264" behindDoc="0" locked="0" layoutInCell="1" allowOverlap="1" wp14:anchorId="36262E0B" wp14:editId="6836A6B3">
                 <wp:simplePos x="0" y="0"/>
                 <wp:positionH relativeFrom="margin">
-                  <wp:posOffset>62115</wp:posOffset>
+                  <wp:posOffset>-29845</wp:posOffset>
                 </wp:positionH>
                 <wp:positionV relativeFrom="paragraph">
-                  <wp:posOffset>-712758</wp:posOffset>
+                  <wp:posOffset>-711835</wp:posOffset>
                 </wp:positionV>
-                <wp:extent cx="1995054" cy="782782"/>
+                <wp:extent cx="1995054" cy="694944"/>
                 <wp:effectExtent l="0" t="0" r="0" b="0"/>
                 <wp:wrapNone/>
                 <wp:docPr id="782399144" name="Rectángulo: esquinas redondeadas 782399144"/>
@@ -1006,7 +1012,7 @@
                       <wps:spPr bwMode="auto">
                         <a:xfrm>
                           <a:off x="0" y="0"/>
-                          <a:ext cx="1995054" cy="782782"/>
+                          <a:ext cx="1995054" cy="694944"/>
                         </a:xfrm>
                         <a:prstGeom prst="roundRect">
                           <a:avLst>
@@ -1088,7 +1094,7 @@
           </mc:Choice>
           <mc:Fallback>
             <w:pict>
-              <v:roundrect w14:anchorId="36262E0B" id="Rectángulo: esquinas redondeadas 782399144" o:spid="_x0000_s1026" style="position:absolute;margin-left:4.9pt;margin-top:-56.1pt;width:157.1pt;height:61.65pt;z-index:251659264;visibility:visible;mso-wrap-style:square;mso-width-percent:0;mso-height-percent:0;mso-wrap-distance-left:9pt;mso-wrap-distance-top:0;mso-wrap-distance-right:9pt;mso-wrap-distance-bottom:0;mso-position-horizontal:absolute;mso-position-horizontal-relative:margin;mso-position-vertical:absolute;mso-position-vertical-relative:text;mso-width-percent:0;mso-height-percent:0;mso-width-relative:margin;mso-height-relative:margin;v-text-anchor:top" arcsize="10923f" o:gfxdata="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" filled="f" stroked="f">
+              <v:roundrect w14:anchorId="36262E0B" id="Rectángulo: esquinas redondeadas 782399144" o:spid="_x0000_s1026" style="position:absolute;margin-left:-2.35pt;margin-top:-56.05pt;width:157.1pt;height:54.7pt;z-index:251659264;visibility:visible;mso-wrap-style:square;mso-width-percent:0;mso-height-percent:0;mso-wrap-distance-left:9pt;mso-wrap-distance-top:0;mso-wrap-distance-right:9pt;mso-wrap-distance-bottom:0;mso-position-horizontal:absolute;mso-position-horizontal-relative:margin;mso-position-vertical:absolute;mso-position-vertical-relative:text;mso-width-percent:0;mso-height-percent:0;mso-width-relative:margin;mso-height-relative:margin;v-text-anchor:top" arcsize="10923f" o:gfxdata="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" filled="f" stroked="f">
                 <v:stroke joinstyle="miter"/>
                 <v:textbox>
                   <w:txbxContent>
@@ -1145,6 +1151,49 @@
             </w:pict>
           </mc:Fallback>
         </mc:AlternateContent>
+      </w:r>
+      <w:r>
+        <w:rPr>
+          <w:b/>
+          <w:bCs/>
+        </w:rPr>
+        <w:t xml:space="preserve">RUC:  </w:t>
+      </w:r>
+      <w:r>
+        <w:rPr>
+          <w:b/>
+          <w:bCs/>
+        </w:rPr>
+        <w:fldChar w:fldCharType="begin"/>
+      </w:r>
+      <w:r>
+        <w:rPr>
+          <w:b/>
+          <w:bCs/>
+        </w:rPr>
+        <w:instrText xml:space="preserve"> MERGEFIELD  ruc </w:instrText>
+      </w:r>
+      <w:r>
+        <w:rPr>
+          <w:b/>
+          <w:bCs/>
+        </w:rPr>
+        <w:fldChar w:fldCharType="separate"/>
+      </w:r>
+      <w:r>
+        <w:rPr>
+          <w:b/>
+          <w:bCs/>
+          <w:noProof/>
+        </w:rPr>
+        <w:t>«ruc»</w:t>
+      </w:r>
+      <w:r>
+        <w:rPr>
+          <w:b/>
+          <w:bCs/>
+        </w:rPr>
+        <w:fldChar w:fldCharType="end"/>
       </w:r>
     </w:p>
     <w:p>
@@ -1307,14 +1356,14 @@
       </w:tblPr>
       <w:tblGrid>
         <w:gridCol w:w="696"/>
-        <w:gridCol w:w="1693"/>
-        <w:gridCol w:w="1434"/>
+        <w:gridCol w:w="1709"/>
+        <w:gridCol w:w="1418"/>
         <w:gridCol w:w="1417"/>
-        <w:gridCol w:w="878"/>
-        <w:gridCol w:w="1193"/>
-        <w:gridCol w:w="1216"/>
-        <w:gridCol w:w="1346"/>
-        <w:gridCol w:w="1315"/>
+        <w:gridCol w:w="709"/>
+        <w:gridCol w:w="1559"/>
+        <w:gridCol w:w="992"/>
+        <w:gridCol w:w="1418"/>
+        <w:gridCol w:w="1270"/>
       </w:tblGrid>
       <w:tr>
         <w:tc>
@@ -1347,7 +1396,7 @@
         </w:tc>
         <w:tc>
           <w:tcPr>
-            <w:tcW w:w="1693" w:type="dxa"/>
+            <w:tcW w:w="1709" w:type="dxa"/>
             <w:shd w:val="clear" w:color="auto" w:fill="63A4F7"/>
           </w:tcPr>
           <w:p>
@@ -1373,7 +1422,7 @@
         </w:tc>
         <w:tc>
           <w:tcPr>
-            <w:tcW w:w="1434" w:type="dxa"/>
+            <w:tcW w:w="1418" w:type="dxa"/>
             <w:shd w:val="clear" w:color="auto" w:fill="63A4F7"/>
           </w:tcPr>
           <w:p>
@@ -1425,7 +1474,7 @@
         </w:tc>
         <w:tc>
           <w:tcPr>
-            <w:tcW w:w="878" w:type="dxa"/>
+            <w:tcW w:w="709" w:type="dxa"/>
             <w:shd w:val="clear" w:color="auto" w:fill="63A4F7"/>
           </w:tcPr>
           <w:p>
@@ -1451,7 +1500,7 @@
         </w:tc>
         <w:tc>
           <w:tcPr>
-            <w:tcW w:w="1193" w:type="dxa"/>
+            <w:tcW w:w="1559" w:type="dxa"/>
             <w:shd w:val="clear" w:color="auto" w:fill="63A4F7"/>
           </w:tcPr>
           <w:p>
@@ -1477,7 +1526,7 @@
         </w:tc>
         <w:tc>
           <w:tcPr>
-            <w:tcW w:w="1216" w:type="dxa"/>
+            <w:tcW w:w="992" w:type="dxa"/>
             <w:shd w:val="clear" w:color="auto" w:fill="63A4F7"/>
           </w:tcPr>
           <w:p>
@@ -1503,7 +1552,7 @@
         </w:tc>
         <w:tc>
           <w:tcPr>
-            <w:tcW w:w="1346" w:type="dxa"/>
+            <w:tcW w:w="1418" w:type="dxa"/>
             <w:shd w:val="clear" w:color="auto" w:fill="63A4F7"/>
           </w:tcPr>
           <w:p>
@@ -1529,7 +1578,7 @@
         </w:tc>
         <w:tc>
           <w:tcPr>
-            <w:tcW w:w="1315" w:type="dxa"/>
+            <w:tcW w:w="1270" w:type="dxa"/>
             <w:shd w:val="clear" w:color="auto" w:fill="63A4F7"/>
           </w:tcPr>
           <w:p>
@@ -1628,11 +1677,11 @@
         <w:gridCol w:w="1701"/>
         <w:gridCol w:w="1418"/>
         <w:gridCol w:w="1417"/>
-        <w:gridCol w:w="851"/>
-        <w:gridCol w:w="1275"/>
-        <w:gridCol w:w="1134"/>
-        <w:gridCol w:w="1444"/>
-        <w:gridCol w:w="1244"/>
+        <w:gridCol w:w="709"/>
+        <w:gridCol w:w="1559"/>
+        <w:gridCol w:w="992"/>
+        <w:gridCol w:w="1418"/>
+        <w:gridCol w:w="1270"/>
       </w:tblGrid>
       <w:tr>
         <w:trPr>
@@ -1853,7 +1902,7 @@
         </w:tc>
         <w:tc>
           <w:tcPr>
-            <w:tcW w:w="851" w:type="dxa"/>
+            <w:tcW w:w="709" w:type="dxa"/>
           </w:tcPr>
           <w:p>
             <w:pPr>
@@ -1907,7 +1956,7 @@
         </w:tc>
         <w:tc>
           <w:tcPr>
-            <w:tcW w:w="1275" w:type="dxa"/>
+            <w:tcW w:w="1559" w:type="dxa"/>
           </w:tcPr>
           <w:p>
             <w:pPr>
@@ -1961,7 +2010,7 @@
         </w:tc>
         <w:tc>
           <w:tcPr>
-            <w:tcW w:w="1134" w:type="dxa"/>
+            <w:tcW w:w="992" w:type="dxa"/>
           </w:tcPr>
           <w:p>
             <w:pPr>
@@ -2015,7 +2064,7 @@
         </w:tc>
         <w:tc>
           <w:tcPr>
-            <w:tcW w:w="1444" w:type="dxa"/>
+            <w:tcW w:w="1418" w:type="dxa"/>
           </w:tcPr>
           <w:p>
             <w:pPr>
@@ -2069,7 +2118,7 @@
         </w:tc>
         <w:tc>
           <w:tcPr>
-            <w:tcW w:w="1244" w:type="dxa"/>
+            <w:tcW w:w="1270" w:type="dxa"/>
           </w:tcPr>
           <w:p>
             <w:pPr>
@@ -2590,18 +2639,43 @@
               <w:rPr>
                 <w:b/>
                 <w:bCs/>
-                <w:sz w:val="16"/>
-                <w:szCs w:val="16"/>
               </w:rPr>
             </w:pPr>
             <w:r>
               <w:rPr>
                 <w:b/>
                 <w:bCs/>
-                <w:sz w:val="16"/>
-                <w:szCs w:val="16"/>
-              </w:rPr>
-              <w:t>ENCARGADO</w:t>
+              </w:rPr>
+              <w:fldChar w:fldCharType="begin"/>
+            </w:r>
+            <w:r>
+              <w:rPr>
+                <w:b/>
+                <w:bCs/>
+              </w:rPr>
+              <w:instrText xml:space="preserve"> MERGEFIELD  tipo_encargado </w:instrText>
+            </w:r>
+            <w:r>
+              <w:rPr>
+                <w:b/>
+                <w:bCs/>
+              </w:rPr>
+              <w:fldChar w:fldCharType="separate"/>
+            </w:r>
+            <w:r>
+              <w:rPr>
+                <w:b/>
+                <w:bCs/>
+                <w:noProof/>
+              </w:rPr>
+              <w:t>«tipo_encargado»</w:t>
+            </w:r>
+            <w:r>
+              <w:rPr>
+                <w:b/>
+                <w:bCs/>
+              </w:rPr>
+              <w:fldChar w:fldCharType="end"/>
             </w:r>
           </w:p>
         </w:tc>
@@ -2621,10 +2695,6 @@
                 <w:tab w:val="left" w:pos="284"/>
               </w:tabs>
               <w:ind w:right="-1"/>
-              <w:rPr>
-                <w:sz w:val="16"/>
-                <w:szCs w:val="16"/>
-              </w:rPr>
             </w:pPr>
           </w:p>
         </w:tc>
@@ -2649,16 +2719,12 @@
               <w:rPr>
                 <w:b/>
                 <w:bCs/>
-                <w:sz w:val="16"/>
-                <w:szCs w:val="16"/>
               </w:rPr>
             </w:pPr>
             <w:r>
               <w:rPr>
                 <w:b/>
                 <w:bCs/>
-                <w:sz w:val="16"/>
-                <w:szCs w:val="16"/>
               </w:rPr>
               <w:t>BALANZA</w:t>
             </w:r>
@@ -2680,10 +2746,6 @@
                 <w:tab w:val="left" w:pos="284"/>
               </w:tabs>
               <w:ind w:right="-1"/>
-              <w:rPr>
-                <w:sz w:val="16"/>
-                <w:szCs w:val="16"/>
-              </w:rPr>
             </w:pPr>
           </w:p>
         </w:tc>
@@ -2708,16 +2770,12 @@
               <w:rPr>
                 <w:b/>
                 <w:bCs/>
-                <w:sz w:val="16"/>
-                <w:szCs w:val="16"/>
               </w:rPr>
             </w:pPr>
             <w:r>
               <w:rPr>
                 <w:b/>
                 <w:bCs/>
-                <w:sz w:val="16"/>
-                <w:szCs w:val="16"/>
               </w:rPr>
               <w:t>SUPERVISOR</w:t>
             </w:r>
@@ -2745,16 +2803,8 @@
                 <w:tab w:val="left" w:pos="284"/>
               </w:tabs>
               <w:ind w:right="-1"/>
-              <w:rPr>
-                <w:sz w:val="16"/>
-                <w:szCs w:val="16"/>
-              </w:rPr>
-            </w:pPr>
-            <w:r>
-              <w:rPr>
-                <w:sz w:val="16"/>
-                <w:szCs w:val="16"/>
-              </w:rPr>
+            </w:pPr>
+            <w:r>
               <w:t>Firma y Huella:</w:t>
             </w:r>
           </w:p>
@@ -2775,10 +2825,6 @@
                 <w:tab w:val="left" w:pos="284"/>
               </w:tabs>
               <w:ind w:right="-1"/>
-              <w:rPr>
-                <w:sz w:val="16"/>
-                <w:szCs w:val="16"/>
-              </w:rPr>
             </w:pPr>
           </w:p>
         </w:tc>
@@ -2798,10 +2844,6 @@
                 <w:tab w:val="left" w:pos="284"/>
               </w:tabs>
               <w:ind w:right="-1"/>
-              <w:rPr>
-                <w:sz w:val="16"/>
-                <w:szCs w:val="16"/>
-              </w:rPr>
             </w:pPr>
           </w:p>
         </w:tc>
@@ -2821,16 +2863,8 @@
                 <w:tab w:val="left" w:pos="284"/>
               </w:tabs>
               <w:ind w:right="-1"/>
-              <w:rPr>
-                <w:sz w:val="16"/>
-                <w:szCs w:val="16"/>
-              </w:rPr>
-            </w:pPr>
-            <w:r>
-              <w:rPr>
-                <w:sz w:val="16"/>
-                <w:szCs w:val="16"/>
-              </w:rPr>
+            </w:pPr>
+            <w:r>
               <w:t>Firma y sello:</w:t>
             </w:r>
           </w:p>
@@ -2851,10 +2885,6 @@
                 <w:tab w:val="left" w:pos="284"/>
               </w:tabs>
               <w:ind w:right="-1"/>
-              <w:rPr>
-                <w:sz w:val="16"/>
-                <w:szCs w:val="16"/>
-              </w:rPr>
             </w:pPr>
           </w:p>
         </w:tc>
@@ -2874,10 +2904,6 @@
                 <w:tab w:val="left" w:pos="284"/>
               </w:tabs>
               <w:ind w:right="-1"/>
-              <w:rPr>
-                <w:sz w:val="16"/>
-                <w:szCs w:val="16"/>
-              </w:rPr>
             </w:pPr>
           </w:p>
         </w:tc>
@@ -2897,16 +2923,8 @@
                 <w:tab w:val="left" w:pos="284"/>
               </w:tabs>
               <w:ind w:right="-1"/>
-              <w:rPr>
-                <w:sz w:val="16"/>
-                <w:szCs w:val="16"/>
-              </w:rPr>
-            </w:pPr>
-            <w:r>
-              <w:rPr>
-                <w:sz w:val="16"/>
-                <w:szCs w:val="16"/>
-              </w:rPr>
+            </w:pPr>
+            <w:r>
               <w:t>Firma y sello:</w:t>
             </w:r>
           </w:p>
@@ -2927,10 +2945,6 @@
                 <w:tab w:val="left" w:pos="284"/>
               </w:tabs>
               <w:ind w:right="-1"/>
-              <w:rPr>
-                <w:sz w:val="16"/>
-                <w:szCs w:val="16"/>
-              </w:rPr>
             </w:pPr>
           </w:p>
         </w:tc>
@@ -2956,16 +2970,8 @@
                 <w:tab w:val="left" w:pos="284"/>
               </w:tabs>
               <w:ind w:right="-1"/>
-              <w:rPr>
-                <w:sz w:val="16"/>
-                <w:szCs w:val="16"/>
-              </w:rPr>
-            </w:pPr>
-            <w:r>
-              <w:rPr>
-                <w:sz w:val="16"/>
-                <w:szCs w:val="16"/>
-              </w:rPr>
+            </w:pPr>
+            <w:r>
               <w:t>Nombre:</w:t>
             </w:r>
           </w:p>
@@ -2986,48 +2992,15 @@
                 <w:tab w:val="left" w:pos="284"/>
               </w:tabs>
               <w:ind w:right="-1"/>
-              <w:rPr>
-                <w:sz w:val="16"/>
-                <w:szCs w:val="16"/>
-              </w:rPr>
-            </w:pPr>
-            <w:r>
-              <w:rPr>
-                <w:sz w:val="16"/>
-                <w:szCs w:val="16"/>
-              </w:rPr>
-              <w:fldChar w:fldCharType="begin"/>
-            </w:r>
-            <w:r>
-              <w:rPr>
-                <w:sz w:val="16"/>
-                <w:szCs w:val="16"/>
-              </w:rPr>
-              <w:instrText xml:space="preserve"> MERGEFIELD  nom_encargado  \* MERGEFORMAT </w:instrText>
-            </w:r>
-            <w:r>
-              <w:rPr>
-                <w:sz w:val="16"/>
-                <w:szCs w:val="16"/>
-              </w:rPr>
-              <w:fldChar w:fldCharType="separate"/>
-            </w:r>
-            <w:r>
-              <w:rPr>
-                <w:noProof/>
-                <w:sz w:val="16"/>
-                <w:szCs w:val="16"/>
-              </w:rPr>
-              <w:t>«nom_encargado»</w:t>
-            </w:r>
-            <w:r>
-              <w:rPr>
-                <w:noProof/>
-                <w:sz w:val="16"/>
-                <w:szCs w:val="16"/>
-              </w:rPr>
-              <w:fldChar w:fldCharType="end"/>
-            </w:r>
+            </w:pPr>
+            <w:fldSimple w:instr=" MERGEFIELD  nom_encargado  \* MERGEFORMAT ">
+              <w:r>
+                <w:rPr>
+                  <w:noProof/>
+                </w:rPr>
+                <w:t>«nom_encargado»</w:t>
+              </w:r>
+            </w:fldSimple>
           </w:p>
         </w:tc>
         <w:tc>
@@ -3046,10 +3019,6 @@
                 <w:tab w:val="left" w:pos="284"/>
               </w:tabs>
               <w:ind w:right="-1"/>
-              <w:rPr>
-                <w:sz w:val="16"/>
-                <w:szCs w:val="16"/>
-              </w:rPr>
             </w:pPr>
           </w:p>
         </w:tc>
@@ -3069,10 +3038,6 @@
                 <w:tab w:val="left" w:pos="284"/>
               </w:tabs>
               <w:ind w:right="-1"/>
-              <w:rPr>
-                <w:sz w:val="16"/>
-                <w:szCs w:val="16"/>
-              </w:rPr>
             </w:pPr>
           </w:p>
         </w:tc>
@@ -3092,10 +3057,6 @@
                 <w:tab w:val="left" w:pos="284"/>
               </w:tabs>
               <w:ind w:right="-1"/>
-              <w:rPr>
-                <w:sz w:val="16"/>
-                <w:szCs w:val="16"/>
-              </w:rPr>
             </w:pPr>
           </w:p>
         </w:tc>
@@ -3115,10 +3076,6 @@
                 <w:tab w:val="left" w:pos="284"/>
               </w:tabs>
               <w:ind w:right="-1"/>
-              <w:rPr>
-                <w:sz w:val="16"/>
-                <w:szCs w:val="16"/>
-              </w:rPr>
             </w:pPr>
           </w:p>
         </w:tc>
@@ -3138,10 +3095,6 @@
                 <w:tab w:val="left" w:pos="284"/>
               </w:tabs>
               <w:ind w:right="-1"/>
-              <w:rPr>
-                <w:sz w:val="16"/>
-                <w:szCs w:val="16"/>
-              </w:rPr>
             </w:pPr>
           </w:p>
         </w:tc>
@@ -3161,10 +3114,6 @@
                 <w:tab w:val="left" w:pos="284"/>
               </w:tabs>
               <w:ind w:right="-1"/>
-              <w:rPr>
-                <w:sz w:val="16"/>
-                <w:szCs w:val="16"/>
-              </w:rPr>
             </w:pPr>
           </w:p>
         </w:tc>
@@ -3190,16 +3139,8 @@
                 <w:tab w:val="left" w:pos="284"/>
               </w:tabs>
               <w:ind w:right="-1"/>
-              <w:rPr>
-                <w:sz w:val="16"/>
-                <w:szCs w:val="16"/>
-              </w:rPr>
-            </w:pPr>
-            <w:r>
-              <w:rPr>
-                <w:sz w:val="16"/>
-                <w:szCs w:val="16"/>
-              </w:rPr>
+            </w:pPr>
+            <w:r>
               <w:t>DNI:</w:t>
             </w:r>
           </w:p>
@@ -3220,48 +3161,15 @@
                 <w:tab w:val="left" w:pos="284"/>
               </w:tabs>
               <w:ind w:right="-1"/>
-              <w:rPr>
-                <w:sz w:val="16"/>
-                <w:szCs w:val="16"/>
-              </w:rPr>
-            </w:pPr>
-            <w:r>
-              <w:rPr>
-                <w:sz w:val="16"/>
-                <w:szCs w:val="16"/>
-              </w:rPr>
-              <w:fldChar w:fldCharType="begin"/>
-            </w:r>
-            <w:r>
-              <w:rPr>
-                <w:sz w:val="16"/>
-                <w:szCs w:val="16"/>
-              </w:rPr>
-              <w:instrText xml:space="preserve"> MERGEFIELD  doc_encargado  \* MERGEFORMAT </w:instrText>
-            </w:r>
-            <w:r>
-              <w:rPr>
-                <w:sz w:val="16"/>
-                <w:szCs w:val="16"/>
-              </w:rPr>
-              <w:fldChar w:fldCharType="separate"/>
-            </w:r>
-            <w:r>
-              <w:rPr>
-                <w:noProof/>
-                <w:sz w:val="16"/>
-                <w:szCs w:val="16"/>
-              </w:rPr>
-              <w:t>«doc_encargado»</w:t>
-            </w:r>
-            <w:r>
-              <w:rPr>
-                <w:noProof/>
-                <w:sz w:val="16"/>
-                <w:szCs w:val="16"/>
-              </w:rPr>
-              <w:fldChar w:fldCharType="end"/>
-            </w:r>
+            </w:pPr>
+            <w:fldSimple w:instr=" MERGEFIELD  doc_encargado  \* MERGEFORMAT ">
+              <w:r>
+                <w:rPr>
+                  <w:noProof/>
+                </w:rPr>
+                <w:t>«doc_encargado»</w:t>
+              </w:r>
+            </w:fldSimple>
           </w:p>
         </w:tc>
         <w:tc>
@@ -3280,10 +3188,6 @@
                 <w:tab w:val="left" w:pos="284"/>
               </w:tabs>
               <w:ind w:right="-1"/>
-              <w:rPr>
-                <w:sz w:val="16"/>
-                <w:szCs w:val="16"/>
-              </w:rPr>
             </w:pPr>
           </w:p>
         </w:tc>
@@ -3303,10 +3207,6 @@
                 <w:tab w:val="left" w:pos="284"/>
               </w:tabs>
               <w:ind w:right="-1"/>
-              <w:rPr>
-                <w:sz w:val="16"/>
-                <w:szCs w:val="16"/>
-              </w:rPr>
             </w:pPr>
           </w:p>
         </w:tc>
@@ -3326,10 +3226,6 @@
                 <w:tab w:val="left" w:pos="284"/>
               </w:tabs>
               <w:ind w:right="-1"/>
-              <w:rPr>
-                <w:sz w:val="16"/>
-                <w:szCs w:val="16"/>
-              </w:rPr>
             </w:pPr>
           </w:p>
         </w:tc>
@@ -3349,10 +3245,6 @@
                 <w:tab w:val="left" w:pos="284"/>
               </w:tabs>
               <w:ind w:right="-1"/>
-              <w:rPr>
-                <w:sz w:val="16"/>
-                <w:szCs w:val="16"/>
-              </w:rPr>
             </w:pPr>
           </w:p>
         </w:tc>
@@ -3372,10 +3264,6 @@
                 <w:tab w:val="left" w:pos="284"/>
               </w:tabs>
               <w:ind w:right="-1"/>
-              <w:rPr>
-                <w:sz w:val="16"/>
-                <w:szCs w:val="16"/>
-              </w:rPr>
             </w:pPr>
           </w:p>
         </w:tc>
@@ -3395,10 +3283,6 @@
                 <w:tab w:val="left" w:pos="284"/>
               </w:tabs>
               <w:ind w:right="-1"/>
-              <w:rPr>
-                <w:sz w:val="16"/>
-                <w:szCs w:val="16"/>
-              </w:rPr>
             </w:pPr>
           </w:p>
         </w:tc>

</xml_diff>

<commit_message>
feat: actualizar plantilla acta de conformidad
</commit_message>
<xml_diff>
--- a/pesaje/analytica/Report/PrintActaConformidad.docx
+++ b/pesaje/analytica/Report/PrintActaConformidad.docx
@@ -6,6 +6,935 @@
       <w:tblPr>
         <w:tblStyle w:val="Tablaconcuadrcula"/>
         <w:tblpPr w:leftFromText="141" w:rightFromText="141" w:vertAnchor="text" w:horzAnchor="margin" w:tblpXSpec="center" w:tblpY="383"/>
+        <w:tblW w:w="0" w:type="auto"/>
+        <w:tblLook w:val="04A0" w:firstRow="1" w:lastRow="0" w:firstColumn="1" w:lastColumn="0" w:noHBand="0" w:noVBand="1"/>
+      </w:tblPr>
+      <w:tblGrid>
+        <w:gridCol w:w="2410"/>
+        <w:gridCol w:w="5528"/>
+        <w:gridCol w:w="1579"/>
+      </w:tblGrid>
+      <w:tr>
+        <w:trPr>
+          <w:trHeight w:val="315"/>
+        </w:trPr>
+        <w:tc>
+          <w:tcPr>
+            <w:tcW w:w="7938" w:type="dxa"/>
+            <w:gridSpan w:val="2"/>
+            <w:tcBorders>
+              <w:top w:val="nil"/>
+              <w:left w:val="nil"/>
+              <w:bottom w:val="single" w:sz="4" w:space="0" w:color="auto"/>
+              <w:right w:val="nil"/>
+            </w:tcBorders>
+          </w:tcPr>
+          <w:p>
+            <w:pPr>
+              <w:tabs>
+                <w:tab w:val="left" w:pos="284"/>
+              </w:tabs>
+              <w:ind w:right="-1"/>
+              <w:jc w:val="center"/>
+              <w:rPr>
+                <w:b/>
+                <w:bCs/>
+                <w:sz w:val="28"/>
+                <w:szCs w:val="28"/>
+                <w:u w:val="single"/>
+              </w:rPr>
+            </w:pPr>
+            <w:r>
+              <w:rPr>
+                <w:b/>
+                <w:bCs/>
+                <w:sz w:val="28"/>
+                <w:szCs w:val="28"/>
+                <w:u w:val="single"/>
+              </w:rPr>
+              <w:t>ACTA DE CONFORMIDAD DE DESCARGA DE LOTES</w:t>
+            </w:r>
+          </w:p>
+        </w:tc>
+        <w:tc>
+          <w:tcPr>
+            <w:tcW w:w="1579" w:type="dxa"/>
+            <w:tcBorders>
+              <w:top w:val="nil"/>
+              <w:left w:val="nil"/>
+              <w:bottom w:val="nil"/>
+              <w:right w:val="nil"/>
+            </w:tcBorders>
+          </w:tcPr>
+          <w:p>
+            <w:pPr>
+              <w:tabs>
+                <w:tab w:val="left" w:pos="284"/>
+              </w:tabs>
+              <w:ind w:right="-1"/>
+              <w:jc w:val="center"/>
+              <w:rPr>
+                <w:b/>
+                <w:bCs/>
+                <w:sz w:val="28"/>
+                <w:szCs w:val="28"/>
+                <w:u w:val="single"/>
+              </w:rPr>
+            </w:pPr>
+            <w:r>
+              <w:rPr>
+                <w:b/>
+                <w:bCs/>
+                <w:sz w:val="28"/>
+                <w:szCs w:val="28"/>
+                <w:u w:val="single"/>
+              </w:rPr>
+              <w:fldChar w:fldCharType="begin"/>
+            </w:r>
+            <w:r>
+              <w:rPr>
+                <w:b/>
+                <w:bCs/>
+                <w:sz w:val="28"/>
+                <w:szCs w:val="28"/>
+                <w:u w:val="single"/>
+              </w:rPr>
+              <w:instrText xml:space="preserve"> MERGEFIELD  nro_acta  \* MERGEFORMAT </w:instrText>
+            </w:r>
+            <w:r>
+              <w:rPr>
+                <w:b/>
+                <w:bCs/>
+                <w:sz w:val="28"/>
+                <w:szCs w:val="28"/>
+                <w:u w:val="single"/>
+              </w:rPr>
+              <w:fldChar w:fldCharType="separate"/>
+            </w:r>
+            <w:r>
+              <w:rPr>
+                <w:b/>
+                <w:bCs/>
+                <w:noProof/>
+                <w:sz w:val="28"/>
+                <w:szCs w:val="28"/>
+                <w:u w:val="single"/>
+              </w:rPr>
+              <w:t>«nro_acta»</w:t>
+            </w:r>
+            <w:r>
+              <w:rPr>
+                <w:b/>
+                <w:bCs/>
+                <w:sz w:val="28"/>
+                <w:szCs w:val="28"/>
+                <w:u w:val="single"/>
+              </w:rPr>
+              <w:fldChar w:fldCharType="end"/>
+            </w:r>
+          </w:p>
+        </w:tc>
+      </w:tr>
+      <w:tr>
+        <w:trPr>
+          <w:trHeight w:val="304"/>
+        </w:trPr>
+        <w:tc>
+          <w:tcPr>
+            <w:tcW w:w="2410" w:type="dxa"/>
+            <w:tcBorders>
+              <w:top w:val="single" w:sz="4" w:space="0" w:color="auto"/>
+            </w:tcBorders>
+          </w:tcPr>
+          <w:p>
+            <w:pPr>
+              <w:tabs>
+                <w:tab w:val="left" w:pos="284"/>
+              </w:tabs>
+              <w:ind w:right="-1"/>
+              <w:rPr>
+                <w:b/>
+                <w:bCs/>
+                <w:sz w:val="22"/>
+                <w:szCs w:val="22"/>
+              </w:rPr>
+            </w:pPr>
+            <w:r>
+              <w:rPr>
+                <w:b/>
+                <w:bCs/>
+                <w:sz w:val="22"/>
+                <w:szCs w:val="22"/>
+              </w:rPr>
+              <w:t>Fecha de descarga</w:t>
+            </w:r>
+          </w:p>
+        </w:tc>
+        <w:tc>
+          <w:tcPr>
+            <w:tcW w:w="5528" w:type="dxa"/>
+            <w:tcBorders>
+              <w:top w:val="single" w:sz="4" w:space="0" w:color="auto"/>
+              <w:right w:val="single" w:sz="4" w:space="0" w:color="auto"/>
+            </w:tcBorders>
+          </w:tcPr>
+          <w:p>
+            <w:pPr>
+              <w:tabs>
+                <w:tab w:val="left" w:pos="284"/>
+              </w:tabs>
+              <w:ind w:right="-1"/>
+              <w:rPr>
+                <w:sz w:val="22"/>
+                <w:szCs w:val="22"/>
+              </w:rPr>
+            </w:pPr>
+            <w:r>
+              <w:rPr>
+                <w:sz w:val="22"/>
+                <w:szCs w:val="22"/>
+              </w:rPr>
+              <w:fldChar w:fldCharType="begin"/>
+            </w:r>
+            <w:r>
+              <w:rPr>
+                <w:sz w:val="22"/>
+                <w:szCs w:val="22"/>
+              </w:rPr>
+              <w:instrText xml:space="preserve"> MERGEFIELD  fecha_descarga  \* MERGEFORMAT </w:instrText>
+            </w:r>
+            <w:r>
+              <w:rPr>
+                <w:sz w:val="22"/>
+                <w:szCs w:val="22"/>
+              </w:rPr>
+              <w:fldChar w:fldCharType="separate"/>
+            </w:r>
+            <w:r>
+              <w:rPr>
+                <w:noProof/>
+                <w:sz w:val="22"/>
+                <w:szCs w:val="22"/>
+              </w:rPr>
+              <w:t>«fecha_descarga»</w:t>
+            </w:r>
+            <w:r>
+              <w:rPr>
+                <w:noProof/>
+                <w:sz w:val="22"/>
+                <w:szCs w:val="22"/>
+              </w:rPr>
+              <w:fldChar w:fldCharType="end"/>
+            </w:r>
+          </w:p>
+        </w:tc>
+        <w:tc>
+          <w:tcPr>
+            <w:tcW w:w="1579" w:type="dxa"/>
+            <w:tcBorders>
+              <w:top w:val="nil"/>
+              <w:left w:val="single" w:sz="4" w:space="0" w:color="auto"/>
+              <w:bottom w:val="nil"/>
+              <w:right w:val="nil"/>
+            </w:tcBorders>
+          </w:tcPr>
+          <w:p>
+            <w:pPr>
+              <w:tabs>
+                <w:tab w:val="left" w:pos="284"/>
+              </w:tabs>
+              <w:ind w:right="-1"/>
+              <w:rPr>
+                <w:sz w:val="16"/>
+                <w:szCs w:val="16"/>
+              </w:rPr>
+            </w:pPr>
+          </w:p>
+        </w:tc>
+      </w:tr>
+      <w:tr>
+        <w:trPr>
+          <w:trHeight w:val="315"/>
+        </w:trPr>
+        <w:tc>
+          <w:tcPr>
+            <w:tcW w:w="2410" w:type="dxa"/>
+          </w:tcPr>
+          <w:p>
+            <w:pPr>
+              <w:tabs>
+                <w:tab w:val="left" w:pos="284"/>
+              </w:tabs>
+              <w:ind w:right="-1"/>
+              <w:rPr>
+                <w:b/>
+                <w:bCs/>
+                <w:sz w:val="22"/>
+                <w:szCs w:val="22"/>
+              </w:rPr>
+            </w:pPr>
+            <w:r>
+              <w:rPr>
+                <w:b/>
+                <w:bCs/>
+                <w:sz w:val="22"/>
+                <w:szCs w:val="22"/>
+              </w:rPr>
+              <w:t>Hora</w:t>
+            </w:r>
+          </w:p>
+        </w:tc>
+        <w:tc>
+          <w:tcPr>
+            <w:tcW w:w="5528" w:type="dxa"/>
+            <w:tcBorders>
+              <w:right w:val="single" w:sz="4" w:space="0" w:color="auto"/>
+            </w:tcBorders>
+          </w:tcPr>
+          <w:p>
+            <w:pPr>
+              <w:tabs>
+                <w:tab w:val="left" w:pos="284"/>
+              </w:tabs>
+              <w:ind w:right="-1"/>
+              <w:rPr>
+                <w:sz w:val="22"/>
+                <w:szCs w:val="22"/>
+              </w:rPr>
+            </w:pPr>
+            <w:r>
+              <w:rPr>
+                <w:sz w:val="22"/>
+                <w:szCs w:val="22"/>
+              </w:rPr>
+              <w:fldChar w:fldCharType="begin"/>
+            </w:r>
+            <w:r>
+              <w:rPr>
+                <w:sz w:val="22"/>
+                <w:szCs w:val="22"/>
+              </w:rPr>
+              <w:instrText xml:space="preserve"> MERGEFIELD  hora_descarga  \* MERGEFORMAT </w:instrText>
+            </w:r>
+            <w:r>
+              <w:rPr>
+                <w:sz w:val="22"/>
+                <w:szCs w:val="22"/>
+              </w:rPr>
+              <w:fldChar w:fldCharType="separate"/>
+            </w:r>
+            <w:r>
+              <w:rPr>
+                <w:noProof/>
+                <w:sz w:val="22"/>
+                <w:szCs w:val="22"/>
+              </w:rPr>
+              <w:t>«hora_descarga»</w:t>
+            </w:r>
+            <w:r>
+              <w:rPr>
+                <w:noProof/>
+                <w:sz w:val="22"/>
+                <w:szCs w:val="22"/>
+              </w:rPr>
+              <w:fldChar w:fldCharType="end"/>
+            </w:r>
+          </w:p>
+        </w:tc>
+        <w:tc>
+          <w:tcPr>
+            <w:tcW w:w="1579" w:type="dxa"/>
+            <w:tcBorders>
+              <w:top w:val="nil"/>
+              <w:left w:val="single" w:sz="4" w:space="0" w:color="auto"/>
+              <w:bottom w:val="nil"/>
+              <w:right w:val="nil"/>
+            </w:tcBorders>
+          </w:tcPr>
+          <w:p>
+            <w:pPr>
+              <w:tabs>
+                <w:tab w:val="left" w:pos="284"/>
+              </w:tabs>
+              <w:ind w:right="-1"/>
+              <w:rPr>
+                <w:sz w:val="16"/>
+                <w:szCs w:val="16"/>
+              </w:rPr>
+            </w:pPr>
+          </w:p>
+        </w:tc>
+      </w:tr>
+      <w:tr>
+        <w:trPr>
+          <w:trHeight w:val="315"/>
+        </w:trPr>
+        <w:tc>
+          <w:tcPr>
+            <w:tcW w:w="2410" w:type="dxa"/>
+          </w:tcPr>
+          <w:p>
+            <w:pPr>
+              <w:tabs>
+                <w:tab w:val="left" w:pos="284"/>
+              </w:tabs>
+              <w:ind w:right="-1"/>
+              <w:rPr>
+                <w:b/>
+                <w:bCs/>
+                <w:sz w:val="22"/>
+                <w:szCs w:val="22"/>
+              </w:rPr>
+            </w:pPr>
+            <w:r>
+              <w:rPr>
+                <w:b/>
+                <w:bCs/>
+                <w:sz w:val="22"/>
+                <w:szCs w:val="22"/>
+              </w:rPr>
+              <w:t>Lugar de descarga</w:t>
+            </w:r>
+          </w:p>
+        </w:tc>
+        <w:tc>
+          <w:tcPr>
+            <w:tcW w:w="5528" w:type="dxa"/>
+            <w:tcBorders>
+              <w:right w:val="single" w:sz="4" w:space="0" w:color="auto"/>
+            </w:tcBorders>
+          </w:tcPr>
+          <w:p>
+            <w:pPr>
+              <w:tabs>
+                <w:tab w:val="left" w:pos="284"/>
+              </w:tabs>
+              <w:ind w:right="-1"/>
+              <w:rPr>
+                <w:sz w:val="22"/>
+                <w:szCs w:val="22"/>
+              </w:rPr>
+            </w:pPr>
+            <w:r>
+              <w:rPr>
+                <w:sz w:val="22"/>
+                <w:szCs w:val="22"/>
+              </w:rPr>
+              <w:fldChar w:fldCharType="begin"/>
+            </w:r>
+            <w:r>
+              <w:rPr>
+                <w:sz w:val="22"/>
+                <w:szCs w:val="22"/>
+              </w:rPr>
+              <w:instrText xml:space="preserve"> MERGEFIELD  sucursal  \* MERGEFORMAT </w:instrText>
+            </w:r>
+            <w:r>
+              <w:rPr>
+                <w:sz w:val="22"/>
+                <w:szCs w:val="22"/>
+              </w:rPr>
+              <w:fldChar w:fldCharType="separate"/>
+            </w:r>
+            <w:r>
+              <w:rPr>
+                <w:noProof/>
+                <w:sz w:val="22"/>
+                <w:szCs w:val="22"/>
+              </w:rPr>
+              <w:t>«sucursal»</w:t>
+            </w:r>
+            <w:r>
+              <w:rPr>
+                <w:noProof/>
+                <w:sz w:val="22"/>
+                <w:szCs w:val="22"/>
+              </w:rPr>
+              <w:fldChar w:fldCharType="end"/>
+            </w:r>
+          </w:p>
+        </w:tc>
+        <w:tc>
+          <w:tcPr>
+            <w:tcW w:w="1579" w:type="dxa"/>
+            <w:tcBorders>
+              <w:top w:val="nil"/>
+              <w:left w:val="single" w:sz="4" w:space="0" w:color="auto"/>
+              <w:bottom w:val="nil"/>
+              <w:right w:val="nil"/>
+            </w:tcBorders>
+          </w:tcPr>
+          <w:p>
+            <w:pPr>
+              <w:tabs>
+                <w:tab w:val="left" w:pos="284"/>
+              </w:tabs>
+              <w:ind w:right="-1"/>
+              <w:rPr>
+                <w:sz w:val="16"/>
+                <w:szCs w:val="16"/>
+              </w:rPr>
+            </w:pPr>
+          </w:p>
+        </w:tc>
+      </w:tr>
+      <w:tr>
+        <w:trPr>
+          <w:trHeight w:val="304"/>
+        </w:trPr>
+        <w:tc>
+          <w:tcPr>
+            <w:tcW w:w="2410" w:type="dxa"/>
+          </w:tcPr>
+          <w:p>
+            <w:pPr>
+              <w:tabs>
+                <w:tab w:val="left" w:pos="284"/>
+              </w:tabs>
+              <w:ind w:right="-1"/>
+              <w:rPr>
+                <w:b/>
+                <w:bCs/>
+                <w:sz w:val="22"/>
+                <w:szCs w:val="22"/>
+              </w:rPr>
+            </w:pPr>
+            <w:r>
+              <w:rPr>
+                <w:b/>
+                <w:bCs/>
+                <w:sz w:val="22"/>
+                <w:szCs w:val="22"/>
+              </w:rPr>
+              <w:t>Empresa Transportista</w:t>
+            </w:r>
+          </w:p>
+        </w:tc>
+        <w:tc>
+          <w:tcPr>
+            <w:tcW w:w="5528" w:type="dxa"/>
+            <w:tcBorders>
+              <w:right w:val="single" w:sz="4" w:space="0" w:color="auto"/>
+            </w:tcBorders>
+          </w:tcPr>
+          <w:p>
+            <w:pPr>
+              <w:tabs>
+                <w:tab w:val="left" w:pos="284"/>
+              </w:tabs>
+              <w:ind w:right="-1"/>
+              <w:rPr>
+                <w:sz w:val="22"/>
+                <w:szCs w:val="22"/>
+              </w:rPr>
+            </w:pPr>
+            <w:r>
+              <w:rPr>
+                <w:sz w:val="22"/>
+                <w:szCs w:val="22"/>
+              </w:rPr>
+              <w:fldChar w:fldCharType="begin"/>
+            </w:r>
+            <w:r>
+              <w:rPr>
+                <w:sz w:val="22"/>
+                <w:szCs w:val="22"/>
+              </w:rPr>
+              <w:instrText xml:space="preserve"> MERGEFIELD  transportista  \* MERGEFORMAT </w:instrText>
+            </w:r>
+            <w:r>
+              <w:rPr>
+                <w:sz w:val="22"/>
+                <w:szCs w:val="22"/>
+              </w:rPr>
+              <w:fldChar w:fldCharType="separate"/>
+            </w:r>
+            <w:r>
+              <w:rPr>
+                <w:noProof/>
+                <w:sz w:val="22"/>
+                <w:szCs w:val="22"/>
+              </w:rPr>
+              <w:t>«transportista»</w:t>
+            </w:r>
+            <w:r>
+              <w:rPr>
+                <w:noProof/>
+                <w:sz w:val="22"/>
+                <w:szCs w:val="22"/>
+              </w:rPr>
+              <w:fldChar w:fldCharType="end"/>
+            </w:r>
+          </w:p>
+        </w:tc>
+        <w:tc>
+          <w:tcPr>
+            <w:tcW w:w="1579" w:type="dxa"/>
+            <w:tcBorders>
+              <w:top w:val="nil"/>
+              <w:left w:val="single" w:sz="4" w:space="0" w:color="auto"/>
+              <w:bottom w:val="nil"/>
+              <w:right w:val="nil"/>
+            </w:tcBorders>
+          </w:tcPr>
+          <w:p>
+            <w:pPr>
+              <w:tabs>
+                <w:tab w:val="left" w:pos="284"/>
+              </w:tabs>
+              <w:ind w:right="-1"/>
+              <w:rPr>
+                <w:sz w:val="16"/>
+                <w:szCs w:val="16"/>
+              </w:rPr>
+            </w:pPr>
+          </w:p>
+        </w:tc>
+      </w:tr>
+      <w:tr>
+        <w:trPr>
+          <w:trHeight w:val="315"/>
+        </w:trPr>
+        <w:tc>
+          <w:tcPr>
+            <w:tcW w:w="2410" w:type="dxa"/>
+          </w:tcPr>
+          <w:p>
+            <w:pPr>
+              <w:tabs>
+                <w:tab w:val="left" w:pos="284"/>
+              </w:tabs>
+              <w:ind w:right="-1"/>
+              <w:rPr>
+                <w:b/>
+                <w:bCs/>
+                <w:sz w:val="22"/>
+                <w:szCs w:val="22"/>
+              </w:rPr>
+            </w:pPr>
+            <w:r>
+              <w:rPr>
+                <w:b/>
+                <w:bCs/>
+                <w:sz w:val="22"/>
+                <w:szCs w:val="22"/>
+              </w:rPr>
+              <w:t>Conductor</w:t>
+            </w:r>
+          </w:p>
+        </w:tc>
+        <w:tc>
+          <w:tcPr>
+            <w:tcW w:w="5528" w:type="dxa"/>
+            <w:tcBorders>
+              <w:right w:val="single" w:sz="4" w:space="0" w:color="auto"/>
+            </w:tcBorders>
+          </w:tcPr>
+          <w:p>
+            <w:pPr>
+              <w:tabs>
+                <w:tab w:val="left" w:pos="284"/>
+              </w:tabs>
+              <w:ind w:right="-1"/>
+              <w:rPr>
+                <w:sz w:val="22"/>
+                <w:szCs w:val="22"/>
+              </w:rPr>
+            </w:pPr>
+            <w:r>
+              <w:rPr>
+                <w:sz w:val="22"/>
+                <w:szCs w:val="22"/>
+              </w:rPr>
+              <w:fldChar w:fldCharType="begin"/>
+            </w:r>
+            <w:r>
+              <w:rPr>
+                <w:sz w:val="22"/>
+                <w:szCs w:val="22"/>
+              </w:rPr>
+              <w:instrText xml:space="preserve"> MERGEFIELD  nom_conductor  \* MERGEFORMAT </w:instrText>
+            </w:r>
+            <w:r>
+              <w:rPr>
+                <w:sz w:val="22"/>
+                <w:szCs w:val="22"/>
+              </w:rPr>
+              <w:fldChar w:fldCharType="separate"/>
+            </w:r>
+            <w:r>
+              <w:rPr>
+                <w:noProof/>
+                <w:sz w:val="22"/>
+                <w:szCs w:val="22"/>
+              </w:rPr>
+              <w:t>«nom_conductor»</w:t>
+            </w:r>
+            <w:r>
+              <w:rPr>
+                <w:noProof/>
+                <w:sz w:val="22"/>
+                <w:szCs w:val="22"/>
+              </w:rPr>
+              <w:fldChar w:fldCharType="end"/>
+            </w:r>
+          </w:p>
+        </w:tc>
+        <w:tc>
+          <w:tcPr>
+            <w:tcW w:w="1579" w:type="dxa"/>
+            <w:tcBorders>
+              <w:top w:val="nil"/>
+              <w:left w:val="single" w:sz="4" w:space="0" w:color="auto"/>
+              <w:bottom w:val="nil"/>
+              <w:right w:val="nil"/>
+            </w:tcBorders>
+          </w:tcPr>
+          <w:p>
+            <w:pPr>
+              <w:tabs>
+                <w:tab w:val="left" w:pos="284"/>
+              </w:tabs>
+              <w:ind w:right="-1"/>
+              <w:rPr>
+                <w:sz w:val="16"/>
+                <w:szCs w:val="16"/>
+              </w:rPr>
+            </w:pPr>
+          </w:p>
+        </w:tc>
+      </w:tr>
+      <w:tr>
+        <w:trPr>
+          <w:trHeight w:val="304"/>
+        </w:trPr>
+        <w:tc>
+          <w:tcPr>
+            <w:tcW w:w="2410" w:type="dxa"/>
+          </w:tcPr>
+          <w:p>
+            <w:pPr>
+              <w:tabs>
+                <w:tab w:val="left" w:pos="284"/>
+              </w:tabs>
+              <w:ind w:right="-1"/>
+              <w:rPr>
+                <w:b/>
+                <w:bCs/>
+                <w:sz w:val="22"/>
+                <w:szCs w:val="22"/>
+              </w:rPr>
+            </w:pPr>
+            <w:r>
+              <w:rPr>
+                <w:b/>
+                <w:bCs/>
+                <w:sz w:val="22"/>
+                <w:szCs w:val="22"/>
+              </w:rPr>
+              <w:t>DNI</w:t>
+            </w:r>
+          </w:p>
+        </w:tc>
+        <w:tc>
+          <w:tcPr>
+            <w:tcW w:w="5528" w:type="dxa"/>
+            <w:tcBorders>
+              <w:right w:val="single" w:sz="4" w:space="0" w:color="auto"/>
+            </w:tcBorders>
+          </w:tcPr>
+          <w:p>
+            <w:pPr>
+              <w:tabs>
+                <w:tab w:val="left" w:pos="284"/>
+              </w:tabs>
+              <w:ind w:right="-1"/>
+              <w:rPr>
+                <w:sz w:val="22"/>
+                <w:szCs w:val="22"/>
+              </w:rPr>
+            </w:pPr>
+            <w:r>
+              <w:rPr>
+                <w:sz w:val="22"/>
+                <w:szCs w:val="22"/>
+              </w:rPr>
+              <w:fldChar w:fldCharType="begin"/>
+            </w:r>
+            <w:r>
+              <w:rPr>
+                <w:sz w:val="22"/>
+                <w:szCs w:val="22"/>
+              </w:rPr>
+              <w:instrText xml:space="preserve"> MERGEFIELD  doc_conductor  \* MERGEFORMAT </w:instrText>
+            </w:r>
+            <w:r>
+              <w:rPr>
+                <w:sz w:val="22"/>
+                <w:szCs w:val="22"/>
+              </w:rPr>
+              <w:fldChar w:fldCharType="separate"/>
+            </w:r>
+            <w:r>
+              <w:rPr>
+                <w:noProof/>
+                <w:sz w:val="22"/>
+                <w:szCs w:val="22"/>
+              </w:rPr>
+              <w:t>«doc_conductor»</w:t>
+            </w:r>
+            <w:r>
+              <w:rPr>
+                <w:noProof/>
+                <w:sz w:val="22"/>
+                <w:szCs w:val="22"/>
+              </w:rPr>
+              <w:fldChar w:fldCharType="end"/>
+            </w:r>
+          </w:p>
+        </w:tc>
+        <w:tc>
+          <w:tcPr>
+            <w:tcW w:w="1579" w:type="dxa"/>
+            <w:tcBorders>
+              <w:top w:val="nil"/>
+              <w:left w:val="single" w:sz="4" w:space="0" w:color="auto"/>
+              <w:bottom w:val="nil"/>
+              <w:right w:val="nil"/>
+            </w:tcBorders>
+          </w:tcPr>
+          <w:p>
+            <w:pPr>
+              <w:tabs>
+                <w:tab w:val="left" w:pos="284"/>
+              </w:tabs>
+              <w:ind w:right="-1"/>
+              <w:rPr>
+                <w:sz w:val="16"/>
+                <w:szCs w:val="16"/>
+              </w:rPr>
+            </w:pPr>
+          </w:p>
+        </w:tc>
+      </w:tr>
+      <w:tr>
+        <w:trPr>
+          <w:trHeight w:val="315"/>
+        </w:trPr>
+        <w:tc>
+          <w:tcPr>
+            <w:tcW w:w="2410" w:type="dxa"/>
+          </w:tcPr>
+          <w:p>
+            <w:pPr>
+              <w:tabs>
+                <w:tab w:val="left" w:pos="284"/>
+              </w:tabs>
+              <w:ind w:right="-1"/>
+              <w:rPr>
+                <w:b/>
+                <w:bCs/>
+                <w:sz w:val="22"/>
+                <w:szCs w:val="22"/>
+              </w:rPr>
+            </w:pPr>
+            <w:r>
+              <w:rPr>
+                <w:b/>
+                <w:bCs/>
+                <w:sz w:val="22"/>
+                <w:szCs w:val="22"/>
+              </w:rPr>
+              <w:t>Placa de Vehículo</w:t>
+            </w:r>
+          </w:p>
+        </w:tc>
+        <w:tc>
+          <w:tcPr>
+            <w:tcW w:w="5528" w:type="dxa"/>
+            <w:tcBorders>
+              <w:right w:val="single" w:sz="4" w:space="0" w:color="auto"/>
+            </w:tcBorders>
+          </w:tcPr>
+          <w:p>
+            <w:pPr>
+              <w:tabs>
+                <w:tab w:val="left" w:pos="284"/>
+              </w:tabs>
+              <w:ind w:right="-1"/>
+              <w:rPr>
+                <w:sz w:val="22"/>
+                <w:szCs w:val="22"/>
+              </w:rPr>
+            </w:pPr>
+            <w:r>
+              <w:rPr>
+                <w:sz w:val="22"/>
+                <w:szCs w:val="22"/>
+              </w:rPr>
+              <w:fldChar w:fldCharType="begin"/>
+            </w:r>
+            <w:r>
+              <w:rPr>
+                <w:sz w:val="22"/>
+                <w:szCs w:val="22"/>
+              </w:rPr>
+              <w:instrText xml:space="preserve"> MERGEFIELD  nro_placa  \* MERGEFORMAT </w:instrText>
+            </w:r>
+            <w:r>
+              <w:rPr>
+                <w:sz w:val="22"/>
+                <w:szCs w:val="22"/>
+              </w:rPr>
+              <w:fldChar w:fldCharType="separate"/>
+            </w:r>
+            <w:r>
+              <w:rPr>
+                <w:noProof/>
+                <w:sz w:val="22"/>
+                <w:szCs w:val="22"/>
+              </w:rPr>
+              <w:t>«nro_placa»</w:t>
+            </w:r>
+            <w:r>
+              <w:rPr>
+                <w:noProof/>
+                <w:sz w:val="22"/>
+                <w:szCs w:val="22"/>
+              </w:rPr>
+              <w:fldChar w:fldCharType="end"/>
+            </w:r>
+          </w:p>
+        </w:tc>
+        <w:tc>
+          <w:tcPr>
+            <w:tcW w:w="1579" w:type="dxa"/>
+            <w:tcBorders>
+              <w:top w:val="nil"/>
+              <w:left w:val="single" w:sz="4" w:space="0" w:color="auto"/>
+              <w:bottom w:val="nil"/>
+              <w:right w:val="nil"/>
+            </w:tcBorders>
+          </w:tcPr>
+          <w:p>
+            <w:pPr>
+              <w:tabs>
+                <w:tab w:val="left" w:pos="284"/>
+              </w:tabs>
+              <w:ind w:right="-1"/>
+              <w:rPr>
+                <w:sz w:val="16"/>
+                <w:szCs w:val="16"/>
+              </w:rPr>
+            </w:pPr>
+          </w:p>
+        </w:tc>
+      </w:tr>
+    </w:tbl>
+    <w:tbl>
+      <w:tblPr>
+        <w:tblStyle w:val="Tablaconcuadrcula"/>
+        <w:tblpPr w:leftFromText="141" w:rightFromText="141" w:vertAnchor="text" w:horzAnchor="margin" w:tblpY="-3"/>
         <w:tblW w:w="0" w:type="auto"/>
         <w:tblBorders>
           <w:top w:val="none" w:sz="0" w:space="0" w:color="auto"/>
@@ -18,21 +947,15 @@
         <w:tblLook w:val="04A0" w:firstRow="1" w:lastRow="0" w:firstColumn="1" w:lastColumn="0" w:noHBand="0" w:noVBand="1"/>
       </w:tblPr>
       <w:tblGrid>
-        <w:gridCol w:w="2410"/>
-        <w:gridCol w:w="5528"/>
-        <w:gridCol w:w="1579"/>
+        <w:gridCol w:w="2797"/>
+        <w:gridCol w:w="2797"/>
+        <w:gridCol w:w="2797"/>
+        <w:gridCol w:w="2797"/>
       </w:tblGrid>
       <w:tr>
-        <w:trPr>
-          <w:trHeight w:val="315"/>
-        </w:trPr>
-        <w:tc>
-          <w:tcPr>
-            <w:tcW w:w="7938" w:type="dxa"/>
-            <w:gridSpan w:val="2"/>
-            <w:tcBorders>
-              <w:bottom w:val="single" w:sz="4" w:space="0" w:color="auto"/>
-            </w:tcBorders>
+        <w:tc>
+          <w:tcPr>
+            <w:tcW w:w="2797" w:type="dxa"/>
           </w:tcPr>
           <w:p>
             <w:pPr>
@@ -44,47 +967,34 @@
               <w:rPr>
                 <w:b/>
                 <w:bCs/>
-                <w:sz w:val="28"/>
-                <w:szCs w:val="28"/>
+                <w:sz w:val="18"/>
+                <w:szCs w:val="18"/>
               </w:rPr>
             </w:pPr>
             <w:r>
               <w:rPr>
                 <w:b/>
                 <w:bCs/>
-                <w:sz w:val="28"/>
-                <w:szCs w:val="28"/>
-              </w:rPr>
-              <w:t>ACTA DE CONFORMIDAD DE DESCARGA DE LOTES</w:t>
-            </w:r>
-          </w:p>
-        </w:tc>
-        <w:tc>
-          <w:tcPr>
-            <w:tcW w:w="1210" w:type="dxa"/>
-          </w:tcPr>
-          <w:p>
-            <w:pPr>
-              <w:tabs>
-                <w:tab w:val="left" w:pos="284"/>
-              </w:tabs>
-              <w:ind w:right="-1"/>
-              <w:jc w:val="center"/>
+                <w:sz w:val="18"/>
+                <w:szCs w:val="18"/>
+              </w:rPr>
+              <w:t xml:space="preserve">RUC:  </w:t>
+            </w:r>
+            <w:r>
               <w:rPr>
                 <w:b/>
                 <w:bCs/>
-                <w:sz w:val="28"/>
-                <w:szCs w:val="28"/>
-                <w:u w:val="single"/>
-              </w:rPr>
-            </w:pPr>
+                <w:sz w:val="18"/>
+                <w:szCs w:val="18"/>
+              </w:rPr>
+              <w:t xml:space="preserve"> </w:t>
+            </w:r>
             <w:r>
               <w:rPr>
                 <w:b/>
                 <w:bCs/>
-                <w:sz w:val="28"/>
-                <w:szCs w:val="28"/>
-                <w:u w:val="single"/>
+                <w:sz w:val="18"/>
+                <w:szCs w:val="18"/>
               </w:rPr>
               <w:fldChar w:fldCharType="begin"/>
             </w:r>
@@ -92,19 +1002,17 @@
               <w:rPr>
                 <w:b/>
                 <w:bCs/>
-                <w:sz w:val="28"/>
-                <w:szCs w:val="28"/>
-                <w:u w:val="single"/>
-              </w:rPr>
-              <w:instrText xml:space="preserve"> MERGEFIELD  nro_acta  \* MERGEFORMAT </w:instrText>
+                <w:sz w:val="18"/>
+                <w:szCs w:val="18"/>
+              </w:rPr>
+              <w:instrText xml:space="preserve"> MERGEFIELD  ruc </w:instrText>
             </w:r>
             <w:r>
               <w:rPr>
                 <w:b/>
                 <w:bCs/>
-                <w:sz w:val="28"/>
-                <w:szCs w:val="28"/>
-                <w:u w:val="single"/>
+                <w:sz w:val="18"/>
+                <w:szCs w:val="18"/>
               </w:rPr>
               <w:fldChar w:fldCharType="separate"/>
             </w:r>
@@ -113,38 +1021,25 @@
                 <w:b/>
                 <w:bCs/>
                 <w:noProof/>
-                <w:sz w:val="28"/>
-                <w:szCs w:val="28"/>
-                <w:u w:val="single"/>
-              </w:rPr>
-              <w:t>«nro_acta»</w:t>
+                <w:sz w:val="18"/>
+                <w:szCs w:val="18"/>
+              </w:rPr>
+              <w:t>«ruc»</w:t>
             </w:r>
             <w:r>
               <w:rPr>
                 <w:b/>
                 <w:bCs/>
-                <w:sz w:val="28"/>
-                <w:szCs w:val="28"/>
-                <w:u w:val="single"/>
+                <w:sz w:val="18"/>
+                <w:szCs w:val="18"/>
               </w:rPr>
               <w:fldChar w:fldCharType="end"/>
             </w:r>
           </w:p>
         </w:tc>
-      </w:tr>
-      <w:tr>
-        <w:trPr>
-          <w:trHeight w:val="304"/>
-        </w:trPr>
-        <w:tc>
-          <w:tcPr>
-            <w:tcW w:w="2410" w:type="dxa"/>
-            <w:tcBorders>
-              <w:top w:val="single" w:sz="4" w:space="0" w:color="auto"/>
-              <w:left w:val="single" w:sz="4" w:space="0" w:color="auto"/>
-              <w:bottom w:val="single" w:sz="4" w:space="0" w:color="auto"/>
-              <w:right w:val="single" w:sz="4" w:space="0" w:color="auto"/>
-            </w:tcBorders>
+        <w:tc>
+          <w:tcPr>
+            <w:tcW w:w="2797" w:type="dxa"/>
           </w:tcPr>
           <w:p>
             <w:pPr>
@@ -155,115 +1050,30 @@
               <w:rPr>
                 <w:b/>
                 <w:bCs/>
-                <w:sz w:val="22"/>
-                <w:szCs w:val="22"/>
-              </w:rPr>
-            </w:pPr>
-            <w:r>
+              </w:rPr>
+            </w:pPr>
+          </w:p>
+        </w:tc>
+        <w:tc>
+          <w:tcPr>
+            <w:tcW w:w="2797" w:type="dxa"/>
+          </w:tcPr>
+          <w:p>
+            <w:pPr>
+              <w:tabs>
+                <w:tab w:val="left" w:pos="284"/>
+              </w:tabs>
+              <w:ind w:right="-1"/>
               <w:rPr>
                 <w:b/>
                 <w:bCs/>
-                <w:sz w:val="22"/>
-                <w:szCs w:val="22"/>
-              </w:rPr>
-              <w:t>Fecha de descarga</w:t>
-            </w:r>
-          </w:p>
-        </w:tc>
-        <w:tc>
-          <w:tcPr>
-            <w:tcW w:w="5528" w:type="dxa"/>
-            <w:tcBorders>
-              <w:top w:val="single" w:sz="4" w:space="0" w:color="auto"/>
-              <w:left w:val="single" w:sz="4" w:space="0" w:color="auto"/>
-              <w:bottom w:val="single" w:sz="4" w:space="0" w:color="auto"/>
-              <w:right w:val="single" w:sz="4" w:space="0" w:color="auto"/>
-            </w:tcBorders>
-          </w:tcPr>
-          <w:p>
-            <w:pPr>
-              <w:tabs>
-                <w:tab w:val="left" w:pos="284"/>
-              </w:tabs>
-              <w:ind w:right="-1"/>
-              <w:rPr>
-                <w:sz w:val="22"/>
-                <w:szCs w:val="22"/>
-              </w:rPr>
-            </w:pPr>
-            <w:r>
-              <w:rPr>
-                <w:sz w:val="22"/>
-                <w:szCs w:val="22"/>
-              </w:rPr>
-              <w:fldChar w:fldCharType="begin"/>
-            </w:r>
-            <w:r>
-              <w:rPr>
-                <w:sz w:val="22"/>
-                <w:szCs w:val="22"/>
-              </w:rPr>
-              <w:instrText xml:space="preserve"> MERGEFIELD  fecha_descarga  \* MERGEFORMAT </w:instrText>
-            </w:r>
-            <w:r>
-              <w:rPr>
-                <w:sz w:val="22"/>
-                <w:szCs w:val="22"/>
-              </w:rPr>
-              <w:fldChar w:fldCharType="separate"/>
-            </w:r>
-            <w:r>
-              <w:rPr>
-                <w:noProof/>
-                <w:sz w:val="22"/>
-                <w:szCs w:val="22"/>
-              </w:rPr>
-              <w:t>«fecha_descarga»</w:t>
-            </w:r>
-            <w:r>
-              <w:rPr>
-                <w:noProof/>
-                <w:sz w:val="22"/>
-                <w:szCs w:val="22"/>
-              </w:rPr>
-              <w:fldChar w:fldCharType="end"/>
-            </w:r>
-          </w:p>
-        </w:tc>
-        <w:tc>
-          <w:tcPr>
-            <w:tcW w:w="1210" w:type="dxa"/>
-            <w:tcBorders>
-              <w:left w:val="single" w:sz="4" w:space="0" w:color="auto"/>
-            </w:tcBorders>
-          </w:tcPr>
-          <w:p>
-            <w:pPr>
-              <w:tabs>
-                <w:tab w:val="left" w:pos="284"/>
-              </w:tabs>
-              <w:ind w:right="-1"/>
-              <w:rPr>
-                <w:sz w:val="16"/>
-                <w:szCs w:val="16"/>
-              </w:rPr>
-            </w:pPr>
-          </w:p>
-        </w:tc>
-      </w:tr>
-      <w:tr>
-        <w:trPr>
-          <w:trHeight w:val="315"/>
-        </w:trPr>
-        <w:tc>
-          <w:tcPr>
-            <w:tcW w:w="2410" w:type="dxa"/>
-            <w:tcBorders>
-              <w:top w:val="single" w:sz="4" w:space="0" w:color="auto"/>
-              <w:left w:val="single" w:sz="4" w:space="0" w:color="auto"/>
-              <w:bottom w:val="single" w:sz="4" w:space="0" w:color="auto"/>
-              <w:right w:val="single" w:sz="4" w:space="0" w:color="auto"/>
-            </w:tcBorders>
+              </w:rPr>
+            </w:pPr>
+          </w:p>
+        </w:tc>
+        <w:tc>
+          <w:tcPr>
+            <w:tcW w:w="2797" w:type="dxa"/>
           </w:tcPr>
           <w:p>
             <w:pPr>
@@ -274,692 +1084,6 @@
               <w:rPr>
                 <w:b/>
                 <w:bCs/>
-                <w:sz w:val="22"/>
-                <w:szCs w:val="22"/>
-              </w:rPr>
-            </w:pPr>
-            <w:r>
-              <w:rPr>
-                <w:b/>
-                <w:bCs/>
-                <w:sz w:val="22"/>
-                <w:szCs w:val="22"/>
-              </w:rPr>
-              <w:t>Hora</w:t>
-            </w:r>
-          </w:p>
-        </w:tc>
-        <w:tc>
-          <w:tcPr>
-            <w:tcW w:w="5528" w:type="dxa"/>
-            <w:tcBorders>
-              <w:top w:val="single" w:sz="4" w:space="0" w:color="auto"/>
-              <w:left w:val="single" w:sz="4" w:space="0" w:color="auto"/>
-              <w:bottom w:val="single" w:sz="4" w:space="0" w:color="auto"/>
-              <w:right w:val="single" w:sz="4" w:space="0" w:color="auto"/>
-            </w:tcBorders>
-          </w:tcPr>
-          <w:p>
-            <w:pPr>
-              <w:tabs>
-                <w:tab w:val="left" w:pos="284"/>
-              </w:tabs>
-              <w:ind w:right="-1"/>
-              <w:rPr>
-                <w:sz w:val="22"/>
-                <w:szCs w:val="22"/>
-              </w:rPr>
-            </w:pPr>
-            <w:r>
-              <w:rPr>
-                <w:sz w:val="22"/>
-                <w:szCs w:val="22"/>
-              </w:rPr>
-              <w:fldChar w:fldCharType="begin"/>
-            </w:r>
-            <w:r>
-              <w:rPr>
-                <w:sz w:val="22"/>
-                <w:szCs w:val="22"/>
-              </w:rPr>
-              <w:instrText xml:space="preserve"> MERGEFIELD  hora_descarga  \* MERGEFORMAT </w:instrText>
-            </w:r>
-            <w:r>
-              <w:rPr>
-                <w:sz w:val="22"/>
-                <w:szCs w:val="22"/>
-              </w:rPr>
-              <w:fldChar w:fldCharType="separate"/>
-            </w:r>
-            <w:r>
-              <w:rPr>
-                <w:noProof/>
-                <w:sz w:val="22"/>
-                <w:szCs w:val="22"/>
-              </w:rPr>
-              <w:t>«hora_descarga»</w:t>
-            </w:r>
-            <w:r>
-              <w:rPr>
-                <w:noProof/>
-                <w:sz w:val="22"/>
-                <w:szCs w:val="22"/>
-              </w:rPr>
-              <w:fldChar w:fldCharType="end"/>
-            </w:r>
-          </w:p>
-        </w:tc>
-        <w:tc>
-          <w:tcPr>
-            <w:tcW w:w="1210" w:type="dxa"/>
-            <w:tcBorders>
-              <w:left w:val="single" w:sz="4" w:space="0" w:color="auto"/>
-            </w:tcBorders>
-          </w:tcPr>
-          <w:p>
-            <w:pPr>
-              <w:tabs>
-                <w:tab w:val="left" w:pos="284"/>
-              </w:tabs>
-              <w:ind w:right="-1"/>
-              <w:rPr>
-                <w:sz w:val="16"/>
-                <w:szCs w:val="16"/>
-              </w:rPr>
-            </w:pPr>
-          </w:p>
-        </w:tc>
-      </w:tr>
-      <w:tr>
-        <w:trPr>
-          <w:trHeight w:val="315"/>
-        </w:trPr>
-        <w:tc>
-          <w:tcPr>
-            <w:tcW w:w="2410" w:type="dxa"/>
-            <w:tcBorders>
-              <w:top w:val="single" w:sz="4" w:space="0" w:color="auto"/>
-              <w:left w:val="single" w:sz="4" w:space="0" w:color="auto"/>
-              <w:bottom w:val="single" w:sz="4" w:space="0" w:color="auto"/>
-              <w:right w:val="single" w:sz="4" w:space="0" w:color="auto"/>
-            </w:tcBorders>
-          </w:tcPr>
-          <w:p>
-            <w:pPr>
-              <w:tabs>
-                <w:tab w:val="left" w:pos="284"/>
-              </w:tabs>
-              <w:ind w:right="-1"/>
-              <w:rPr>
-                <w:b/>
-                <w:bCs/>
-                <w:sz w:val="22"/>
-                <w:szCs w:val="22"/>
-              </w:rPr>
-            </w:pPr>
-            <w:r>
-              <w:rPr>
-                <w:b/>
-                <w:bCs/>
-                <w:sz w:val="22"/>
-                <w:szCs w:val="22"/>
-              </w:rPr>
-              <w:t>Lugar de descarga</w:t>
-            </w:r>
-          </w:p>
-        </w:tc>
-        <w:tc>
-          <w:tcPr>
-            <w:tcW w:w="5528" w:type="dxa"/>
-            <w:tcBorders>
-              <w:top w:val="single" w:sz="4" w:space="0" w:color="auto"/>
-              <w:left w:val="single" w:sz="4" w:space="0" w:color="auto"/>
-              <w:bottom w:val="single" w:sz="4" w:space="0" w:color="auto"/>
-              <w:right w:val="single" w:sz="4" w:space="0" w:color="auto"/>
-            </w:tcBorders>
-          </w:tcPr>
-          <w:p>
-            <w:pPr>
-              <w:tabs>
-                <w:tab w:val="left" w:pos="284"/>
-              </w:tabs>
-              <w:ind w:right="-1"/>
-              <w:rPr>
-                <w:sz w:val="22"/>
-                <w:szCs w:val="22"/>
-              </w:rPr>
-            </w:pPr>
-            <w:r>
-              <w:rPr>
-                <w:sz w:val="22"/>
-                <w:szCs w:val="22"/>
-              </w:rPr>
-              <w:fldChar w:fldCharType="begin"/>
-            </w:r>
-            <w:r>
-              <w:rPr>
-                <w:sz w:val="22"/>
-                <w:szCs w:val="22"/>
-              </w:rPr>
-              <w:instrText xml:space="preserve"> MERGEFIELD  sucursal  \* MERGEFORMAT </w:instrText>
-            </w:r>
-            <w:r>
-              <w:rPr>
-                <w:sz w:val="22"/>
-                <w:szCs w:val="22"/>
-              </w:rPr>
-              <w:fldChar w:fldCharType="separate"/>
-            </w:r>
-            <w:r>
-              <w:rPr>
-                <w:noProof/>
-                <w:sz w:val="22"/>
-                <w:szCs w:val="22"/>
-              </w:rPr>
-              <w:t>«sucursal»</w:t>
-            </w:r>
-            <w:r>
-              <w:rPr>
-                <w:noProof/>
-                <w:sz w:val="22"/>
-                <w:szCs w:val="22"/>
-              </w:rPr>
-              <w:fldChar w:fldCharType="end"/>
-            </w:r>
-          </w:p>
-        </w:tc>
-        <w:tc>
-          <w:tcPr>
-            <w:tcW w:w="1210" w:type="dxa"/>
-            <w:tcBorders>
-              <w:left w:val="single" w:sz="4" w:space="0" w:color="auto"/>
-            </w:tcBorders>
-          </w:tcPr>
-          <w:p>
-            <w:pPr>
-              <w:tabs>
-                <w:tab w:val="left" w:pos="284"/>
-              </w:tabs>
-              <w:ind w:right="-1"/>
-              <w:rPr>
-                <w:sz w:val="16"/>
-                <w:szCs w:val="16"/>
-              </w:rPr>
-            </w:pPr>
-          </w:p>
-        </w:tc>
-      </w:tr>
-      <w:tr>
-        <w:trPr>
-          <w:trHeight w:val="304"/>
-        </w:trPr>
-        <w:tc>
-          <w:tcPr>
-            <w:tcW w:w="2410" w:type="dxa"/>
-            <w:tcBorders>
-              <w:top w:val="single" w:sz="4" w:space="0" w:color="auto"/>
-              <w:left w:val="single" w:sz="4" w:space="0" w:color="auto"/>
-              <w:bottom w:val="single" w:sz="4" w:space="0" w:color="auto"/>
-              <w:right w:val="single" w:sz="4" w:space="0" w:color="auto"/>
-            </w:tcBorders>
-          </w:tcPr>
-          <w:p>
-            <w:pPr>
-              <w:tabs>
-                <w:tab w:val="left" w:pos="284"/>
-              </w:tabs>
-              <w:ind w:right="-1"/>
-              <w:rPr>
-                <w:b/>
-                <w:bCs/>
-                <w:sz w:val="22"/>
-                <w:szCs w:val="22"/>
-              </w:rPr>
-            </w:pPr>
-            <w:r>
-              <w:rPr>
-                <w:b/>
-                <w:bCs/>
-                <w:sz w:val="22"/>
-                <w:szCs w:val="22"/>
-              </w:rPr>
-              <w:t>Empresa Transportista</w:t>
-            </w:r>
-          </w:p>
-        </w:tc>
-        <w:tc>
-          <w:tcPr>
-            <w:tcW w:w="5528" w:type="dxa"/>
-            <w:tcBorders>
-              <w:top w:val="single" w:sz="4" w:space="0" w:color="auto"/>
-              <w:left w:val="single" w:sz="4" w:space="0" w:color="auto"/>
-              <w:bottom w:val="single" w:sz="4" w:space="0" w:color="auto"/>
-              <w:right w:val="single" w:sz="4" w:space="0" w:color="auto"/>
-            </w:tcBorders>
-          </w:tcPr>
-          <w:p>
-            <w:pPr>
-              <w:tabs>
-                <w:tab w:val="left" w:pos="284"/>
-              </w:tabs>
-              <w:ind w:right="-1"/>
-              <w:rPr>
-                <w:sz w:val="22"/>
-                <w:szCs w:val="22"/>
-              </w:rPr>
-            </w:pPr>
-            <w:r>
-              <w:rPr>
-                <w:sz w:val="22"/>
-                <w:szCs w:val="22"/>
-              </w:rPr>
-              <w:fldChar w:fldCharType="begin"/>
-            </w:r>
-            <w:r>
-              <w:rPr>
-                <w:sz w:val="22"/>
-                <w:szCs w:val="22"/>
-              </w:rPr>
-              <w:instrText xml:space="preserve"> MERGEFIELD  transportista  \* MERGEFORMAT </w:instrText>
-            </w:r>
-            <w:r>
-              <w:rPr>
-                <w:sz w:val="22"/>
-                <w:szCs w:val="22"/>
-              </w:rPr>
-              <w:fldChar w:fldCharType="separate"/>
-            </w:r>
-            <w:r>
-              <w:rPr>
-                <w:noProof/>
-                <w:sz w:val="22"/>
-                <w:szCs w:val="22"/>
-              </w:rPr>
-              <w:t>«transportista»</w:t>
-            </w:r>
-            <w:r>
-              <w:rPr>
-                <w:noProof/>
-                <w:sz w:val="22"/>
-                <w:szCs w:val="22"/>
-              </w:rPr>
-              <w:fldChar w:fldCharType="end"/>
-            </w:r>
-          </w:p>
-        </w:tc>
-        <w:tc>
-          <w:tcPr>
-            <w:tcW w:w="1210" w:type="dxa"/>
-            <w:tcBorders>
-              <w:left w:val="single" w:sz="4" w:space="0" w:color="auto"/>
-            </w:tcBorders>
-          </w:tcPr>
-          <w:p>
-            <w:pPr>
-              <w:tabs>
-                <w:tab w:val="left" w:pos="284"/>
-              </w:tabs>
-              <w:ind w:right="-1"/>
-              <w:rPr>
-                <w:sz w:val="16"/>
-                <w:szCs w:val="16"/>
-              </w:rPr>
-            </w:pPr>
-          </w:p>
-        </w:tc>
-      </w:tr>
-      <w:tr>
-        <w:trPr>
-          <w:trHeight w:val="315"/>
-        </w:trPr>
-        <w:tc>
-          <w:tcPr>
-            <w:tcW w:w="2410" w:type="dxa"/>
-            <w:tcBorders>
-              <w:top w:val="single" w:sz="4" w:space="0" w:color="auto"/>
-              <w:left w:val="single" w:sz="4" w:space="0" w:color="auto"/>
-              <w:bottom w:val="single" w:sz="4" w:space="0" w:color="auto"/>
-              <w:right w:val="single" w:sz="4" w:space="0" w:color="auto"/>
-            </w:tcBorders>
-          </w:tcPr>
-          <w:p>
-            <w:pPr>
-              <w:tabs>
-                <w:tab w:val="left" w:pos="284"/>
-              </w:tabs>
-              <w:ind w:right="-1"/>
-              <w:rPr>
-                <w:b/>
-                <w:bCs/>
-                <w:sz w:val="22"/>
-                <w:szCs w:val="22"/>
-              </w:rPr>
-            </w:pPr>
-            <w:r>
-              <w:rPr>
-                <w:b/>
-                <w:bCs/>
-                <w:sz w:val="22"/>
-                <w:szCs w:val="22"/>
-              </w:rPr>
-              <w:t>Conductor</w:t>
-            </w:r>
-          </w:p>
-        </w:tc>
-        <w:tc>
-          <w:tcPr>
-            <w:tcW w:w="5528" w:type="dxa"/>
-            <w:tcBorders>
-              <w:top w:val="single" w:sz="4" w:space="0" w:color="auto"/>
-              <w:left w:val="single" w:sz="4" w:space="0" w:color="auto"/>
-              <w:bottom w:val="single" w:sz="4" w:space="0" w:color="auto"/>
-              <w:right w:val="single" w:sz="4" w:space="0" w:color="auto"/>
-            </w:tcBorders>
-          </w:tcPr>
-          <w:p>
-            <w:pPr>
-              <w:tabs>
-                <w:tab w:val="left" w:pos="284"/>
-              </w:tabs>
-              <w:ind w:right="-1"/>
-              <w:rPr>
-                <w:sz w:val="22"/>
-                <w:szCs w:val="22"/>
-              </w:rPr>
-            </w:pPr>
-            <w:r>
-              <w:rPr>
-                <w:sz w:val="22"/>
-                <w:szCs w:val="22"/>
-              </w:rPr>
-              <w:fldChar w:fldCharType="begin"/>
-            </w:r>
-            <w:r>
-              <w:rPr>
-                <w:sz w:val="22"/>
-                <w:szCs w:val="22"/>
-              </w:rPr>
-              <w:instrText xml:space="preserve"> MERGEFIELD  nom_conductor  \* MERGEFORMAT </w:instrText>
-            </w:r>
-            <w:r>
-              <w:rPr>
-                <w:sz w:val="22"/>
-                <w:szCs w:val="22"/>
-              </w:rPr>
-              <w:fldChar w:fldCharType="separate"/>
-            </w:r>
-            <w:r>
-              <w:rPr>
-                <w:noProof/>
-                <w:sz w:val="22"/>
-                <w:szCs w:val="22"/>
-              </w:rPr>
-              <w:t>«nom_conductor»</w:t>
-            </w:r>
-            <w:r>
-              <w:rPr>
-                <w:noProof/>
-                <w:sz w:val="22"/>
-                <w:szCs w:val="22"/>
-              </w:rPr>
-              <w:fldChar w:fldCharType="end"/>
-            </w:r>
-          </w:p>
-        </w:tc>
-        <w:tc>
-          <w:tcPr>
-            <w:tcW w:w="1210" w:type="dxa"/>
-            <w:tcBorders>
-              <w:left w:val="single" w:sz="4" w:space="0" w:color="auto"/>
-            </w:tcBorders>
-          </w:tcPr>
-          <w:p>
-            <w:pPr>
-              <w:tabs>
-                <w:tab w:val="left" w:pos="284"/>
-              </w:tabs>
-              <w:ind w:right="-1"/>
-              <w:rPr>
-                <w:sz w:val="16"/>
-                <w:szCs w:val="16"/>
-              </w:rPr>
-            </w:pPr>
-          </w:p>
-        </w:tc>
-      </w:tr>
-      <w:tr>
-        <w:trPr>
-          <w:trHeight w:val="304"/>
-        </w:trPr>
-        <w:tc>
-          <w:tcPr>
-            <w:tcW w:w="2410" w:type="dxa"/>
-            <w:tcBorders>
-              <w:top w:val="single" w:sz="4" w:space="0" w:color="auto"/>
-              <w:left w:val="single" w:sz="4" w:space="0" w:color="auto"/>
-              <w:bottom w:val="single" w:sz="4" w:space="0" w:color="auto"/>
-              <w:right w:val="single" w:sz="4" w:space="0" w:color="auto"/>
-            </w:tcBorders>
-          </w:tcPr>
-          <w:p>
-            <w:pPr>
-              <w:tabs>
-                <w:tab w:val="left" w:pos="284"/>
-              </w:tabs>
-              <w:ind w:right="-1"/>
-              <w:rPr>
-                <w:b/>
-                <w:bCs/>
-                <w:sz w:val="22"/>
-                <w:szCs w:val="22"/>
-              </w:rPr>
-            </w:pPr>
-            <w:r>
-              <w:rPr>
-                <w:b/>
-                <w:bCs/>
-                <w:sz w:val="22"/>
-                <w:szCs w:val="22"/>
-              </w:rPr>
-              <w:t>DNI</w:t>
-            </w:r>
-          </w:p>
-        </w:tc>
-        <w:tc>
-          <w:tcPr>
-            <w:tcW w:w="5528" w:type="dxa"/>
-            <w:tcBorders>
-              <w:top w:val="single" w:sz="4" w:space="0" w:color="auto"/>
-              <w:left w:val="single" w:sz="4" w:space="0" w:color="auto"/>
-              <w:bottom w:val="single" w:sz="4" w:space="0" w:color="auto"/>
-              <w:right w:val="single" w:sz="4" w:space="0" w:color="auto"/>
-            </w:tcBorders>
-          </w:tcPr>
-          <w:p>
-            <w:pPr>
-              <w:tabs>
-                <w:tab w:val="left" w:pos="284"/>
-              </w:tabs>
-              <w:ind w:right="-1"/>
-              <w:rPr>
-                <w:sz w:val="22"/>
-                <w:szCs w:val="22"/>
-              </w:rPr>
-            </w:pPr>
-            <w:r>
-              <w:rPr>
-                <w:sz w:val="22"/>
-                <w:szCs w:val="22"/>
-              </w:rPr>
-              <w:fldChar w:fldCharType="begin"/>
-            </w:r>
-            <w:r>
-              <w:rPr>
-                <w:sz w:val="22"/>
-                <w:szCs w:val="22"/>
-              </w:rPr>
-              <w:instrText xml:space="preserve"> MERGEFIELD  doc_conductor  \* MERGEFORMAT </w:instrText>
-            </w:r>
-            <w:r>
-              <w:rPr>
-                <w:sz w:val="22"/>
-                <w:szCs w:val="22"/>
-              </w:rPr>
-              <w:fldChar w:fldCharType="separate"/>
-            </w:r>
-            <w:r>
-              <w:rPr>
-                <w:noProof/>
-                <w:sz w:val="22"/>
-                <w:szCs w:val="22"/>
-              </w:rPr>
-              <w:t>«doc_conductor»</w:t>
-            </w:r>
-            <w:r>
-              <w:rPr>
-                <w:noProof/>
-                <w:sz w:val="22"/>
-                <w:szCs w:val="22"/>
-              </w:rPr>
-              <w:fldChar w:fldCharType="end"/>
-            </w:r>
-          </w:p>
-        </w:tc>
-        <w:tc>
-          <w:tcPr>
-            <w:tcW w:w="1210" w:type="dxa"/>
-            <w:tcBorders>
-              <w:left w:val="single" w:sz="4" w:space="0" w:color="auto"/>
-            </w:tcBorders>
-          </w:tcPr>
-          <w:p>
-            <w:pPr>
-              <w:tabs>
-                <w:tab w:val="left" w:pos="284"/>
-              </w:tabs>
-              <w:ind w:right="-1"/>
-              <w:rPr>
-                <w:sz w:val="16"/>
-                <w:szCs w:val="16"/>
-              </w:rPr>
-            </w:pPr>
-          </w:p>
-        </w:tc>
-      </w:tr>
-      <w:tr>
-        <w:trPr>
-          <w:trHeight w:val="315"/>
-        </w:trPr>
-        <w:tc>
-          <w:tcPr>
-            <w:tcW w:w="2410" w:type="dxa"/>
-            <w:tcBorders>
-              <w:top w:val="single" w:sz="4" w:space="0" w:color="auto"/>
-              <w:left w:val="single" w:sz="4" w:space="0" w:color="auto"/>
-              <w:bottom w:val="single" w:sz="4" w:space="0" w:color="auto"/>
-              <w:right w:val="single" w:sz="4" w:space="0" w:color="auto"/>
-            </w:tcBorders>
-          </w:tcPr>
-          <w:p>
-            <w:pPr>
-              <w:tabs>
-                <w:tab w:val="left" w:pos="284"/>
-              </w:tabs>
-              <w:ind w:right="-1"/>
-              <w:rPr>
-                <w:b/>
-                <w:bCs/>
-                <w:sz w:val="22"/>
-                <w:szCs w:val="22"/>
-              </w:rPr>
-            </w:pPr>
-            <w:r>
-              <w:rPr>
-                <w:b/>
-                <w:bCs/>
-                <w:sz w:val="22"/>
-                <w:szCs w:val="22"/>
-              </w:rPr>
-              <w:t>Placa de Vehículo</w:t>
-            </w:r>
-          </w:p>
-        </w:tc>
-        <w:tc>
-          <w:tcPr>
-            <w:tcW w:w="5528" w:type="dxa"/>
-            <w:tcBorders>
-              <w:top w:val="single" w:sz="4" w:space="0" w:color="auto"/>
-              <w:left w:val="single" w:sz="4" w:space="0" w:color="auto"/>
-              <w:bottom w:val="single" w:sz="4" w:space="0" w:color="auto"/>
-              <w:right w:val="single" w:sz="4" w:space="0" w:color="auto"/>
-            </w:tcBorders>
-          </w:tcPr>
-          <w:p>
-            <w:pPr>
-              <w:tabs>
-                <w:tab w:val="left" w:pos="284"/>
-              </w:tabs>
-              <w:ind w:right="-1"/>
-              <w:rPr>
-                <w:sz w:val="22"/>
-                <w:szCs w:val="22"/>
-              </w:rPr>
-            </w:pPr>
-            <w:r>
-              <w:rPr>
-                <w:sz w:val="22"/>
-                <w:szCs w:val="22"/>
-              </w:rPr>
-              <w:fldChar w:fldCharType="begin"/>
-            </w:r>
-            <w:r>
-              <w:rPr>
-                <w:sz w:val="22"/>
-                <w:szCs w:val="22"/>
-              </w:rPr>
-              <w:instrText xml:space="preserve"> MERGEFIELD  nro_placa  \* MERGEFORMAT </w:instrText>
-            </w:r>
-            <w:r>
-              <w:rPr>
-                <w:sz w:val="22"/>
-                <w:szCs w:val="22"/>
-              </w:rPr>
-              <w:fldChar w:fldCharType="separate"/>
-            </w:r>
-            <w:r>
-              <w:rPr>
-                <w:noProof/>
-                <w:sz w:val="22"/>
-                <w:szCs w:val="22"/>
-              </w:rPr>
-              <w:t>«nro_placa»</w:t>
-            </w:r>
-            <w:r>
-              <w:rPr>
-                <w:noProof/>
-                <w:sz w:val="22"/>
-                <w:szCs w:val="22"/>
-              </w:rPr>
-              <w:fldChar w:fldCharType="end"/>
-            </w:r>
-          </w:p>
-        </w:tc>
-        <w:tc>
-          <w:tcPr>
-            <w:tcW w:w="1210" w:type="dxa"/>
-            <w:tcBorders>
-              <w:left w:val="single" w:sz="4" w:space="0" w:color="auto"/>
-            </w:tcBorders>
-          </w:tcPr>
-          <w:p>
-            <w:pPr>
-              <w:tabs>
-                <w:tab w:val="left" w:pos="284"/>
-              </w:tabs>
-              <w:ind w:right="-1"/>
-              <w:rPr>
-                <w:sz w:val="16"/>
-                <w:szCs w:val="16"/>
               </w:rPr>
             </w:pPr>
           </w:p>
@@ -972,10 +1096,6 @@
           <w:tab w:val="left" w:pos="284"/>
         </w:tabs>
         <w:ind w:right="-1"/>
-        <w:rPr>
-          <w:b/>
-          <w:bCs/>
-        </w:rPr>
       </w:pPr>
       <w:r>
         <w:rPr>
@@ -988,10 +1108,10 @@
         <mc:AlternateContent>
           <mc:Choice Requires="wps">
             <w:drawing>
-              <wp:anchor distT="0" distB="0" distL="114300" distR="114300" simplePos="0" relativeHeight="251659264" behindDoc="0" locked="0" layoutInCell="1" allowOverlap="1" wp14:anchorId="36262E0B" wp14:editId="6836A6B3">
+              <wp:anchor distT="0" distB="0" distL="114300" distR="114300" simplePos="0" relativeHeight="251659264" behindDoc="0" locked="0" layoutInCell="1" allowOverlap="1" wp14:anchorId="36262E0B" wp14:editId="713A24B7">
                 <wp:simplePos x="0" y="0"/>
                 <wp:positionH relativeFrom="margin">
-                  <wp:posOffset>-29845</wp:posOffset>
+                  <wp:posOffset>-43292</wp:posOffset>
                 </wp:positionH>
                 <wp:positionV relativeFrom="paragraph">
                   <wp:posOffset>-711835</wp:posOffset>
@@ -1094,7 +1214,7 @@
           </mc:Choice>
           <mc:Fallback>
             <w:pict>
-              <v:roundrect w14:anchorId="36262E0B" id="Rectángulo: esquinas redondeadas 782399144" o:spid="_x0000_s1026" style="position:absolute;margin-left:-2.35pt;margin-top:-56.05pt;width:157.1pt;height:54.7pt;z-index:251659264;visibility:visible;mso-wrap-style:square;mso-width-percent:0;mso-height-percent:0;mso-wrap-distance-left:9pt;mso-wrap-distance-top:0;mso-wrap-distance-right:9pt;mso-wrap-distance-bottom:0;mso-position-horizontal:absolute;mso-position-horizontal-relative:margin;mso-position-vertical:absolute;mso-position-vertical-relative:text;mso-width-percent:0;mso-height-percent:0;mso-width-relative:margin;mso-height-relative:margin;v-text-anchor:top" arcsize="10923f" o:gfxdata="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" filled="f" stroked="f">
+              <v:roundrect w14:anchorId="36262E0B" id="Rectángulo: esquinas redondeadas 782399144" o:spid="_x0000_s1026" style="position:absolute;margin-left:-3.4pt;margin-top:-56.05pt;width:157.1pt;height:54.7pt;z-index:251659264;visibility:visible;mso-wrap-style:square;mso-width-percent:0;mso-height-percent:0;mso-wrap-distance-left:9pt;mso-wrap-distance-top:0;mso-wrap-distance-right:9pt;mso-wrap-distance-bottom:0;mso-position-horizontal:absolute;mso-position-horizontal-relative:margin;mso-position-vertical:absolute;mso-position-vertical-relative:text;mso-width-percent:0;mso-height-percent:0;mso-width-relative:margin;mso-height-relative:margin;v-text-anchor:top" arcsize="10923f" o:gfxdata="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" filled="f" stroked="f">
                 <v:stroke joinstyle="miter"/>
                 <v:textbox>
                   <w:txbxContent>
@@ -1152,57 +1272,6 @@
           </mc:Fallback>
         </mc:AlternateContent>
       </w:r>
-      <w:r>
-        <w:rPr>
-          <w:b/>
-          <w:bCs/>
-        </w:rPr>
-        <w:t xml:space="preserve">RUC:  </w:t>
-      </w:r>
-      <w:r>
-        <w:rPr>
-          <w:b/>
-          <w:bCs/>
-        </w:rPr>
-        <w:fldChar w:fldCharType="begin"/>
-      </w:r>
-      <w:r>
-        <w:rPr>
-          <w:b/>
-          <w:bCs/>
-        </w:rPr>
-        <w:instrText xml:space="preserve"> MERGEFIELD  ruc </w:instrText>
-      </w:r>
-      <w:r>
-        <w:rPr>
-          <w:b/>
-          <w:bCs/>
-        </w:rPr>
-        <w:fldChar w:fldCharType="separate"/>
-      </w:r>
-      <w:r>
-        <w:rPr>
-          <w:b/>
-          <w:bCs/>
-          <w:noProof/>
-        </w:rPr>
-        <w:t>«ruc»</w:t>
-      </w:r>
-      <w:r>
-        <w:rPr>
-          <w:b/>
-          <w:bCs/>
-        </w:rPr>
-        <w:fldChar w:fldCharType="end"/>
-      </w:r>
-    </w:p>
-    <w:p>
-      <w:pPr>
-        <w:tabs>
-          <w:tab w:val="left" w:pos="284"/>
-        </w:tabs>
-        <w:ind w:right="-1"/>
-      </w:pPr>
     </w:p>
     <w:p>
       <w:pPr>
@@ -2653,7 +2722,7 @@
                 <w:b/>
                 <w:bCs/>
               </w:rPr>
-              <w:instrText xml:space="preserve"> MERGEFIELD  tipo_encargado </w:instrText>
+              <w:instrText xml:space="preserve"> MERGEFIELD  tipo_representante </w:instrText>
             </w:r>
             <w:r>
               <w:rPr>
@@ -2668,7 +2737,7 @@
                 <w:bCs/>
                 <w:noProof/>
               </w:rPr>
-              <w:t>«tipo_encargado»</w:t>
+              <w:t>«tipo_representante»</w:t>
             </w:r>
             <w:r>
               <w:rPr>

</xml_diff>

<commit_message>
feat: actualizar plantilla acta conformidad
</commit_message>
<xml_diff>
--- a/pesaje/analytica/Report/PrintActaConformidad.docx
+++ b/pesaje/analytica/Report/PrintActaConformidad.docx
@@ -12,7 +12,7 @@
       <w:tblGrid>
         <w:gridCol w:w="2410"/>
         <w:gridCol w:w="5528"/>
-        <w:gridCol w:w="1579"/>
+        <w:gridCol w:w="1695"/>
       </w:tblGrid>
       <w:tr>
         <w:trPr>
@@ -37,6 +37,7 @@
               <w:ind w:right="-1"/>
               <w:jc w:val="center"/>
               <w:rPr>
+                <w:rFonts w:ascii="Aptos Black" w:hAnsi="Aptos Black"/>
                 <w:b/>
                 <w:bCs/>
                 <w:sz w:val="28"/>
@@ -46,6 +47,7 @@
             </w:pPr>
             <w:r>
               <w:rPr>
+                <w:rFonts w:ascii="Aptos Black" w:hAnsi="Aptos Black"/>
                 <w:b/>
                 <w:bCs/>
                 <w:sz w:val="28"/>
@@ -65,15 +67,16 @@
               <w:bottom w:val="nil"/>
               <w:right w:val="nil"/>
             </w:tcBorders>
-          </w:tcPr>
-          <w:p>
-            <w:pPr>
-              <w:tabs>
-                <w:tab w:val="left" w:pos="284"/>
-              </w:tabs>
-              <w:ind w:right="-1"/>
-              <w:jc w:val="center"/>
-              <w:rPr>
+            <w:shd w:val="clear" w:color="auto" w:fill="FFC000"/>
+          </w:tcPr>
+          <w:p>
+            <w:pPr>
+              <w:tabs>
+                <w:tab w:val="left" w:pos="284"/>
+              </w:tabs>
+              <w:ind w:right="-1"/>
+              <w:rPr>
+                <w:rFonts w:ascii="Arial" w:hAnsi="Arial" w:cs="Arial"/>
                 <w:b/>
                 <w:bCs/>
                 <w:sz w:val="28"/>
@@ -83,6 +86,7 @@
             </w:pPr>
             <w:r>
               <w:rPr>
+                <w:rFonts w:ascii="Arial" w:hAnsi="Arial" w:cs="Arial"/>
                 <w:b/>
                 <w:bCs/>
                 <w:sz w:val="28"/>
@@ -93,6 +97,7 @@
             </w:r>
             <w:r>
               <w:rPr>
+                <w:rFonts w:ascii="Arial" w:hAnsi="Arial" w:cs="Arial"/>
                 <w:b/>
                 <w:bCs/>
                 <w:sz w:val="28"/>
@@ -103,6 +108,7 @@
             </w:r>
             <w:r>
               <w:rPr>
+                <w:rFonts w:ascii="Arial" w:hAnsi="Arial" w:cs="Arial"/>
                 <w:b/>
                 <w:bCs/>
                 <w:sz w:val="28"/>
@@ -113,6 +119,7 @@
             </w:r>
             <w:r>
               <w:rPr>
+                <w:rFonts w:ascii="Arial" w:hAnsi="Arial" w:cs="Arial"/>
                 <w:b/>
                 <w:bCs/>
                 <w:noProof/>
@@ -124,6 +131,7 @@
             </w:r>
             <w:r>
               <w:rPr>
+                <w:rFonts w:ascii="Arial" w:hAnsi="Arial" w:cs="Arial"/>
                 <w:b/>
                 <w:bCs/>
                 <w:sz w:val="28"/>
@@ -153,18 +161,20 @@
               </w:tabs>
               <w:ind w:right="-1"/>
               <w:rPr>
+                <w:rFonts w:ascii="Cambria" w:hAnsi="Cambria" w:cs="Arial"/>
                 <w:b/>
                 <w:bCs/>
-                <w:sz w:val="22"/>
-                <w:szCs w:val="22"/>
-              </w:rPr>
-            </w:pPr>
-            <w:r>
-              <w:rPr>
+                <w:sz w:val="24"/>
+                <w:szCs w:val="24"/>
+              </w:rPr>
+            </w:pPr>
+            <w:r>
+              <w:rPr>
+                <w:rFonts w:ascii="Cambria" w:hAnsi="Cambria" w:cs="Arial"/>
                 <w:b/>
                 <w:bCs/>
-                <w:sz w:val="22"/>
-                <w:szCs w:val="22"/>
+                <w:sz w:val="24"/>
+                <w:szCs w:val="24"/>
               </w:rPr>
               <w:t>Fecha de descarga</w:t>
             </w:r>
@@ -185,44 +195,50 @@
               </w:tabs>
               <w:ind w:right="-1"/>
               <w:rPr>
-                <w:sz w:val="22"/>
-                <w:szCs w:val="22"/>
-              </w:rPr>
-            </w:pPr>
-            <w:r>
-              <w:rPr>
-                <w:sz w:val="22"/>
-                <w:szCs w:val="22"/>
+                <w:rFonts w:ascii="Cambria" w:hAnsi="Cambria" w:cs="Arial"/>
+                <w:sz w:val="24"/>
+                <w:szCs w:val="24"/>
+              </w:rPr>
+            </w:pPr>
+            <w:r>
+              <w:rPr>
+                <w:rFonts w:ascii="Cambria" w:hAnsi="Cambria" w:cs="Arial"/>
+                <w:sz w:val="24"/>
+                <w:szCs w:val="24"/>
               </w:rPr>
               <w:fldChar w:fldCharType="begin"/>
             </w:r>
             <w:r>
               <w:rPr>
-                <w:sz w:val="22"/>
-                <w:szCs w:val="22"/>
+                <w:rFonts w:ascii="Cambria" w:hAnsi="Cambria" w:cs="Arial"/>
+                <w:sz w:val="24"/>
+                <w:szCs w:val="24"/>
               </w:rPr>
               <w:instrText xml:space="preserve"> MERGEFIELD  fecha_descarga  \* MERGEFORMAT </w:instrText>
             </w:r>
             <w:r>
               <w:rPr>
-                <w:sz w:val="22"/>
-                <w:szCs w:val="22"/>
+                <w:rFonts w:ascii="Cambria" w:hAnsi="Cambria" w:cs="Arial"/>
+                <w:sz w:val="24"/>
+                <w:szCs w:val="24"/>
               </w:rPr>
               <w:fldChar w:fldCharType="separate"/>
             </w:r>
             <w:r>
               <w:rPr>
+                <w:rFonts w:ascii="Cambria" w:hAnsi="Cambria" w:cs="Arial"/>
                 <w:noProof/>
-                <w:sz w:val="22"/>
-                <w:szCs w:val="22"/>
+                <w:sz w:val="24"/>
+                <w:szCs w:val="24"/>
               </w:rPr>
               <w:t>«fecha_descarga»</w:t>
             </w:r>
             <w:r>
               <w:rPr>
+                <w:rFonts w:ascii="Cambria" w:hAnsi="Cambria" w:cs="Arial"/>
                 <w:noProof/>
-                <w:sz w:val="22"/>
-                <w:szCs w:val="22"/>
+                <w:sz w:val="24"/>
+                <w:szCs w:val="24"/>
               </w:rPr>
               <w:fldChar w:fldCharType="end"/>
             </w:r>
@@ -267,18 +283,20 @@
               </w:tabs>
               <w:ind w:right="-1"/>
               <w:rPr>
+                <w:rFonts w:ascii="Cambria" w:hAnsi="Cambria" w:cs="Arial"/>
                 <w:b/>
                 <w:bCs/>
-                <w:sz w:val="22"/>
-                <w:szCs w:val="22"/>
-              </w:rPr>
-            </w:pPr>
-            <w:r>
-              <w:rPr>
+                <w:sz w:val="24"/>
+                <w:szCs w:val="24"/>
+              </w:rPr>
+            </w:pPr>
+            <w:r>
+              <w:rPr>
+                <w:rFonts w:ascii="Cambria" w:hAnsi="Cambria" w:cs="Arial"/>
                 <w:b/>
                 <w:bCs/>
-                <w:sz w:val="22"/>
-                <w:szCs w:val="22"/>
+                <w:sz w:val="24"/>
+                <w:szCs w:val="24"/>
               </w:rPr>
               <w:t>Hora</w:t>
             </w:r>
@@ -298,44 +316,50 @@
               </w:tabs>
               <w:ind w:right="-1"/>
               <w:rPr>
-                <w:sz w:val="22"/>
-                <w:szCs w:val="22"/>
-              </w:rPr>
-            </w:pPr>
-            <w:r>
-              <w:rPr>
-                <w:sz w:val="22"/>
-                <w:szCs w:val="22"/>
+                <w:rFonts w:ascii="Cambria" w:hAnsi="Cambria" w:cs="Arial"/>
+                <w:sz w:val="24"/>
+                <w:szCs w:val="24"/>
+              </w:rPr>
+            </w:pPr>
+            <w:r>
+              <w:rPr>
+                <w:rFonts w:ascii="Cambria" w:hAnsi="Cambria" w:cs="Arial"/>
+                <w:sz w:val="24"/>
+                <w:szCs w:val="24"/>
               </w:rPr>
               <w:fldChar w:fldCharType="begin"/>
             </w:r>
             <w:r>
               <w:rPr>
-                <w:sz w:val="22"/>
-                <w:szCs w:val="22"/>
+                <w:rFonts w:ascii="Cambria" w:hAnsi="Cambria" w:cs="Arial"/>
+                <w:sz w:val="24"/>
+                <w:szCs w:val="24"/>
               </w:rPr>
               <w:instrText xml:space="preserve"> MERGEFIELD  hora_descarga  \* MERGEFORMAT </w:instrText>
             </w:r>
             <w:r>
               <w:rPr>
-                <w:sz w:val="22"/>
-                <w:szCs w:val="22"/>
+                <w:rFonts w:ascii="Cambria" w:hAnsi="Cambria" w:cs="Arial"/>
+                <w:sz w:val="24"/>
+                <w:szCs w:val="24"/>
               </w:rPr>
               <w:fldChar w:fldCharType="separate"/>
             </w:r>
             <w:r>
               <w:rPr>
+                <w:rFonts w:ascii="Cambria" w:hAnsi="Cambria" w:cs="Arial"/>
                 <w:noProof/>
-                <w:sz w:val="22"/>
-                <w:szCs w:val="22"/>
+                <w:sz w:val="24"/>
+                <w:szCs w:val="24"/>
               </w:rPr>
               <w:t>«hora_descarga»</w:t>
             </w:r>
             <w:r>
               <w:rPr>
+                <w:rFonts w:ascii="Cambria" w:hAnsi="Cambria" w:cs="Arial"/>
                 <w:noProof/>
-                <w:sz w:val="22"/>
-                <w:szCs w:val="22"/>
+                <w:sz w:val="24"/>
+                <w:szCs w:val="24"/>
               </w:rPr>
               <w:fldChar w:fldCharType="end"/>
             </w:r>
@@ -380,18 +404,20 @@
               </w:tabs>
               <w:ind w:right="-1"/>
               <w:rPr>
+                <w:rFonts w:ascii="Cambria" w:hAnsi="Cambria" w:cs="Arial"/>
                 <w:b/>
                 <w:bCs/>
-                <w:sz w:val="22"/>
-                <w:szCs w:val="22"/>
-              </w:rPr>
-            </w:pPr>
-            <w:r>
-              <w:rPr>
+                <w:sz w:val="24"/>
+                <w:szCs w:val="24"/>
+              </w:rPr>
+            </w:pPr>
+            <w:r>
+              <w:rPr>
+                <w:rFonts w:ascii="Cambria" w:hAnsi="Cambria" w:cs="Arial"/>
                 <w:b/>
                 <w:bCs/>
-                <w:sz w:val="22"/>
-                <w:szCs w:val="22"/>
+                <w:sz w:val="24"/>
+                <w:szCs w:val="24"/>
               </w:rPr>
               <w:t>Lugar de descarga</w:t>
             </w:r>
@@ -411,44 +437,50 @@
               </w:tabs>
               <w:ind w:right="-1"/>
               <w:rPr>
-                <w:sz w:val="22"/>
-                <w:szCs w:val="22"/>
-              </w:rPr>
-            </w:pPr>
-            <w:r>
-              <w:rPr>
-                <w:sz w:val="22"/>
-                <w:szCs w:val="22"/>
+                <w:rFonts w:ascii="Cambria" w:hAnsi="Cambria" w:cs="Arial"/>
+                <w:sz w:val="24"/>
+                <w:szCs w:val="24"/>
+              </w:rPr>
+            </w:pPr>
+            <w:r>
+              <w:rPr>
+                <w:rFonts w:ascii="Cambria" w:hAnsi="Cambria" w:cs="Arial"/>
+                <w:sz w:val="24"/>
+                <w:szCs w:val="24"/>
               </w:rPr>
               <w:fldChar w:fldCharType="begin"/>
             </w:r>
             <w:r>
               <w:rPr>
-                <w:sz w:val="22"/>
-                <w:szCs w:val="22"/>
+                <w:rFonts w:ascii="Cambria" w:hAnsi="Cambria" w:cs="Arial"/>
+                <w:sz w:val="24"/>
+                <w:szCs w:val="24"/>
               </w:rPr>
               <w:instrText xml:space="preserve"> MERGEFIELD  sucursal  \* MERGEFORMAT </w:instrText>
             </w:r>
             <w:r>
               <w:rPr>
-                <w:sz w:val="22"/>
-                <w:szCs w:val="22"/>
+                <w:rFonts w:ascii="Cambria" w:hAnsi="Cambria" w:cs="Arial"/>
+                <w:sz w:val="24"/>
+                <w:szCs w:val="24"/>
               </w:rPr>
               <w:fldChar w:fldCharType="separate"/>
             </w:r>
             <w:r>
               <w:rPr>
+                <w:rFonts w:ascii="Cambria" w:hAnsi="Cambria" w:cs="Arial"/>
                 <w:noProof/>
-                <w:sz w:val="22"/>
-                <w:szCs w:val="22"/>
+                <w:sz w:val="24"/>
+                <w:szCs w:val="24"/>
               </w:rPr>
               <w:t>«sucursal»</w:t>
             </w:r>
             <w:r>
               <w:rPr>
+                <w:rFonts w:ascii="Cambria" w:hAnsi="Cambria" w:cs="Arial"/>
                 <w:noProof/>
-                <w:sz w:val="22"/>
-                <w:szCs w:val="22"/>
+                <w:sz w:val="24"/>
+                <w:szCs w:val="24"/>
               </w:rPr>
               <w:fldChar w:fldCharType="end"/>
             </w:r>
@@ -493,18 +525,20 @@
               </w:tabs>
               <w:ind w:right="-1"/>
               <w:rPr>
+                <w:rFonts w:ascii="Cambria" w:hAnsi="Cambria" w:cs="Arial"/>
                 <w:b/>
                 <w:bCs/>
-                <w:sz w:val="22"/>
-                <w:szCs w:val="22"/>
-              </w:rPr>
-            </w:pPr>
-            <w:r>
-              <w:rPr>
+                <w:sz w:val="24"/>
+                <w:szCs w:val="24"/>
+              </w:rPr>
+            </w:pPr>
+            <w:r>
+              <w:rPr>
+                <w:rFonts w:ascii="Cambria" w:hAnsi="Cambria" w:cs="Arial"/>
                 <w:b/>
                 <w:bCs/>
-                <w:sz w:val="22"/>
-                <w:szCs w:val="22"/>
+                <w:sz w:val="24"/>
+                <w:szCs w:val="24"/>
               </w:rPr>
               <w:t>Empresa Transportista</w:t>
             </w:r>
@@ -524,44 +558,50 @@
               </w:tabs>
               <w:ind w:right="-1"/>
               <w:rPr>
-                <w:sz w:val="22"/>
-                <w:szCs w:val="22"/>
-              </w:rPr>
-            </w:pPr>
-            <w:r>
-              <w:rPr>
-                <w:sz w:val="22"/>
-                <w:szCs w:val="22"/>
+                <w:rFonts w:ascii="Cambria" w:hAnsi="Cambria" w:cs="Arial"/>
+                <w:sz w:val="24"/>
+                <w:szCs w:val="24"/>
+              </w:rPr>
+            </w:pPr>
+            <w:r>
+              <w:rPr>
+                <w:rFonts w:ascii="Cambria" w:hAnsi="Cambria" w:cs="Arial"/>
+                <w:sz w:val="24"/>
+                <w:szCs w:val="24"/>
               </w:rPr>
               <w:fldChar w:fldCharType="begin"/>
             </w:r>
             <w:r>
               <w:rPr>
-                <w:sz w:val="22"/>
-                <w:szCs w:val="22"/>
+                <w:rFonts w:ascii="Cambria" w:hAnsi="Cambria" w:cs="Arial"/>
+                <w:sz w:val="24"/>
+                <w:szCs w:val="24"/>
               </w:rPr>
               <w:instrText xml:space="preserve"> MERGEFIELD  transportista  \* MERGEFORMAT </w:instrText>
             </w:r>
             <w:r>
               <w:rPr>
-                <w:sz w:val="22"/>
-                <w:szCs w:val="22"/>
+                <w:rFonts w:ascii="Cambria" w:hAnsi="Cambria" w:cs="Arial"/>
+                <w:sz w:val="24"/>
+                <w:szCs w:val="24"/>
               </w:rPr>
               <w:fldChar w:fldCharType="separate"/>
             </w:r>
             <w:r>
               <w:rPr>
+                <w:rFonts w:ascii="Cambria" w:hAnsi="Cambria" w:cs="Arial"/>
                 <w:noProof/>
-                <w:sz w:val="22"/>
-                <w:szCs w:val="22"/>
+                <w:sz w:val="24"/>
+                <w:szCs w:val="24"/>
               </w:rPr>
               <w:t>«transportista»</w:t>
             </w:r>
             <w:r>
               <w:rPr>
+                <w:rFonts w:ascii="Cambria" w:hAnsi="Cambria" w:cs="Arial"/>
                 <w:noProof/>
-                <w:sz w:val="22"/>
-                <w:szCs w:val="22"/>
+                <w:sz w:val="24"/>
+                <w:szCs w:val="24"/>
               </w:rPr>
               <w:fldChar w:fldCharType="end"/>
             </w:r>
@@ -606,18 +646,20 @@
               </w:tabs>
               <w:ind w:right="-1"/>
               <w:rPr>
+                <w:rFonts w:ascii="Cambria" w:hAnsi="Cambria" w:cs="Arial"/>
                 <w:b/>
                 <w:bCs/>
-                <w:sz w:val="22"/>
-                <w:szCs w:val="22"/>
-              </w:rPr>
-            </w:pPr>
-            <w:r>
-              <w:rPr>
+                <w:sz w:val="24"/>
+                <w:szCs w:val="24"/>
+              </w:rPr>
+            </w:pPr>
+            <w:r>
+              <w:rPr>
+                <w:rFonts w:ascii="Cambria" w:hAnsi="Cambria" w:cs="Arial"/>
                 <w:b/>
                 <w:bCs/>
-                <w:sz w:val="22"/>
-                <w:szCs w:val="22"/>
+                <w:sz w:val="24"/>
+                <w:szCs w:val="24"/>
               </w:rPr>
               <w:t>Conductor</w:t>
             </w:r>
@@ -637,44 +679,50 @@
               </w:tabs>
               <w:ind w:right="-1"/>
               <w:rPr>
-                <w:sz w:val="22"/>
-                <w:szCs w:val="22"/>
-              </w:rPr>
-            </w:pPr>
-            <w:r>
-              <w:rPr>
-                <w:sz w:val="22"/>
-                <w:szCs w:val="22"/>
+                <w:rFonts w:ascii="Cambria" w:hAnsi="Cambria" w:cs="Arial"/>
+                <w:sz w:val="24"/>
+                <w:szCs w:val="24"/>
+              </w:rPr>
+            </w:pPr>
+            <w:r>
+              <w:rPr>
+                <w:rFonts w:ascii="Cambria" w:hAnsi="Cambria" w:cs="Arial"/>
+                <w:sz w:val="24"/>
+                <w:szCs w:val="24"/>
               </w:rPr>
               <w:fldChar w:fldCharType="begin"/>
             </w:r>
             <w:r>
               <w:rPr>
-                <w:sz w:val="22"/>
-                <w:szCs w:val="22"/>
+                <w:rFonts w:ascii="Cambria" w:hAnsi="Cambria" w:cs="Arial"/>
+                <w:sz w:val="24"/>
+                <w:szCs w:val="24"/>
               </w:rPr>
               <w:instrText xml:space="preserve"> MERGEFIELD  nom_conductor  \* MERGEFORMAT </w:instrText>
             </w:r>
             <w:r>
               <w:rPr>
-                <w:sz w:val="22"/>
-                <w:szCs w:val="22"/>
+                <w:rFonts w:ascii="Cambria" w:hAnsi="Cambria" w:cs="Arial"/>
+                <w:sz w:val="24"/>
+                <w:szCs w:val="24"/>
               </w:rPr>
               <w:fldChar w:fldCharType="separate"/>
             </w:r>
             <w:r>
               <w:rPr>
+                <w:rFonts w:ascii="Cambria" w:hAnsi="Cambria" w:cs="Arial"/>
                 <w:noProof/>
-                <w:sz w:val="22"/>
-                <w:szCs w:val="22"/>
+                <w:sz w:val="24"/>
+                <w:szCs w:val="24"/>
               </w:rPr>
               <w:t>«nom_conductor»</w:t>
             </w:r>
             <w:r>
               <w:rPr>
+                <w:rFonts w:ascii="Cambria" w:hAnsi="Cambria" w:cs="Arial"/>
                 <w:noProof/>
-                <w:sz w:val="22"/>
-                <w:szCs w:val="22"/>
+                <w:sz w:val="24"/>
+                <w:szCs w:val="24"/>
               </w:rPr>
               <w:fldChar w:fldCharType="end"/>
             </w:r>
@@ -719,18 +767,20 @@
               </w:tabs>
               <w:ind w:right="-1"/>
               <w:rPr>
+                <w:rFonts w:ascii="Cambria" w:hAnsi="Cambria" w:cs="Arial"/>
                 <w:b/>
                 <w:bCs/>
-                <w:sz w:val="22"/>
-                <w:szCs w:val="22"/>
-              </w:rPr>
-            </w:pPr>
-            <w:r>
-              <w:rPr>
+                <w:sz w:val="24"/>
+                <w:szCs w:val="24"/>
+              </w:rPr>
+            </w:pPr>
+            <w:r>
+              <w:rPr>
+                <w:rFonts w:ascii="Cambria" w:hAnsi="Cambria" w:cs="Arial"/>
                 <w:b/>
                 <w:bCs/>
-                <w:sz w:val="22"/>
-                <w:szCs w:val="22"/>
+                <w:sz w:val="24"/>
+                <w:szCs w:val="24"/>
               </w:rPr>
               <w:t>DNI</w:t>
             </w:r>
@@ -750,44 +800,50 @@
               </w:tabs>
               <w:ind w:right="-1"/>
               <w:rPr>
-                <w:sz w:val="22"/>
-                <w:szCs w:val="22"/>
-              </w:rPr>
-            </w:pPr>
-            <w:r>
-              <w:rPr>
-                <w:sz w:val="22"/>
-                <w:szCs w:val="22"/>
+                <w:rFonts w:ascii="Cambria" w:hAnsi="Cambria" w:cs="Arial"/>
+                <w:sz w:val="24"/>
+                <w:szCs w:val="24"/>
+              </w:rPr>
+            </w:pPr>
+            <w:r>
+              <w:rPr>
+                <w:rFonts w:ascii="Cambria" w:hAnsi="Cambria" w:cs="Arial"/>
+                <w:sz w:val="24"/>
+                <w:szCs w:val="24"/>
               </w:rPr>
               <w:fldChar w:fldCharType="begin"/>
             </w:r>
             <w:r>
               <w:rPr>
-                <w:sz w:val="22"/>
-                <w:szCs w:val="22"/>
+                <w:rFonts w:ascii="Cambria" w:hAnsi="Cambria" w:cs="Arial"/>
+                <w:sz w:val="24"/>
+                <w:szCs w:val="24"/>
               </w:rPr>
               <w:instrText xml:space="preserve"> MERGEFIELD  doc_conductor  \* MERGEFORMAT </w:instrText>
             </w:r>
             <w:r>
               <w:rPr>
-                <w:sz w:val="22"/>
-                <w:szCs w:val="22"/>
+                <w:rFonts w:ascii="Cambria" w:hAnsi="Cambria" w:cs="Arial"/>
+                <w:sz w:val="24"/>
+                <w:szCs w:val="24"/>
               </w:rPr>
               <w:fldChar w:fldCharType="separate"/>
             </w:r>
             <w:r>
               <w:rPr>
+                <w:rFonts w:ascii="Cambria" w:hAnsi="Cambria" w:cs="Arial"/>
                 <w:noProof/>
-                <w:sz w:val="22"/>
-                <w:szCs w:val="22"/>
+                <w:sz w:val="24"/>
+                <w:szCs w:val="24"/>
               </w:rPr>
               <w:t>«doc_conductor»</w:t>
             </w:r>
             <w:r>
               <w:rPr>
+                <w:rFonts w:ascii="Cambria" w:hAnsi="Cambria" w:cs="Arial"/>
                 <w:noProof/>
-                <w:sz w:val="22"/>
-                <w:szCs w:val="22"/>
+                <w:sz w:val="24"/>
+                <w:szCs w:val="24"/>
               </w:rPr>
               <w:fldChar w:fldCharType="end"/>
             </w:r>
@@ -832,18 +888,20 @@
               </w:tabs>
               <w:ind w:right="-1"/>
               <w:rPr>
+                <w:rFonts w:ascii="Cambria" w:hAnsi="Cambria" w:cs="Arial"/>
                 <w:b/>
                 <w:bCs/>
-                <w:sz w:val="22"/>
-                <w:szCs w:val="22"/>
-              </w:rPr>
-            </w:pPr>
-            <w:r>
-              <w:rPr>
+                <w:sz w:val="24"/>
+                <w:szCs w:val="24"/>
+              </w:rPr>
+            </w:pPr>
+            <w:r>
+              <w:rPr>
+                <w:rFonts w:ascii="Cambria" w:hAnsi="Cambria" w:cs="Arial"/>
                 <w:b/>
                 <w:bCs/>
-                <w:sz w:val="22"/>
-                <w:szCs w:val="22"/>
+                <w:sz w:val="24"/>
+                <w:szCs w:val="24"/>
               </w:rPr>
               <w:t>Placa de Vehículo</w:t>
             </w:r>
@@ -863,44 +921,50 @@
               </w:tabs>
               <w:ind w:right="-1"/>
               <w:rPr>
-                <w:sz w:val="22"/>
-                <w:szCs w:val="22"/>
-              </w:rPr>
-            </w:pPr>
-            <w:r>
-              <w:rPr>
-                <w:sz w:val="22"/>
-                <w:szCs w:val="22"/>
+                <w:rFonts w:ascii="Cambria" w:hAnsi="Cambria" w:cs="Arial"/>
+                <w:sz w:val="24"/>
+                <w:szCs w:val="24"/>
+              </w:rPr>
+            </w:pPr>
+            <w:r>
+              <w:rPr>
+                <w:rFonts w:ascii="Cambria" w:hAnsi="Cambria" w:cs="Arial"/>
+                <w:sz w:val="24"/>
+                <w:szCs w:val="24"/>
               </w:rPr>
               <w:fldChar w:fldCharType="begin"/>
             </w:r>
             <w:r>
               <w:rPr>
-                <w:sz w:val="22"/>
-                <w:szCs w:val="22"/>
+                <w:rFonts w:ascii="Cambria" w:hAnsi="Cambria" w:cs="Arial"/>
+                <w:sz w:val="24"/>
+                <w:szCs w:val="24"/>
               </w:rPr>
               <w:instrText xml:space="preserve"> MERGEFIELD  nro_placa  \* MERGEFORMAT </w:instrText>
             </w:r>
             <w:r>
               <w:rPr>
-                <w:sz w:val="22"/>
-                <w:szCs w:val="22"/>
+                <w:rFonts w:ascii="Cambria" w:hAnsi="Cambria" w:cs="Arial"/>
+                <w:sz w:val="24"/>
+                <w:szCs w:val="24"/>
               </w:rPr>
               <w:fldChar w:fldCharType="separate"/>
             </w:r>
             <w:r>
               <w:rPr>
+                <w:rFonts w:ascii="Cambria" w:hAnsi="Cambria" w:cs="Arial"/>
                 <w:noProof/>
-                <w:sz w:val="22"/>
-                <w:szCs w:val="22"/>
+                <w:sz w:val="24"/>
+                <w:szCs w:val="24"/>
               </w:rPr>
               <w:t>«nro_placa»</w:t>
             </w:r>
             <w:r>
               <w:rPr>
+                <w:rFonts w:ascii="Cambria" w:hAnsi="Cambria" w:cs="Arial"/>
                 <w:noProof/>
-                <w:sz w:val="22"/>
-                <w:szCs w:val="22"/>
+                <w:sz w:val="24"/>
+                <w:szCs w:val="24"/>
               </w:rPr>
               <w:fldChar w:fldCharType="end"/>
             </w:r>
@@ -947,15 +1011,16 @@
         <w:tblLook w:val="04A0" w:firstRow="1" w:lastRow="0" w:firstColumn="1" w:lastColumn="0" w:noHBand="0" w:noVBand="1"/>
       </w:tblPr>
       <w:tblGrid>
-        <w:gridCol w:w="2797"/>
-        <w:gridCol w:w="2797"/>
+        <w:gridCol w:w="279"/>
+        <w:gridCol w:w="2551"/>
+        <w:gridCol w:w="2764"/>
         <w:gridCol w:w="2797"/>
         <w:gridCol w:w="2797"/>
       </w:tblGrid>
       <w:tr>
         <w:tc>
           <w:tcPr>
-            <w:tcW w:w="2797" w:type="dxa"/>
+            <w:tcW w:w="279" w:type="dxa"/>
           </w:tcPr>
           <w:p>
             <w:pPr>
@@ -971,26 +1036,40 @@
                 <w:szCs w:val="18"/>
               </w:rPr>
             </w:pPr>
-            <w:r>
-              <w:rPr>
+          </w:p>
+        </w:tc>
+        <w:tc>
+          <w:tcPr>
+            <w:tcW w:w="2551" w:type="dxa"/>
+          </w:tcPr>
+          <w:p>
+            <w:pPr>
+              <w:tabs>
+                <w:tab w:val="left" w:pos="284"/>
+              </w:tabs>
+              <w:ind w:right="-1"/>
+              <w:jc w:val="center"/>
+              <w:rPr>
+                <w:rFonts w:ascii="Arial" w:hAnsi="Arial" w:cs="Arial"/>
                 <w:b/>
                 <w:bCs/>
                 <w:sz w:val="18"/>
                 <w:szCs w:val="18"/>
               </w:rPr>
-              <w:t xml:space="preserve">RUC:  </w:t>
-            </w:r>
-            <w:r>
-              <w:rPr>
+            </w:pPr>
+            <w:r>
+              <w:rPr>
+                <w:rFonts w:ascii="Arial" w:hAnsi="Arial" w:cs="Arial"/>
                 <w:b/>
                 <w:bCs/>
                 <w:sz w:val="18"/>
                 <w:szCs w:val="18"/>
               </w:rPr>
-              <w:t xml:space="preserve"> </w:t>
-            </w:r>
-            <w:r>
-              <w:rPr>
+              <w:t xml:space="preserve">RUC:   </w:t>
+            </w:r>
+            <w:r>
+              <w:rPr>
+                <w:rFonts w:ascii="Arial" w:hAnsi="Arial" w:cs="Arial"/>
                 <w:b/>
                 <w:bCs/>
                 <w:sz w:val="18"/>
@@ -1000,6 +1079,7 @@
             </w:r>
             <w:r>
               <w:rPr>
+                <w:rFonts w:ascii="Arial" w:hAnsi="Arial" w:cs="Arial"/>
                 <w:b/>
                 <w:bCs/>
                 <w:sz w:val="18"/>
@@ -1009,6 +1089,7 @@
             </w:r>
             <w:r>
               <w:rPr>
+                <w:rFonts w:ascii="Arial" w:hAnsi="Arial" w:cs="Arial"/>
                 <w:b/>
                 <w:bCs/>
                 <w:sz w:val="18"/>
@@ -1018,6 +1099,7 @@
             </w:r>
             <w:r>
               <w:rPr>
+                <w:rFonts w:ascii="Arial" w:hAnsi="Arial" w:cs="Arial"/>
                 <w:b/>
                 <w:bCs/>
                 <w:noProof/>
@@ -1028,6 +1110,7 @@
             </w:r>
             <w:r>
               <w:rPr>
+                <w:rFonts w:ascii="Arial" w:hAnsi="Arial" w:cs="Arial"/>
                 <w:b/>
                 <w:bCs/>
                 <w:sz w:val="18"/>
@@ -1039,7 +1122,7 @@
         </w:tc>
         <w:tc>
           <w:tcPr>
-            <w:tcW w:w="2797" w:type="dxa"/>
+            <w:tcW w:w="2764" w:type="dxa"/>
           </w:tcPr>
           <w:p>
             <w:pPr>
@@ -1108,13 +1191,13 @@
         <mc:AlternateContent>
           <mc:Choice Requires="wps">
             <w:drawing>
-              <wp:anchor distT="0" distB="0" distL="114300" distR="114300" simplePos="0" relativeHeight="251659264" behindDoc="0" locked="0" layoutInCell="1" allowOverlap="1" wp14:anchorId="36262E0B" wp14:editId="713A24B7">
+              <wp:anchor distT="0" distB="0" distL="114300" distR="114300" simplePos="0" relativeHeight="251659264" behindDoc="0" locked="0" layoutInCell="1" allowOverlap="1" wp14:anchorId="36262E0B" wp14:editId="490BCFD5">
                 <wp:simplePos x="0" y="0"/>
                 <wp:positionH relativeFrom="margin">
-                  <wp:posOffset>-43292</wp:posOffset>
+                  <wp:posOffset>-134854</wp:posOffset>
                 </wp:positionH>
                 <wp:positionV relativeFrom="paragraph">
-                  <wp:posOffset>-711835</wp:posOffset>
+                  <wp:posOffset>-879943</wp:posOffset>
                 </wp:positionV>
                 <wp:extent cx="1995054" cy="694944"/>
                 <wp:effectExtent l="0" t="0" r="0" b="0"/>
@@ -1214,7 +1297,7 @@
           </mc:Choice>
           <mc:Fallback>
             <w:pict>
-              <v:roundrect w14:anchorId="36262E0B" id="Rectángulo: esquinas redondeadas 782399144" o:spid="_x0000_s1026" style="position:absolute;margin-left:-3.4pt;margin-top:-56.05pt;width:157.1pt;height:54.7pt;z-index:251659264;visibility:visible;mso-wrap-style:square;mso-width-percent:0;mso-height-percent:0;mso-wrap-distance-left:9pt;mso-wrap-distance-top:0;mso-wrap-distance-right:9pt;mso-wrap-distance-bottom:0;mso-position-horizontal:absolute;mso-position-horizontal-relative:margin;mso-position-vertical:absolute;mso-position-vertical-relative:text;mso-width-percent:0;mso-height-percent:0;mso-width-relative:margin;mso-height-relative:margin;v-text-anchor:top" arcsize="10923f" o:gfxdata="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" filled="f" stroked="f">
+              <v:roundrect w14:anchorId="36262E0B" id="Rectángulo: esquinas redondeadas 782399144" o:spid="_x0000_s1026" style="position:absolute;margin-left:-10.6pt;margin-top:-69.3pt;width:157.1pt;height:54.7pt;z-index:251659264;visibility:visible;mso-wrap-style:square;mso-width-percent:0;mso-height-percent:0;mso-wrap-distance-left:9pt;mso-wrap-distance-top:0;mso-wrap-distance-right:9pt;mso-wrap-distance-bottom:0;mso-position-horizontal:absolute;mso-position-horizontal-relative:margin;mso-position-vertical:absolute;mso-position-vertical-relative:text;mso-width-percent:0;mso-height-percent:0;mso-width-relative:margin;mso-height-relative:margin;v-text-anchor:top" arcsize="10923f" o:gfxdata="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" filled="f" stroked="f">
                 <v:stroke joinstyle="miter"/>
                 <v:textbox>
                   <w:txbxContent>
@@ -1393,14 +1476,16 @@
               </w:tabs>
               <w:ind w:right="-1"/>
               <w:rPr>
+                <w:rFonts w:ascii="Cambria" w:hAnsi="Cambria" w:cs="Arial"/>
                 <w:sz w:val="22"/>
                 <w:szCs w:val="22"/>
               </w:rPr>
             </w:pPr>
             <w:r>
               <w:rPr>
-                <w:sz w:val="22"/>
-                <w:szCs w:val="22"/>
+                <w:rFonts w:ascii="Cambria" w:hAnsi="Cambria" w:cs="Arial"/>
+                <w:sz w:val="24"/>
+                <w:szCs w:val="24"/>
               </w:rPr>
               <w:t>Por medio de la presente, doy conformidad al proceso de descarga de lotes y sacos transportados correspondientes al vehículo detallado en el presente documento, dejando constancia de la recepción conforme de la carga según el detalle consignado a continuación.</w:t>
             </w:r>
@@ -1419,26 +1504,27 @@
     <w:tbl>
       <w:tblPr>
         <w:tblStyle w:val="Tablaconcuadrcula"/>
-        <w:tblW w:w="0" w:type="auto"/>
+        <w:tblW w:w="11624" w:type="dxa"/>
+        <w:tblInd w:w="-147" w:type="dxa"/>
         <w:tblLayout w:type="fixed"/>
         <w:tblLook w:val="04A0" w:firstRow="1" w:lastRow="0" w:firstColumn="1" w:lastColumn="0" w:noHBand="0" w:noVBand="1"/>
       </w:tblPr>
       <w:tblGrid>
-        <w:gridCol w:w="696"/>
-        <w:gridCol w:w="1709"/>
+        <w:gridCol w:w="851"/>
+        <w:gridCol w:w="1134"/>
         <w:gridCol w:w="1418"/>
-        <w:gridCol w:w="1417"/>
-        <w:gridCol w:w="709"/>
+        <w:gridCol w:w="1275"/>
+        <w:gridCol w:w="851"/>
+        <w:gridCol w:w="1979"/>
+        <w:gridCol w:w="1139"/>
+        <w:gridCol w:w="1418"/>
         <w:gridCol w:w="1559"/>
-        <w:gridCol w:w="992"/>
-        <w:gridCol w:w="1418"/>
-        <w:gridCol w:w="1270"/>
       </w:tblGrid>
       <w:tr>
         <w:tc>
           <w:tcPr>
-            <w:tcW w:w="696" w:type="dxa"/>
-            <w:shd w:val="clear" w:color="auto" w:fill="63A4F7"/>
+            <w:tcW w:w="851" w:type="dxa"/>
+            <w:shd w:val="clear" w:color="auto" w:fill="9BC2E6"/>
           </w:tcPr>
           <w:p>
             <w:pPr>
@@ -1448,15 +1534,17 @@
               <w:ind w:right="-1"/>
               <w:jc w:val="center"/>
               <w:rPr>
-                <w:sz w:val="16"/>
-                <w:szCs w:val="16"/>
+                <w:rFonts w:ascii="Calibri" w:hAnsi="Calibri" w:cs="Calibri"/>
+                <w:sz w:val="18"/>
+                <w:szCs w:val="18"/>
               </w:rPr>
             </w:pPr>
             <w:proofErr w:type="spellStart"/>
             <w:r>
               <w:rPr>
-                <w:sz w:val="16"/>
-                <w:szCs w:val="16"/>
+                <w:rFonts w:ascii="Calibri" w:hAnsi="Calibri" w:cs="Calibri"/>
+                <w:sz w:val="18"/>
+                <w:szCs w:val="18"/>
               </w:rPr>
               <w:t>Item</w:t>
             </w:r>
@@ -1465,8 +1553,8 @@
         </w:tc>
         <w:tc>
           <w:tcPr>
-            <w:tcW w:w="1709" w:type="dxa"/>
-            <w:shd w:val="clear" w:color="auto" w:fill="63A4F7"/>
+            <w:tcW w:w="1134" w:type="dxa"/>
+            <w:shd w:val="clear" w:color="auto" w:fill="9BC2E6"/>
           </w:tcPr>
           <w:p>
             <w:pPr>
@@ -1476,14 +1564,16 @@
               <w:ind w:right="-1"/>
               <w:jc w:val="center"/>
               <w:rPr>
-                <w:sz w:val="16"/>
-                <w:szCs w:val="16"/>
-              </w:rPr>
-            </w:pPr>
-            <w:r>
-              <w:rPr>
-                <w:sz w:val="16"/>
-                <w:szCs w:val="16"/>
+                <w:rFonts w:ascii="Calibri" w:hAnsi="Calibri" w:cs="Calibri"/>
+                <w:sz w:val="18"/>
+                <w:szCs w:val="18"/>
+              </w:rPr>
+            </w:pPr>
+            <w:r>
+              <w:rPr>
+                <w:rFonts w:ascii="Calibri" w:hAnsi="Calibri" w:cs="Calibri"/>
+                <w:sz w:val="18"/>
+                <w:szCs w:val="18"/>
               </w:rPr>
               <w:t>Código de Lote</w:t>
             </w:r>
@@ -1492,7 +1582,7 @@
         <w:tc>
           <w:tcPr>
             <w:tcW w:w="1418" w:type="dxa"/>
-            <w:shd w:val="clear" w:color="auto" w:fill="63A4F7"/>
+            <w:shd w:val="clear" w:color="auto" w:fill="9BC2E6"/>
           </w:tcPr>
           <w:p>
             <w:pPr>
@@ -1502,14 +1592,16 @@
               <w:ind w:right="-1"/>
               <w:jc w:val="center"/>
               <w:rPr>
-                <w:sz w:val="16"/>
-                <w:szCs w:val="16"/>
-              </w:rPr>
-            </w:pPr>
-            <w:r>
-              <w:rPr>
-                <w:sz w:val="16"/>
-                <w:szCs w:val="16"/>
+                <w:rFonts w:ascii="Calibri" w:hAnsi="Calibri" w:cs="Calibri"/>
+                <w:sz w:val="18"/>
+                <w:szCs w:val="18"/>
+              </w:rPr>
+            </w:pPr>
+            <w:r>
+              <w:rPr>
+                <w:rFonts w:ascii="Calibri" w:hAnsi="Calibri" w:cs="Calibri"/>
+                <w:sz w:val="18"/>
+                <w:szCs w:val="18"/>
               </w:rPr>
               <w:t>Cantidad de sacos según guía o reporte</w:t>
             </w:r>
@@ -1517,8 +1609,8 @@
         </w:tc>
         <w:tc>
           <w:tcPr>
-            <w:tcW w:w="1417" w:type="dxa"/>
-            <w:shd w:val="clear" w:color="auto" w:fill="63A4F7"/>
+            <w:tcW w:w="1275" w:type="dxa"/>
+            <w:shd w:val="clear" w:color="auto" w:fill="9BC2E6"/>
           </w:tcPr>
           <w:p>
             <w:pPr>
@@ -1528,14 +1620,16 @@
               <w:ind w:right="-1"/>
               <w:jc w:val="center"/>
               <w:rPr>
-                <w:sz w:val="16"/>
-                <w:szCs w:val="16"/>
-              </w:rPr>
-            </w:pPr>
-            <w:r>
-              <w:rPr>
-                <w:sz w:val="16"/>
-                <w:szCs w:val="16"/>
+                <w:rFonts w:ascii="Calibri" w:hAnsi="Calibri" w:cs="Calibri"/>
+                <w:sz w:val="18"/>
+                <w:szCs w:val="18"/>
+              </w:rPr>
+            </w:pPr>
+            <w:r>
+              <w:rPr>
+                <w:rFonts w:ascii="Calibri" w:hAnsi="Calibri" w:cs="Calibri"/>
+                <w:sz w:val="18"/>
+                <w:szCs w:val="18"/>
               </w:rPr>
               <w:t>Cantidad de sacos descargados</w:t>
             </w:r>
@@ -1543,8 +1637,8 @@
         </w:tc>
         <w:tc>
           <w:tcPr>
-            <w:tcW w:w="709" w:type="dxa"/>
-            <w:shd w:val="clear" w:color="auto" w:fill="63A4F7"/>
+            <w:tcW w:w="851" w:type="dxa"/>
+            <w:shd w:val="clear" w:color="auto" w:fill="9BC2E6"/>
           </w:tcPr>
           <w:p>
             <w:pPr>
@@ -1554,14 +1648,16 @@
               <w:ind w:right="-1"/>
               <w:jc w:val="center"/>
               <w:rPr>
-                <w:sz w:val="16"/>
-                <w:szCs w:val="16"/>
-              </w:rPr>
-            </w:pPr>
-            <w:r>
-              <w:rPr>
-                <w:sz w:val="16"/>
-                <w:szCs w:val="16"/>
+                <w:rFonts w:ascii="Calibri" w:hAnsi="Calibri" w:cs="Calibri"/>
+                <w:sz w:val="18"/>
+                <w:szCs w:val="18"/>
+              </w:rPr>
+            </w:pPr>
+            <w:r>
+              <w:rPr>
+                <w:rFonts w:ascii="Calibri" w:hAnsi="Calibri" w:cs="Calibri"/>
+                <w:sz w:val="18"/>
+                <w:szCs w:val="18"/>
               </w:rPr>
               <w:t>Peso (TMH)</w:t>
             </w:r>
@@ -1569,8 +1665,92 @@
         </w:tc>
         <w:tc>
           <w:tcPr>
+            <w:tcW w:w="1979" w:type="dxa"/>
+            <w:shd w:val="clear" w:color="auto" w:fill="9BC2E6"/>
+          </w:tcPr>
+          <w:p>
+            <w:pPr>
+              <w:tabs>
+                <w:tab w:val="left" w:pos="284"/>
+              </w:tabs>
+              <w:ind w:right="-1"/>
+              <w:jc w:val="center"/>
+              <w:rPr>
+                <w:rFonts w:ascii="Calibri" w:hAnsi="Calibri" w:cs="Calibri"/>
+                <w:sz w:val="18"/>
+                <w:szCs w:val="18"/>
+              </w:rPr>
+            </w:pPr>
+            <w:r>
+              <w:rPr>
+                <w:rFonts w:ascii="Calibri" w:hAnsi="Calibri" w:cs="Calibri"/>
+                <w:sz w:val="18"/>
+                <w:szCs w:val="18"/>
+              </w:rPr>
+              <w:t>Razón Social</w:t>
+            </w:r>
+          </w:p>
+        </w:tc>
+        <w:tc>
+          <w:tcPr>
+            <w:tcW w:w="1139" w:type="dxa"/>
+            <w:shd w:val="clear" w:color="auto" w:fill="9BC2E6"/>
+          </w:tcPr>
+          <w:p>
+            <w:pPr>
+              <w:tabs>
+                <w:tab w:val="left" w:pos="284"/>
+              </w:tabs>
+              <w:ind w:right="-1"/>
+              <w:jc w:val="center"/>
+              <w:rPr>
+                <w:rFonts w:ascii="Calibri" w:hAnsi="Calibri" w:cs="Calibri"/>
+                <w:sz w:val="18"/>
+                <w:szCs w:val="18"/>
+              </w:rPr>
+            </w:pPr>
+            <w:r>
+              <w:rPr>
+                <w:rFonts w:ascii="Calibri" w:hAnsi="Calibri" w:cs="Calibri"/>
+                <w:sz w:val="18"/>
+                <w:szCs w:val="18"/>
+              </w:rPr>
+              <w:t>Guía de Remisión</w:t>
+            </w:r>
+          </w:p>
+        </w:tc>
+        <w:tc>
+          <w:tcPr>
+            <w:tcW w:w="1418" w:type="dxa"/>
+            <w:shd w:val="clear" w:color="auto" w:fill="9BC2E6"/>
+          </w:tcPr>
+          <w:p>
+            <w:pPr>
+              <w:tabs>
+                <w:tab w:val="left" w:pos="284"/>
+              </w:tabs>
+              <w:ind w:right="-1"/>
+              <w:jc w:val="center"/>
+              <w:rPr>
+                <w:rFonts w:ascii="Calibri" w:hAnsi="Calibri" w:cs="Calibri"/>
+                <w:sz w:val="18"/>
+                <w:szCs w:val="18"/>
+              </w:rPr>
+            </w:pPr>
+            <w:r>
+              <w:rPr>
+                <w:rFonts w:ascii="Calibri" w:hAnsi="Calibri" w:cs="Calibri"/>
+                <w:sz w:val="18"/>
+                <w:szCs w:val="18"/>
+              </w:rPr>
+              <w:t>Guia de Transportista</w:t>
+            </w:r>
+          </w:p>
+        </w:tc>
+        <w:tc>
+          <w:tcPr>
             <w:tcW w:w="1559" w:type="dxa"/>
-            <w:shd w:val="clear" w:color="auto" w:fill="63A4F7"/>
+            <w:shd w:val="clear" w:color="auto" w:fill="9BC2E6"/>
           </w:tcPr>
           <w:p>
             <w:pPr>
@@ -1580,92 +1760,16 @@
               <w:ind w:right="-1"/>
               <w:jc w:val="center"/>
               <w:rPr>
-                <w:sz w:val="16"/>
-                <w:szCs w:val="16"/>
-              </w:rPr>
-            </w:pPr>
-            <w:r>
-              <w:rPr>
-                <w:sz w:val="16"/>
-                <w:szCs w:val="16"/>
-              </w:rPr>
-              <w:t>Razón Social</w:t>
-            </w:r>
-          </w:p>
-        </w:tc>
-        <w:tc>
-          <w:tcPr>
-            <w:tcW w:w="992" w:type="dxa"/>
-            <w:shd w:val="clear" w:color="auto" w:fill="63A4F7"/>
-          </w:tcPr>
-          <w:p>
-            <w:pPr>
-              <w:tabs>
-                <w:tab w:val="left" w:pos="284"/>
-              </w:tabs>
-              <w:ind w:right="-1"/>
-              <w:jc w:val="center"/>
-              <w:rPr>
-                <w:sz w:val="16"/>
-                <w:szCs w:val="16"/>
-              </w:rPr>
-            </w:pPr>
-            <w:r>
-              <w:rPr>
-                <w:sz w:val="16"/>
-                <w:szCs w:val="16"/>
-              </w:rPr>
-              <w:t>Guía de Remisión</w:t>
-            </w:r>
-          </w:p>
-        </w:tc>
-        <w:tc>
-          <w:tcPr>
-            <w:tcW w:w="1418" w:type="dxa"/>
-            <w:shd w:val="clear" w:color="auto" w:fill="63A4F7"/>
-          </w:tcPr>
-          <w:p>
-            <w:pPr>
-              <w:tabs>
-                <w:tab w:val="left" w:pos="284"/>
-              </w:tabs>
-              <w:ind w:right="-1"/>
-              <w:jc w:val="center"/>
-              <w:rPr>
-                <w:sz w:val="16"/>
-                <w:szCs w:val="16"/>
-              </w:rPr>
-            </w:pPr>
-            <w:r>
-              <w:rPr>
-                <w:sz w:val="16"/>
-                <w:szCs w:val="16"/>
-              </w:rPr>
-              <w:t>Guia de Transportista</w:t>
-            </w:r>
-          </w:p>
-        </w:tc>
-        <w:tc>
-          <w:tcPr>
-            <w:tcW w:w="1270" w:type="dxa"/>
-            <w:shd w:val="clear" w:color="auto" w:fill="63A4F7"/>
-          </w:tcPr>
-          <w:p>
-            <w:pPr>
-              <w:tabs>
-                <w:tab w:val="left" w:pos="284"/>
-              </w:tabs>
-              <w:ind w:right="-1"/>
-              <w:jc w:val="center"/>
-              <w:rPr>
-                <w:sz w:val="16"/>
-                <w:szCs w:val="16"/>
-              </w:rPr>
-            </w:pPr>
-            <w:r>
-              <w:rPr>
-                <w:sz w:val="16"/>
-                <w:szCs w:val="16"/>
+                <w:rFonts w:ascii="Calibri" w:hAnsi="Calibri" w:cs="Calibri"/>
+                <w:sz w:val="18"/>
+                <w:szCs w:val="18"/>
+              </w:rPr>
+            </w:pPr>
+            <w:r>
+              <w:rPr>
+                <w:rFonts w:ascii="Calibri" w:hAnsi="Calibri" w:cs="Calibri"/>
+                <w:sz w:val="18"/>
+                <w:szCs w:val="18"/>
               </w:rPr>
               <w:t>Observación</w:t>
             </w:r>
@@ -1677,6 +1781,7 @@
       <w:pPr>
         <w:spacing w:before="0" w:after="0"/>
         <w:rPr>
+          <w:rFonts w:ascii="Calibri" w:hAnsi="Calibri" w:cs="Calibri"/>
           <w:b/>
           <w:caps/>
           <w:noProof/>
@@ -1686,6 +1791,7 @@
       </w:pPr>
       <w:r>
         <w:rPr>
+          <w:rFonts w:ascii="Calibri" w:hAnsi="Calibri" w:cs="Calibri"/>
           <w:b/>
           <w:caps/>
           <w:noProof/>
@@ -1696,6 +1802,7 @@
       </w:r>
       <w:r>
         <w:rPr>
+          <w:rFonts w:ascii="Calibri" w:hAnsi="Calibri" w:cs="Calibri"/>
           <w:b/>
           <w:caps/>
           <w:noProof/>
@@ -1706,6 +1813,7 @@
       </w:r>
       <w:r>
         <w:rPr>
+          <w:rFonts w:ascii="Calibri" w:hAnsi="Calibri" w:cs="Calibri"/>
           <w:b/>
           <w:caps/>
           <w:noProof/>
@@ -1716,6 +1824,7 @@
       </w:r>
       <w:r>
         <w:rPr>
+          <w:rFonts w:ascii="Calibri" w:hAnsi="Calibri" w:cs="Calibri"/>
           <w:b/>
           <w:noProof/>
           <w:sz w:val="2"/>
@@ -1725,6 +1834,7 @@
       </w:r>
       <w:r>
         <w:rPr>
+          <w:rFonts w:ascii="Calibri" w:hAnsi="Calibri" w:cs="Calibri"/>
           <w:b/>
           <w:caps/>
           <w:noProof/>
@@ -1737,20 +1847,21 @@
     <w:tbl>
       <w:tblPr>
         <w:tblStyle w:val="Tablaconcuadrcula"/>
-        <w:tblW w:w="0" w:type="auto"/>
+        <w:tblW w:w="11624" w:type="dxa"/>
+        <w:tblInd w:w="-147" w:type="dxa"/>
         <w:tblLayout w:type="fixed"/>
         <w:tblLook w:val="04A0" w:firstRow="1" w:lastRow="0" w:firstColumn="1" w:lastColumn="0" w:noHBand="0" w:noVBand="1"/>
       </w:tblPr>
       <w:tblGrid>
-        <w:gridCol w:w="704"/>
-        <w:gridCol w:w="1701"/>
+        <w:gridCol w:w="851"/>
+        <w:gridCol w:w="1134"/>
         <w:gridCol w:w="1418"/>
-        <w:gridCol w:w="1417"/>
-        <w:gridCol w:w="709"/>
+        <w:gridCol w:w="1275"/>
+        <w:gridCol w:w="851"/>
+        <w:gridCol w:w="1979"/>
+        <w:gridCol w:w="1139"/>
+        <w:gridCol w:w="1418"/>
         <w:gridCol w:w="1559"/>
-        <w:gridCol w:w="992"/>
-        <w:gridCol w:w="1418"/>
-        <w:gridCol w:w="1270"/>
       </w:tblGrid>
       <w:tr>
         <w:trPr>
@@ -1758,52 +1869,58 @@
         </w:trPr>
         <w:tc>
           <w:tcPr>
-            <w:tcW w:w="704" w:type="dxa"/>
-          </w:tcPr>
-          <w:p>
-            <w:pPr>
-              <w:tabs>
-                <w:tab w:val="left" w:pos="284"/>
-              </w:tabs>
-              <w:ind w:right="-1"/>
-              <w:rPr>
-                <w:sz w:val="16"/>
-                <w:szCs w:val="16"/>
-              </w:rPr>
-            </w:pPr>
-            <w:r>
-              <w:rPr>
-                <w:sz w:val="16"/>
-                <w:szCs w:val="16"/>
+            <w:tcW w:w="851" w:type="dxa"/>
+          </w:tcPr>
+          <w:p>
+            <w:pPr>
+              <w:tabs>
+                <w:tab w:val="left" w:pos="284"/>
+              </w:tabs>
+              <w:ind w:right="-1"/>
+              <w:rPr>
+                <w:rFonts w:ascii="Calibri" w:hAnsi="Calibri" w:cs="Calibri"/>
+                <w:sz w:val="18"/>
+                <w:szCs w:val="18"/>
+              </w:rPr>
+            </w:pPr>
+            <w:r>
+              <w:rPr>
+                <w:rFonts w:ascii="Calibri" w:hAnsi="Calibri" w:cs="Calibri"/>
+                <w:sz w:val="18"/>
+                <w:szCs w:val="18"/>
               </w:rPr>
               <w:fldChar w:fldCharType="begin"/>
             </w:r>
             <w:r>
               <w:rPr>
-                <w:sz w:val="16"/>
-                <w:szCs w:val="16"/>
+                <w:rFonts w:ascii="Calibri" w:hAnsi="Calibri" w:cs="Calibri"/>
+                <w:sz w:val="18"/>
+                <w:szCs w:val="18"/>
               </w:rPr>
               <w:instrText xml:space="preserve"> MERGEFIELD  item  \* MERGEFORMAT </w:instrText>
             </w:r>
             <w:r>
               <w:rPr>
-                <w:sz w:val="16"/>
-                <w:szCs w:val="16"/>
+                <w:rFonts w:ascii="Calibri" w:hAnsi="Calibri" w:cs="Calibri"/>
+                <w:sz w:val="18"/>
+                <w:szCs w:val="18"/>
               </w:rPr>
               <w:fldChar w:fldCharType="separate"/>
             </w:r>
             <w:r>
               <w:rPr>
+                <w:rFonts w:ascii="Calibri" w:hAnsi="Calibri" w:cs="Calibri"/>
                 <w:noProof/>
-                <w:sz w:val="16"/>
-                <w:szCs w:val="16"/>
+                <w:sz w:val="18"/>
+                <w:szCs w:val="18"/>
               </w:rPr>
               <w:t>«item»</w:t>
             </w:r>
             <w:r>
               <w:rPr>
-                <w:sz w:val="16"/>
-                <w:szCs w:val="16"/>
+                <w:rFonts w:ascii="Calibri" w:hAnsi="Calibri" w:cs="Calibri"/>
+                <w:sz w:val="18"/>
+                <w:szCs w:val="18"/>
               </w:rPr>
               <w:fldChar w:fldCharType="end"/>
             </w:r>
@@ -1811,53 +1928,59 @@
         </w:tc>
         <w:tc>
           <w:tcPr>
-            <w:tcW w:w="1701" w:type="dxa"/>
-          </w:tcPr>
-          <w:p>
-            <w:pPr>
-              <w:tabs>
-                <w:tab w:val="left" w:pos="284"/>
-              </w:tabs>
-              <w:ind w:right="-1"/>
-              <w:rPr>
-                <w:sz w:val="16"/>
-                <w:szCs w:val="16"/>
-              </w:rPr>
-            </w:pPr>
-            <w:r>
-              <w:rPr>
-                <w:sz w:val="16"/>
-                <w:szCs w:val="16"/>
+            <w:tcW w:w="1134" w:type="dxa"/>
+          </w:tcPr>
+          <w:p>
+            <w:pPr>
+              <w:tabs>
+                <w:tab w:val="left" w:pos="284"/>
+              </w:tabs>
+              <w:ind w:right="-1"/>
+              <w:rPr>
+                <w:rFonts w:ascii="Calibri" w:hAnsi="Calibri" w:cs="Calibri"/>
+                <w:sz w:val="18"/>
+                <w:szCs w:val="18"/>
+              </w:rPr>
+            </w:pPr>
+            <w:r>
+              <w:rPr>
+                <w:rFonts w:ascii="Calibri" w:hAnsi="Calibri" w:cs="Calibri"/>
+                <w:sz w:val="18"/>
+                <w:szCs w:val="18"/>
               </w:rPr>
               <w:fldChar w:fldCharType="begin"/>
             </w:r>
             <w:r>
               <w:rPr>
-                <w:sz w:val="16"/>
-                <w:szCs w:val="16"/>
+                <w:rFonts w:ascii="Calibri" w:hAnsi="Calibri" w:cs="Calibri"/>
+                <w:sz w:val="18"/>
+                <w:szCs w:val="18"/>
               </w:rPr>
               <w:instrText xml:space="preserve"> MERGEFIELD  nro_lote  \* MERGEFORMAT </w:instrText>
             </w:r>
             <w:r>
               <w:rPr>
-                <w:sz w:val="16"/>
-                <w:szCs w:val="16"/>
+                <w:rFonts w:ascii="Calibri" w:hAnsi="Calibri" w:cs="Calibri"/>
+                <w:sz w:val="18"/>
+                <w:szCs w:val="18"/>
               </w:rPr>
               <w:fldChar w:fldCharType="separate"/>
             </w:r>
             <w:r>
               <w:rPr>
+                <w:rFonts w:ascii="Calibri" w:hAnsi="Calibri" w:cs="Calibri"/>
                 <w:noProof/>
-                <w:sz w:val="16"/>
-                <w:szCs w:val="16"/>
+                <w:sz w:val="18"/>
+                <w:szCs w:val="18"/>
               </w:rPr>
               <w:t>«nro_lote»</w:t>
             </w:r>
             <w:r>
               <w:rPr>
+                <w:rFonts w:ascii="Calibri" w:hAnsi="Calibri" w:cs="Calibri"/>
                 <w:noProof/>
-                <w:sz w:val="16"/>
-                <w:szCs w:val="16"/>
+                <w:sz w:val="18"/>
+                <w:szCs w:val="18"/>
               </w:rPr>
               <w:fldChar w:fldCharType="end"/>
             </w:r>
@@ -1874,43 +1997,49 @@
               </w:tabs>
               <w:ind w:right="-1"/>
               <w:rPr>
-                <w:sz w:val="16"/>
-                <w:szCs w:val="16"/>
-              </w:rPr>
-            </w:pPr>
-            <w:r>
-              <w:rPr>
-                <w:sz w:val="16"/>
-                <w:szCs w:val="16"/>
+                <w:rFonts w:ascii="Calibri" w:hAnsi="Calibri" w:cs="Calibri"/>
+                <w:sz w:val="18"/>
+                <w:szCs w:val="18"/>
+              </w:rPr>
+            </w:pPr>
+            <w:r>
+              <w:rPr>
+                <w:rFonts w:ascii="Calibri" w:hAnsi="Calibri" w:cs="Calibri"/>
+                <w:sz w:val="18"/>
+                <w:szCs w:val="18"/>
               </w:rPr>
               <w:fldChar w:fldCharType="begin"/>
             </w:r>
             <w:r>
               <w:rPr>
-                <w:sz w:val="16"/>
-                <w:szCs w:val="16"/>
+                <w:rFonts w:ascii="Calibri" w:hAnsi="Calibri" w:cs="Calibri"/>
+                <w:sz w:val="18"/>
+                <w:szCs w:val="18"/>
               </w:rPr>
               <w:instrText xml:space="preserve"> MERGEFIELD  cant_minero  \* MERGEFORMAT </w:instrText>
             </w:r>
             <w:r>
               <w:rPr>
-                <w:sz w:val="16"/>
-                <w:szCs w:val="16"/>
+                <w:rFonts w:ascii="Calibri" w:hAnsi="Calibri" w:cs="Calibri"/>
+                <w:sz w:val="18"/>
+                <w:szCs w:val="18"/>
               </w:rPr>
               <w:fldChar w:fldCharType="separate"/>
             </w:r>
             <w:r>
               <w:rPr>
+                <w:rFonts w:ascii="Calibri" w:hAnsi="Calibri" w:cs="Calibri"/>
                 <w:noProof/>
-                <w:sz w:val="16"/>
-                <w:szCs w:val="16"/>
+                <w:sz w:val="18"/>
+                <w:szCs w:val="18"/>
               </w:rPr>
               <w:t>«cant_minero»</w:t>
             </w:r>
             <w:r>
               <w:rPr>
-                <w:sz w:val="16"/>
-                <w:szCs w:val="16"/>
+                <w:rFonts w:ascii="Calibri" w:hAnsi="Calibri" w:cs="Calibri"/>
+                <w:sz w:val="18"/>
+                <w:szCs w:val="18"/>
               </w:rPr>
               <w:fldChar w:fldCharType="end"/>
             </w:r>
@@ -1918,52 +2047,58 @@
         </w:tc>
         <w:tc>
           <w:tcPr>
-            <w:tcW w:w="1417" w:type="dxa"/>
-          </w:tcPr>
-          <w:p>
-            <w:pPr>
-              <w:tabs>
-                <w:tab w:val="left" w:pos="284"/>
-              </w:tabs>
-              <w:ind w:right="-1"/>
-              <w:rPr>
-                <w:sz w:val="16"/>
-                <w:szCs w:val="16"/>
-              </w:rPr>
-            </w:pPr>
-            <w:r>
-              <w:rPr>
-                <w:sz w:val="16"/>
-                <w:szCs w:val="16"/>
+            <w:tcW w:w="1275" w:type="dxa"/>
+          </w:tcPr>
+          <w:p>
+            <w:pPr>
+              <w:tabs>
+                <w:tab w:val="left" w:pos="284"/>
+              </w:tabs>
+              <w:ind w:right="-1"/>
+              <w:rPr>
+                <w:rFonts w:ascii="Calibri" w:hAnsi="Calibri" w:cs="Calibri"/>
+                <w:sz w:val="18"/>
+                <w:szCs w:val="18"/>
+              </w:rPr>
+            </w:pPr>
+            <w:r>
+              <w:rPr>
+                <w:rFonts w:ascii="Calibri" w:hAnsi="Calibri" w:cs="Calibri"/>
+                <w:sz w:val="18"/>
+                <w:szCs w:val="18"/>
               </w:rPr>
               <w:fldChar w:fldCharType="begin"/>
             </w:r>
             <w:r>
               <w:rPr>
-                <w:sz w:val="16"/>
-                <w:szCs w:val="16"/>
+                <w:rFonts w:ascii="Calibri" w:hAnsi="Calibri" w:cs="Calibri"/>
+                <w:sz w:val="18"/>
+                <w:szCs w:val="18"/>
               </w:rPr>
               <w:instrText xml:space="preserve"> MERGEFIELD  cant  \* MERGEFORMAT </w:instrText>
             </w:r>
             <w:r>
               <w:rPr>
-                <w:sz w:val="16"/>
-                <w:szCs w:val="16"/>
+                <w:rFonts w:ascii="Calibri" w:hAnsi="Calibri" w:cs="Calibri"/>
+                <w:sz w:val="18"/>
+                <w:szCs w:val="18"/>
               </w:rPr>
               <w:fldChar w:fldCharType="separate"/>
             </w:r>
             <w:r>
               <w:rPr>
+                <w:rFonts w:ascii="Calibri" w:hAnsi="Calibri" w:cs="Calibri"/>
                 <w:noProof/>
-                <w:sz w:val="16"/>
-                <w:szCs w:val="16"/>
+                <w:sz w:val="18"/>
+                <w:szCs w:val="18"/>
               </w:rPr>
               <w:t>«cant»</w:t>
             </w:r>
             <w:r>
               <w:rPr>
-                <w:sz w:val="16"/>
-                <w:szCs w:val="16"/>
+                <w:rFonts w:ascii="Calibri" w:hAnsi="Calibri" w:cs="Calibri"/>
+                <w:sz w:val="18"/>
+                <w:szCs w:val="18"/>
               </w:rPr>
               <w:fldChar w:fldCharType="end"/>
             </w:r>
@@ -1971,53 +2106,59 @@
         </w:tc>
         <w:tc>
           <w:tcPr>
-            <w:tcW w:w="709" w:type="dxa"/>
-          </w:tcPr>
-          <w:p>
-            <w:pPr>
-              <w:tabs>
-                <w:tab w:val="left" w:pos="284"/>
-              </w:tabs>
-              <w:ind w:right="-1"/>
-              <w:rPr>
-                <w:sz w:val="16"/>
-                <w:szCs w:val="16"/>
-              </w:rPr>
-            </w:pPr>
-            <w:r>
-              <w:rPr>
-                <w:sz w:val="16"/>
-                <w:szCs w:val="16"/>
+            <w:tcW w:w="851" w:type="dxa"/>
+          </w:tcPr>
+          <w:p>
+            <w:pPr>
+              <w:tabs>
+                <w:tab w:val="left" w:pos="284"/>
+              </w:tabs>
+              <w:ind w:right="-1"/>
+              <w:rPr>
+                <w:rFonts w:ascii="Calibri" w:hAnsi="Calibri" w:cs="Calibri"/>
+                <w:sz w:val="18"/>
+                <w:szCs w:val="18"/>
+              </w:rPr>
+            </w:pPr>
+            <w:r>
+              <w:rPr>
+                <w:rFonts w:ascii="Calibri" w:hAnsi="Calibri" w:cs="Calibri"/>
+                <w:sz w:val="18"/>
+                <w:szCs w:val="18"/>
               </w:rPr>
               <w:fldChar w:fldCharType="begin"/>
             </w:r>
             <w:r>
               <w:rPr>
-                <w:sz w:val="16"/>
-                <w:szCs w:val="16"/>
+                <w:rFonts w:ascii="Calibri" w:hAnsi="Calibri" w:cs="Calibri"/>
+                <w:sz w:val="18"/>
+                <w:szCs w:val="18"/>
               </w:rPr>
               <w:instrText xml:space="preserve"> MERGEFIELD  tmh  \* MERGEFORMAT </w:instrText>
             </w:r>
             <w:r>
               <w:rPr>
-                <w:sz w:val="16"/>
-                <w:szCs w:val="16"/>
+                <w:rFonts w:ascii="Calibri" w:hAnsi="Calibri" w:cs="Calibri"/>
+                <w:sz w:val="18"/>
+                <w:szCs w:val="18"/>
               </w:rPr>
               <w:fldChar w:fldCharType="separate"/>
             </w:r>
             <w:r>
               <w:rPr>
+                <w:rFonts w:ascii="Calibri" w:hAnsi="Calibri" w:cs="Calibri"/>
                 <w:noProof/>
-                <w:sz w:val="16"/>
-                <w:szCs w:val="16"/>
+                <w:sz w:val="18"/>
+                <w:szCs w:val="18"/>
               </w:rPr>
               <w:t>«tmh»</w:t>
             </w:r>
             <w:r>
               <w:rPr>
+                <w:rFonts w:ascii="Calibri" w:hAnsi="Calibri" w:cs="Calibri"/>
                 <w:noProof/>
-                <w:sz w:val="16"/>
-                <w:szCs w:val="16"/>
+                <w:sz w:val="18"/>
+                <w:szCs w:val="18"/>
               </w:rPr>
               <w:fldChar w:fldCharType="end"/>
             </w:r>
@@ -2025,6 +2166,186 @@
         </w:tc>
         <w:tc>
           <w:tcPr>
+            <w:tcW w:w="1979" w:type="dxa"/>
+          </w:tcPr>
+          <w:p>
+            <w:pPr>
+              <w:tabs>
+                <w:tab w:val="left" w:pos="284"/>
+              </w:tabs>
+              <w:ind w:right="-1"/>
+              <w:rPr>
+                <w:rFonts w:ascii="Calibri" w:hAnsi="Calibri" w:cs="Calibri"/>
+                <w:sz w:val="18"/>
+                <w:szCs w:val="18"/>
+              </w:rPr>
+            </w:pPr>
+            <w:r>
+              <w:rPr>
+                <w:rFonts w:ascii="Calibri" w:hAnsi="Calibri" w:cs="Calibri"/>
+                <w:sz w:val="18"/>
+                <w:szCs w:val="18"/>
+              </w:rPr>
+              <w:fldChar w:fldCharType="begin"/>
+            </w:r>
+            <w:r>
+              <w:rPr>
+                <w:rFonts w:ascii="Calibri" w:hAnsi="Calibri" w:cs="Calibri"/>
+                <w:sz w:val="18"/>
+                <w:szCs w:val="18"/>
+              </w:rPr>
+              <w:instrText xml:space="preserve"> MERGEFIELD  transportista  \* MERGEFORMAT </w:instrText>
+            </w:r>
+            <w:r>
+              <w:rPr>
+                <w:rFonts w:ascii="Calibri" w:hAnsi="Calibri" w:cs="Calibri"/>
+                <w:sz w:val="18"/>
+                <w:szCs w:val="18"/>
+              </w:rPr>
+              <w:fldChar w:fldCharType="separate"/>
+            </w:r>
+            <w:r>
+              <w:rPr>
+                <w:rFonts w:ascii="Calibri" w:hAnsi="Calibri" w:cs="Calibri"/>
+                <w:noProof/>
+                <w:sz w:val="18"/>
+                <w:szCs w:val="18"/>
+              </w:rPr>
+              <w:t>«transportista»</w:t>
+            </w:r>
+            <w:r>
+              <w:rPr>
+                <w:rFonts w:ascii="Calibri" w:hAnsi="Calibri" w:cs="Calibri"/>
+                <w:noProof/>
+                <w:sz w:val="18"/>
+                <w:szCs w:val="18"/>
+              </w:rPr>
+              <w:fldChar w:fldCharType="end"/>
+            </w:r>
+          </w:p>
+        </w:tc>
+        <w:tc>
+          <w:tcPr>
+            <w:tcW w:w="1139" w:type="dxa"/>
+          </w:tcPr>
+          <w:p>
+            <w:pPr>
+              <w:tabs>
+                <w:tab w:val="left" w:pos="284"/>
+              </w:tabs>
+              <w:ind w:right="-1"/>
+              <w:rPr>
+                <w:rFonts w:ascii="Calibri" w:hAnsi="Calibri" w:cs="Calibri"/>
+                <w:sz w:val="18"/>
+                <w:szCs w:val="18"/>
+              </w:rPr>
+            </w:pPr>
+            <w:r>
+              <w:rPr>
+                <w:rFonts w:ascii="Calibri" w:hAnsi="Calibri" w:cs="Calibri"/>
+                <w:sz w:val="18"/>
+                <w:szCs w:val="18"/>
+              </w:rPr>
+              <w:fldChar w:fldCharType="begin"/>
+            </w:r>
+            <w:r>
+              <w:rPr>
+                <w:rFonts w:ascii="Calibri" w:hAnsi="Calibri" w:cs="Calibri"/>
+                <w:sz w:val="18"/>
+                <w:szCs w:val="18"/>
+              </w:rPr>
+              <w:instrText xml:space="preserve"> MERGEFIELD  nro_grr  \* MERGEFORMAT </w:instrText>
+            </w:r>
+            <w:r>
+              <w:rPr>
+                <w:rFonts w:ascii="Calibri" w:hAnsi="Calibri" w:cs="Calibri"/>
+                <w:sz w:val="18"/>
+                <w:szCs w:val="18"/>
+              </w:rPr>
+              <w:fldChar w:fldCharType="separate"/>
+            </w:r>
+            <w:r>
+              <w:rPr>
+                <w:rFonts w:ascii="Calibri" w:hAnsi="Calibri" w:cs="Calibri"/>
+                <w:noProof/>
+                <w:sz w:val="18"/>
+                <w:szCs w:val="18"/>
+              </w:rPr>
+              <w:t>«nro_grr»</w:t>
+            </w:r>
+            <w:r>
+              <w:rPr>
+                <w:rFonts w:ascii="Calibri" w:hAnsi="Calibri" w:cs="Calibri"/>
+                <w:noProof/>
+                <w:sz w:val="18"/>
+                <w:szCs w:val="18"/>
+              </w:rPr>
+              <w:fldChar w:fldCharType="end"/>
+            </w:r>
+          </w:p>
+        </w:tc>
+        <w:tc>
+          <w:tcPr>
+            <w:tcW w:w="1418" w:type="dxa"/>
+          </w:tcPr>
+          <w:p>
+            <w:pPr>
+              <w:tabs>
+                <w:tab w:val="left" w:pos="284"/>
+              </w:tabs>
+              <w:ind w:right="-1"/>
+              <w:rPr>
+                <w:rFonts w:ascii="Calibri" w:hAnsi="Calibri" w:cs="Calibri"/>
+                <w:sz w:val="18"/>
+                <w:szCs w:val="18"/>
+              </w:rPr>
+            </w:pPr>
+            <w:r>
+              <w:rPr>
+                <w:rFonts w:ascii="Calibri" w:hAnsi="Calibri" w:cs="Calibri"/>
+                <w:sz w:val="18"/>
+                <w:szCs w:val="18"/>
+              </w:rPr>
+              <w:fldChar w:fldCharType="begin"/>
+            </w:r>
+            <w:r>
+              <w:rPr>
+                <w:rFonts w:ascii="Calibri" w:hAnsi="Calibri" w:cs="Calibri"/>
+                <w:sz w:val="18"/>
+                <w:szCs w:val="18"/>
+              </w:rPr>
+              <w:instrText xml:space="preserve"> MERGEFIELD  nro_grt  \* MERGEFORMAT </w:instrText>
+            </w:r>
+            <w:r>
+              <w:rPr>
+                <w:rFonts w:ascii="Calibri" w:hAnsi="Calibri" w:cs="Calibri"/>
+                <w:sz w:val="18"/>
+                <w:szCs w:val="18"/>
+              </w:rPr>
+              <w:fldChar w:fldCharType="separate"/>
+            </w:r>
+            <w:r>
+              <w:rPr>
+                <w:rFonts w:ascii="Calibri" w:hAnsi="Calibri" w:cs="Calibri"/>
+                <w:noProof/>
+                <w:sz w:val="18"/>
+                <w:szCs w:val="18"/>
+              </w:rPr>
+              <w:t>«nro_grt»</w:t>
+            </w:r>
+            <w:r>
+              <w:rPr>
+                <w:rFonts w:ascii="Calibri" w:hAnsi="Calibri" w:cs="Calibri"/>
+                <w:noProof/>
+                <w:sz w:val="18"/>
+                <w:szCs w:val="18"/>
+              </w:rPr>
+              <w:fldChar w:fldCharType="end"/>
+            </w:r>
+          </w:p>
+        </w:tc>
+        <w:tc>
+          <w:tcPr>
             <w:tcW w:w="1559" w:type="dxa"/>
           </w:tcPr>
           <w:p>
@@ -2034,206 +2355,50 @@
               </w:tabs>
               <w:ind w:right="-1"/>
               <w:rPr>
-                <w:sz w:val="16"/>
-                <w:szCs w:val="16"/>
-              </w:rPr>
-            </w:pPr>
-            <w:r>
-              <w:rPr>
-                <w:sz w:val="16"/>
-                <w:szCs w:val="16"/>
+                <w:rFonts w:ascii="Calibri" w:hAnsi="Calibri" w:cs="Calibri"/>
+                <w:sz w:val="18"/>
+                <w:szCs w:val="18"/>
+              </w:rPr>
+            </w:pPr>
+            <w:r>
+              <w:rPr>
+                <w:rFonts w:ascii="Calibri" w:hAnsi="Calibri" w:cs="Calibri"/>
+                <w:sz w:val="18"/>
+                <w:szCs w:val="18"/>
               </w:rPr>
               <w:fldChar w:fldCharType="begin"/>
             </w:r>
             <w:r>
               <w:rPr>
-                <w:sz w:val="16"/>
-                <w:szCs w:val="16"/>
-              </w:rPr>
-              <w:instrText xml:space="preserve"> MERGEFIELD  transportista  \* MERGEFORMAT </w:instrText>
-            </w:r>
-            <w:r>
-              <w:rPr>
-                <w:sz w:val="16"/>
-                <w:szCs w:val="16"/>
+                <w:rFonts w:ascii="Calibri" w:hAnsi="Calibri" w:cs="Calibri"/>
+                <w:sz w:val="18"/>
+                <w:szCs w:val="18"/>
+              </w:rPr>
+              <w:instrText xml:space="preserve"> MERGEFIELD  observacion  \* MERGEFORMAT </w:instrText>
+            </w:r>
+            <w:r>
+              <w:rPr>
+                <w:rFonts w:ascii="Calibri" w:hAnsi="Calibri" w:cs="Calibri"/>
+                <w:sz w:val="18"/>
+                <w:szCs w:val="18"/>
               </w:rPr>
               <w:fldChar w:fldCharType="separate"/>
             </w:r>
             <w:r>
               <w:rPr>
+                <w:rFonts w:ascii="Calibri" w:hAnsi="Calibri" w:cs="Calibri"/>
                 <w:noProof/>
-                <w:sz w:val="16"/>
-                <w:szCs w:val="16"/>
-              </w:rPr>
-              <w:t>«transportista»</w:t>
-            </w:r>
-            <w:r>
-              <w:rPr>
+                <w:sz w:val="18"/>
+                <w:szCs w:val="18"/>
+              </w:rPr>
+              <w:t>«observacion»</w:t>
+            </w:r>
+            <w:r>
+              <w:rPr>
+                <w:rFonts w:ascii="Calibri" w:hAnsi="Calibri" w:cs="Calibri"/>
                 <w:noProof/>
-                <w:sz w:val="16"/>
-                <w:szCs w:val="16"/>
-              </w:rPr>
-              <w:fldChar w:fldCharType="end"/>
-            </w:r>
-          </w:p>
-        </w:tc>
-        <w:tc>
-          <w:tcPr>
-            <w:tcW w:w="992" w:type="dxa"/>
-          </w:tcPr>
-          <w:p>
-            <w:pPr>
-              <w:tabs>
-                <w:tab w:val="left" w:pos="284"/>
-              </w:tabs>
-              <w:ind w:right="-1"/>
-              <w:rPr>
-                <w:sz w:val="16"/>
-                <w:szCs w:val="16"/>
-              </w:rPr>
-            </w:pPr>
-            <w:r>
-              <w:rPr>
-                <w:sz w:val="16"/>
-                <w:szCs w:val="16"/>
-              </w:rPr>
-              <w:fldChar w:fldCharType="begin"/>
-            </w:r>
-            <w:r>
-              <w:rPr>
-                <w:sz w:val="16"/>
-                <w:szCs w:val="16"/>
-              </w:rPr>
-              <w:instrText xml:space="preserve"> MERGEFIELD  nro_grr  \* MERGEFORMAT </w:instrText>
-            </w:r>
-            <w:r>
-              <w:rPr>
-                <w:sz w:val="16"/>
-                <w:szCs w:val="16"/>
-              </w:rPr>
-              <w:fldChar w:fldCharType="separate"/>
-            </w:r>
-            <w:r>
-              <w:rPr>
-                <w:noProof/>
-                <w:sz w:val="16"/>
-                <w:szCs w:val="16"/>
-              </w:rPr>
-              <w:t>«nro_grr»</w:t>
-            </w:r>
-            <w:r>
-              <w:rPr>
-                <w:noProof/>
-                <w:sz w:val="16"/>
-                <w:szCs w:val="16"/>
-              </w:rPr>
-              <w:fldChar w:fldCharType="end"/>
-            </w:r>
-          </w:p>
-        </w:tc>
-        <w:tc>
-          <w:tcPr>
-            <w:tcW w:w="1418" w:type="dxa"/>
-          </w:tcPr>
-          <w:p>
-            <w:pPr>
-              <w:tabs>
-                <w:tab w:val="left" w:pos="284"/>
-              </w:tabs>
-              <w:ind w:right="-1"/>
-              <w:rPr>
-                <w:sz w:val="16"/>
-                <w:szCs w:val="16"/>
-              </w:rPr>
-            </w:pPr>
-            <w:r>
-              <w:rPr>
-                <w:sz w:val="16"/>
-                <w:szCs w:val="16"/>
-              </w:rPr>
-              <w:fldChar w:fldCharType="begin"/>
-            </w:r>
-            <w:r>
-              <w:rPr>
-                <w:sz w:val="16"/>
-                <w:szCs w:val="16"/>
-              </w:rPr>
-              <w:instrText xml:space="preserve"> MERGEFIELD  nro_grt  \* MERGEFORMAT </w:instrText>
-            </w:r>
-            <w:r>
-              <w:rPr>
-                <w:sz w:val="16"/>
-                <w:szCs w:val="16"/>
-              </w:rPr>
-              <w:fldChar w:fldCharType="separate"/>
-            </w:r>
-            <w:r>
-              <w:rPr>
-                <w:noProof/>
-                <w:sz w:val="16"/>
-                <w:szCs w:val="16"/>
-              </w:rPr>
-              <w:t>«nro_grt»</w:t>
-            </w:r>
-            <w:r>
-              <w:rPr>
-                <w:noProof/>
-                <w:sz w:val="16"/>
-                <w:szCs w:val="16"/>
-              </w:rPr>
-              <w:fldChar w:fldCharType="end"/>
-            </w:r>
-          </w:p>
-        </w:tc>
-        <w:tc>
-          <w:tcPr>
-            <w:tcW w:w="1270" w:type="dxa"/>
-          </w:tcPr>
-          <w:p>
-            <w:pPr>
-              <w:tabs>
-                <w:tab w:val="left" w:pos="284"/>
-              </w:tabs>
-              <w:ind w:right="-1"/>
-              <w:rPr>
-                <w:sz w:val="16"/>
-                <w:szCs w:val="16"/>
-              </w:rPr>
-            </w:pPr>
-            <w:r>
-              <w:rPr>
-                <w:sz w:val="16"/>
-                <w:szCs w:val="16"/>
-              </w:rPr>
-              <w:fldChar w:fldCharType="begin"/>
-            </w:r>
-            <w:r>
-              <w:rPr>
-                <w:sz w:val="16"/>
-                <w:szCs w:val="16"/>
-              </w:rPr>
-              <w:instrText xml:space="preserve"> MERGEFIELD  observacion  \* MERGEFORMAT </w:instrText>
-            </w:r>
-            <w:r>
-              <w:rPr>
-                <w:sz w:val="16"/>
-                <w:szCs w:val="16"/>
-              </w:rPr>
-              <w:fldChar w:fldCharType="separate"/>
-            </w:r>
-            <w:r>
-              <w:rPr>
-                <w:noProof/>
-                <w:sz w:val="16"/>
-                <w:szCs w:val="16"/>
-              </w:rPr>
-              <w:t>«observacion»</w:t>
-            </w:r>
-            <w:r>
-              <w:rPr>
-                <w:noProof/>
-                <w:sz w:val="16"/>
-                <w:szCs w:val="16"/>
+                <w:sz w:val="18"/>
+                <w:szCs w:val="18"/>
               </w:rPr>
               <w:fldChar w:fldCharType="end"/>
             </w:r>
@@ -2306,15 +2471,16 @@
       <w:tblPr>
         <w:tblStyle w:val="Tablaconcuadrcula"/>
         <w:tblW w:w="0" w:type="auto"/>
+        <w:tblInd w:w="-147" w:type="dxa"/>
         <w:tblLayout w:type="fixed"/>
         <w:tblLook w:val="04A0" w:firstRow="1" w:lastRow="0" w:firstColumn="1" w:lastColumn="0" w:noHBand="0" w:noVBand="1"/>
       </w:tblPr>
       <w:tblGrid>
-        <w:gridCol w:w="2405"/>
+        <w:gridCol w:w="1985"/>
         <w:gridCol w:w="1418"/>
-        <w:gridCol w:w="1417"/>
+        <w:gridCol w:w="1275"/>
         <w:gridCol w:w="851"/>
-        <w:gridCol w:w="1275"/>
+        <w:gridCol w:w="1837"/>
         <w:gridCol w:w="1134"/>
         <w:gridCol w:w="1444"/>
         <w:gridCol w:w="1244"/>
@@ -2325,7 +2491,7 @@
         </w:trPr>
         <w:tc>
           <w:tcPr>
-            <w:tcW w:w="2405" w:type="dxa"/>
+            <w:tcW w:w="1985" w:type="dxa"/>
             <w:tcBorders>
               <w:right w:val="single" w:sz="4" w:space="0" w:color="auto"/>
             </w:tcBorders>
@@ -2338,44 +2504,50 @@
               <w:ind w:right="-1"/>
               <w:jc w:val="center"/>
               <w:rPr>
-                <w:sz w:val="16"/>
-                <w:szCs w:val="16"/>
-              </w:rPr>
-            </w:pPr>
-            <w:r>
-              <w:rPr>
+                <w:rFonts w:ascii="Calibri" w:hAnsi="Calibri" w:cs="Calibri"/>
+                <w:sz w:val="18"/>
+                <w:szCs w:val="18"/>
+              </w:rPr>
+            </w:pPr>
+            <w:r>
+              <w:rPr>
+                <w:rFonts w:ascii="Calibri" w:hAnsi="Calibri" w:cs="Calibri"/>
                 <w:b/>
                 <w:bCs/>
-                <w:sz w:val="16"/>
-                <w:szCs w:val="16"/>
+                <w:sz w:val="18"/>
+                <w:szCs w:val="18"/>
               </w:rPr>
               <w:t>TOTAL</w:t>
             </w:r>
             <w:r>
               <w:rPr>
-                <w:sz w:val="16"/>
-                <w:szCs w:val="16"/>
+                <w:rFonts w:ascii="Calibri" w:hAnsi="Calibri" w:cs="Calibri"/>
+                <w:sz w:val="18"/>
+                <w:szCs w:val="18"/>
               </w:rPr>
               <w:fldChar w:fldCharType="begin"/>
             </w:r>
             <w:r>
               <w:rPr>
-                <w:sz w:val="16"/>
-                <w:szCs w:val="16"/>
+                <w:rFonts w:ascii="Calibri" w:hAnsi="Calibri" w:cs="Calibri"/>
+                <w:sz w:val="18"/>
+                <w:szCs w:val="18"/>
               </w:rPr>
               <w:instrText xml:space="preserve"> MERGEFIELD  nro_lote  \* MERGEFORMAT </w:instrText>
             </w:r>
             <w:r>
               <w:rPr>
-                <w:sz w:val="16"/>
-                <w:szCs w:val="16"/>
+                <w:rFonts w:ascii="Calibri" w:hAnsi="Calibri" w:cs="Calibri"/>
+                <w:sz w:val="18"/>
+                <w:szCs w:val="18"/>
               </w:rPr>
               <w:fldChar w:fldCharType="separate"/>
             </w:r>
             <w:r>
               <w:rPr>
-                <w:sz w:val="16"/>
-                <w:szCs w:val="16"/>
+                <w:rFonts w:ascii="Calibri" w:hAnsi="Calibri" w:cs="Calibri"/>
+                <w:sz w:val="18"/>
+                <w:szCs w:val="18"/>
               </w:rPr>
               <w:fldChar w:fldCharType="end"/>
             </w:r>
@@ -2390,52 +2562,58 @@
               <w:bottom w:val="single" w:sz="4" w:space="0" w:color="auto"/>
               <w:right w:val="single" w:sz="4" w:space="0" w:color="auto"/>
             </w:tcBorders>
-            <w:shd w:val="clear" w:color="auto" w:fill="63A4F7"/>
-          </w:tcPr>
-          <w:p>
-            <w:pPr>
-              <w:tabs>
-                <w:tab w:val="left" w:pos="284"/>
-              </w:tabs>
-              <w:ind w:right="-1"/>
-              <w:rPr>
-                <w:sz w:val="16"/>
-                <w:szCs w:val="16"/>
-              </w:rPr>
-            </w:pPr>
-            <w:r>
-              <w:rPr>
-                <w:sz w:val="16"/>
-                <w:szCs w:val="16"/>
+            <w:shd w:val="clear" w:color="auto" w:fill="9BC2E6"/>
+          </w:tcPr>
+          <w:p>
+            <w:pPr>
+              <w:tabs>
+                <w:tab w:val="left" w:pos="284"/>
+              </w:tabs>
+              <w:ind w:right="-1"/>
+              <w:rPr>
+                <w:rFonts w:ascii="Calibri" w:hAnsi="Calibri" w:cs="Calibri"/>
+                <w:sz w:val="18"/>
+                <w:szCs w:val="18"/>
+              </w:rPr>
+            </w:pPr>
+            <w:r>
+              <w:rPr>
+                <w:rFonts w:ascii="Calibri" w:hAnsi="Calibri" w:cs="Calibri"/>
+                <w:sz w:val="18"/>
+                <w:szCs w:val="18"/>
               </w:rPr>
               <w:fldChar w:fldCharType="begin"/>
             </w:r>
             <w:r>
               <w:rPr>
-                <w:sz w:val="16"/>
-                <w:szCs w:val="16"/>
+                <w:rFonts w:ascii="Calibri" w:hAnsi="Calibri" w:cs="Calibri"/>
+                <w:sz w:val="18"/>
+                <w:szCs w:val="18"/>
               </w:rPr>
               <w:instrText xml:space="preserve"> MERGEFIELD  total_cant_m  \* MERGEFORMAT </w:instrText>
             </w:r>
             <w:r>
               <w:rPr>
-                <w:sz w:val="16"/>
-                <w:szCs w:val="16"/>
+                <w:rFonts w:ascii="Calibri" w:hAnsi="Calibri" w:cs="Calibri"/>
+                <w:sz w:val="18"/>
+                <w:szCs w:val="18"/>
               </w:rPr>
               <w:fldChar w:fldCharType="separate"/>
             </w:r>
             <w:r>
               <w:rPr>
+                <w:rFonts w:ascii="Calibri" w:hAnsi="Calibri" w:cs="Calibri"/>
                 <w:noProof/>
-                <w:sz w:val="16"/>
-                <w:szCs w:val="16"/>
+                <w:sz w:val="18"/>
+                <w:szCs w:val="18"/>
               </w:rPr>
               <w:t>«total_cant_m»</w:t>
             </w:r>
             <w:r>
               <w:rPr>
-                <w:sz w:val="16"/>
-                <w:szCs w:val="16"/>
+                <w:rFonts w:ascii="Calibri" w:hAnsi="Calibri" w:cs="Calibri"/>
+                <w:sz w:val="18"/>
+                <w:szCs w:val="18"/>
               </w:rPr>
               <w:fldChar w:fldCharType="end"/>
             </w:r>
@@ -2443,59 +2621,65 @@
         </w:tc>
         <w:tc>
           <w:tcPr>
-            <w:tcW w:w="1417" w:type="dxa"/>
+            <w:tcW w:w="1275" w:type="dxa"/>
             <w:tcBorders>
               <w:top w:val="single" w:sz="4" w:space="0" w:color="auto"/>
               <w:left w:val="single" w:sz="4" w:space="0" w:color="auto"/>
               <w:bottom w:val="single" w:sz="4" w:space="0" w:color="auto"/>
               <w:right w:val="single" w:sz="4" w:space="0" w:color="auto"/>
             </w:tcBorders>
-            <w:shd w:val="clear" w:color="auto" w:fill="63A4F7"/>
-          </w:tcPr>
-          <w:p>
-            <w:pPr>
-              <w:tabs>
-                <w:tab w:val="left" w:pos="284"/>
-              </w:tabs>
-              <w:ind w:right="-1"/>
-              <w:rPr>
-                <w:sz w:val="16"/>
-                <w:szCs w:val="16"/>
-              </w:rPr>
-            </w:pPr>
-            <w:r>
-              <w:rPr>
-                <w:sz w:val="16"/>
-                <w:szCs w:val="16"/>
+            <w:shd w:val="clear" w:color="auto" w:fill="9BC2E6"/>
+          </w:tcPr>
+          <w:p>
+            <w:pPr>
+              <w:tabs>
+                <w:tab w:val="left" w:pos="284"/>
+              </w:tabs>
+              <w:ind w:right="-1"/>
+              <w:rPr>
+                <w:rFonts w:ascii="Calibri" w:hAnsi="Calibri" w:cs="Calibri"/>
+                <w:sz w:val="18"/>
+                <w:szCs w:val="18"/>
+              </w:rPr>
+            </w:pPr>
+            <w:r>
+              <w:rPr>
+                <w:rFonts w:ascii="Calibri" w:hAnsi="Calibri" w:cs="Calibri"/>
+                <w:sz w:val="18"/>
+                <w:szCs w:val="18"/>
               </w:rPr>
               <w:fldChar w:fldCharType="begin"/>
             </w:r>
             <w:r>
               <w:rPr>
-                <w:sz w:val="16"/>
-                <w:szCs w:val="16"/>
+                <w:rFonts w:ascii="Calibri" w:hAnsi="Calibri" w:cs="Calibri"/>
+                <w:sz w:val="18"/>
+                <w:szCs w:val="18"/>
               </w:rPr>
               <w:instrText xml:space="preserve"> MERGEFIELD  total_cant  \* MERGEFORMAT </w:instrText>
             </w:r>
             <w:r>
               <w:rPr>
-                <w:sz w:val="16"/>
-                <w:szCs w:val="16"/>
+                <w:rFonts w:ascii="Calibri" w:hAnsi="Calibri" w:cs="Calibri"/>
+                <w:sz w:val="18"/>
+                <w:szCs w:val="18"/>
               </w:rPr>
               <w:fldChar w:fldCharType="separate"/>
             </w:r>
             <w:r>
               <w:rPr>
+                <w:rFonts w:ascii="Calibri" w:hAnsi="Calibri" w:cs="Calibri"/>
                 <w:noProof/>
-                <w:sz w:val="16"/>
-                <w:szCs w:val="16"/>
+                <w:sz w:val="18"/>
+                <w:szCs w:val="18"/>
               </w:rPr>
               <w:t>«total_cant»</w:t>
             </w:r>
             <w:r>
               <w:rPr>
-                <w:sz w:val="16"/>
-                <w:szCs w:val="16"/>
+                <w:rFonts w:ascii="Calibri" w:hAnsi="Calibri" w:cs="Calibri"/>
+                <w:sz w:val="18"/>
+                <w:szCs w:val="18"/>
               </w:rPr>
               <w:fldChar w:fldCharType="end"/>
             </w:r>
@@ -2510,52 +2694,58 @@
               <w:bottom w:val="single" w:sz="4" w:space="0" w:color="auto"/>
               <w:right w:val="single" w:sz="4" w:space="0" w:color="auto"/>
             </w:tcBorders>
-            <w:shd w:val="clear" w:color="auto" w:fill="63A4F7"/>
-          </w:tcPr>
-          <w:p>
-            <w:pPr>
-              <w:tabs>
-                <w:tab w:val="left" w:pos="284"/>
-              </w:tabs>
-              <w:ind w:right="-1"/>
-              <w:rPr>
-                <w:sz w:val="16"/>
-                <w:szCs w:val="16"/>
-              </w:rPr>
-            </w:pPr>
-            <w:r>
-              <w:rPr>
-                <w:sz w:val="16"/>
-                <w:szCs w:val="16"/>
+            <w:shd w:val="clear" w:color="auto" w:fill="9BC2E6"/>
+          </w:tcPr>
+          <w:p>
+            <w:pPr>
+              <w:tabs>
+                <w:tab w:val="left" w:pos="284"/>
+              </w:tabs>
+              <w:ind w:right="-1"/>
+              <w:rPr>
+                <w:rFonts w:ascii="Calibri" w:hAnsi="Calibri" w:cs="Calibri"/>
+                <w:sz w:val="18"/>
+                <w:szCs w:val="18"/>
+              </w:rPr>
+            </w:pPr>
+            <w:r>
+              <w:rPr>
+                <w:rFonts w:ascii="Calibri" w:hAnsi="Calibri" w:cs="Calibri"/>
+                <w:sz w:val="18"/>
+                <w:szCs w:val="18"/>
               </w:rPr>
               <w:fldChar w:fldCharType="begin"/>
             </w:r>
             <w:r>
               <w:rPr>
-                <w:sz w:val="16"/>
-                <w:szCs w:val="16"/>
+                <w:rFonts w:ascii="Calibri" w:hAnsi="Calibri" w:cs="Calibri"/>
+                <w:sz w:val="18"/>
+                <w:szCs w:val="18"/>
               </w:rPr>
               <w:instrText xml:space="preserve"> MERGEFIELD  total  \* MERGEFORMAT </w:instrText>
             </w:r>
             <w:r>
               <w:rPr>
-                <w:sz w:val="16"/>
-                <w:szCs w:val="16"/>
+                <w:rFonts w:ascii="Calibri" w:hAnsi="Calibri" w:cs="Calibri"/>
+                <w:sz w:val="18"/>
+                <w:szCs w:val="18"/>
               </w:rPr>
               <w:fldChar w:fldCharType="separate"/>
             </w:r>
             <w:r>
               <w:rPr>
+                <w:rFonts w:ascii="Calibri" w:hAnsi="Calibri" w:cs="Calibri"/>
                 <w:noProof/>
-                <w:sz w:val="16"/>
-                <w:szCs w:val="16"/>
+                <w:sz w:val="18"/>
+                <w:szCs w:val="18"/>
               </w:rPr>
               <w:t>«total»</w:t>
             </w:r>
             <w:r>
               <w:rPr>
-                <w:sz w:val="16"/>
-                <w:szCs w:val="16"/>
+                <w:rFonts w:ascii="Calibri" w:hAnsi="Calibri" w:cs="Calibri"/>
+                <w:sz w:val="18"/>
+                <w:szCs w:val="18"/>
               </w:rPr>
               <w:fldChar w:fldCharType="end"/>
             </w:r>
@@ -2563,7 +2753,7 @@
         </w:tc>
         <w:tc>
           <w:tcPr>
-            <w:tcW w:w="1275" w:type="dxa"/>
+            <w:tcW w:w="1837" w:type="dxa"/>
             <w:tcBorders>
               <w:top w:val="nil"/>
               <w:left w:val="single" w:sz="4" w:space="0" w:color="auto"/>
@@ -2669,12 +2859,16 @@
         <w:tblpPr w:leftFromText="141" w:rightFromText="141" w:vertAnchor="text" w:tblpY="1"/>
         <w:tblOverlap w:val="never"/>
         <w:tblW w:w="5000" w:type="pct"/>
+        <w:tblBorders>
+          <w:insideH w:val="none" w:sz="0" w:space="0" w:color="auto"/>
+          <w:insideV w:val="none" w:sz="0" w:space="0" w:color="auto"/>
+        </w:tblBorders>
         <w:tblLayout w:type="fixed"/>
         <w:tblLook w:val="04A0" w:firstRow="1" w:lastRow="0" w:firstColumn="1" w:lastColumn="0" w:noHBand="0" w:noVBand="1"/>
       </w:tblPr>
       <w:tblGrid>
-        <w:gridCol w:w="1466"/>
-        <w:gridCol w:w="2074"/>
+        <w:gridCol w:w="1555"/>
+        <w:gridCol w:w="1985"/>
         <w:gridCol w:w="709"/>
         <w:gridCol w:w="1676"/>
         <w:gridCol w:w="1584"/>
@@ -2826,7 +3020,6 @@
               <w:top w:val="single" w:sz="4" w:space="0" w:color="auto"/>
               <w:left w:val="single" w:sz="4" w:space="0" w:color="auto"/>
               <w:bottom w:val="nil"/>
-              <w:right w:val="single" w:sz="4" w:space="0" w:color="auto"/>
             </w:tcBorders>
           </w:tcPr>
           <w:p>
@@ -2854,11 +3047,11 @@
       <w:tr>
         <w:trPr>
           <w:cantSplit/>
-          <w:trHeight w:val="568"/>
+          <w:trHeight w:val="577"/>
         </w:trPr>
         <w:tc>
           <w:tcPr>
-            <w:tcW w:w="1466" w:type="dxa"/>
+            <w:tcW w:w="1555" w:type="dxa"/>
             <w:tcBorders>
               <w:top w:val="nil"/>
               <w:left w:val="single" w:sz="4" w:space="0" w:color="auto"/>
@@ -2867,12 +3060,6 @@
             </w:tcBorders>
           </w:tcPr>
           <w:p>
-            <w:pPr>
-              <w:tabs>
-                <w:tab w:val="left" w:pos="284"/>
-              </w:tabs>
-              <w:ind w:right="-1"/>
-            </w:pPr>
             <w:r>
               <w:t>Firma y Huella:</w:t>
             </w:r>
@@ -2880,7 +3067,7 @@
         </w:tc>
         <w:tc>
           <w:tcPr>
-            <w:tcW w:w="2074" w:type="dxa"/>
+            <w:tcW w:w="1985" w:type="dxa"/>
             <w:tcBorders>
               <w:top w:val="nil"/>
               <w:left w:val="nil"/>
@@ -2888,14 +3075,7 @@
               <w:right w:val="single" w:sz="4" w:space="0" w:color="auto"/>
             </w:tcBorders>
           </w:tcPr>
-          <w:p>
-            <w:pPr>
-              <w:tabs>
-                <w:tab w:val="left" w:pos="284"/>
-              </w:tabs>
-              <w:ind w:right="-1"/>
-            </w:pPr>
-          </w:p>
+          <w:p/>
         </w:tc>
         <w:tc>
           <w:tcPr>
@@ -2907,14 +3087,7 @@
               <w:right w:val="single" w:sz="4" w:space="0" w:color="auto"/>
             </w:tcBorders>
           </w:tcPr>
-          <w:p>
-            <w:pPr>
-              <w:tabs>
-                <w:tab w:val="left" w:pos="284"/>
-              </w:tabs>
-              <w:ind w:right="-1"/>
-            </w:pPr>
-          </w:p>
+          <w:p/>
         </w:tc>
         <w:tc>
           <w:tcPr>
@@ -2927,12 +3100,6 @@
             </w:tcBorders>
           </w:tcPr>
           <w:p>
-            <w:pPr>
-              <w:tabs>
-                <w:tab w:val="left" w:pos="284"/>
-              </w:tabs>
-              <w:ind w:right="-1"/>
-            </w:pPr>
             <w:r>
               <w:t>Firma y sello:</w:t>
             </w:r>
@@ -2948,18 +3115,87 @@
               <w:right w:val="single" w:sz="4" w:space="0" w:color="auto"/>
             </w:tcBorders>
           </w:tcPr>
-          <w:p>
-            <w:pPr>
-              <w:tabs>
-                <w:tab w:val="left" w:pos="284"/>
-              </w:tabs>
-              <w:ind w:right="-1"/>
-            </w:pPr>
-          </w:p>
+          <w:p/>
         </w:tc>
         <w:tc>
           <w:tcPr>
             <w:tcW w:w="566" w:type="dxa"/>
+            <w:tcBorders>
+              <w:top w:val="nil"/>
+              <w:left w:val="single" w:sz="4" w:space="0" w:color="auto"/>
+              <w:right w:val="single" w:sz="4" w:space="0" w:color="auto"/>
+            </w:tcBorders>
+          </w:tcPr>
+          <w:p/>
+        </w:tc>
+        <w:tc>
+          <w:tcPr>
+            <w:tcW w:w="1808" w:type="dxa"/>
+            <w:tcBorders>
+              <w:top w:val="nil"/>
+              <w:left w:val="single" w:sz="4" w:space="0" w:color="auto"/>
+              <w:bottom w:val="nil"/>
+            </w:tcBorders>
+          </w:tcPr>
+          <w:p>
+            <w:r>
+              <w:t>Firma y sello:</w:t>
+            </w:r>
+          </w:p>
+        </w:tc>
+        <w:tc>
+          <w:tcPr>
+            <w:tcW w:w="1305" w:type="dxa"/>
+            <w:tcBorders>
+              <w:top w:val="nil"/>
+              <w:bottom w:val="nil"/>
+            </w:tcBorders>
+          </w:tcPr>
+          <w:p/>
+        </w:tc>
+      </w:tr>
+      <w:tr>
+        <w:trPr>
+          <w:cantSplit/>
+          <w:trHeight w:val="391"/>
+        </w:trPr>
+        <w:tc>
+          <w:tcPr>
+            <w:tcW w:w="1555" w:type="dxa"/>
+            <w:tcBorders>
+              <w:top w:val="nil"/>
+              <w:left w:val="single" w:sz="4" w:space="0" w:color="auto"/>
+              <w:bottom w:val="nil"/>
+              <w:right w:val="nil"/>
+            </w:tcBorders>
+          </w:tcPr>
+          <w:p>
+            <w:r>
+              <w:t>Nombre:</w:t>
+            </w:r>
+          </w:p>
+        </w:tc>
+        <w:tc>
+          <w:tcPr>
+            <w:tcW w:w="1985" w:type="dxa"/>
+            <w:tcBorders>
+              <w:top w:val="nil"/>
+              <w:left w:val="nil"/>
+              <w:bottom w:val="nil"/>
+              <w:right w:val="single" w:sz="4" w:space="0" w:color="auto"/>
+            </w:tcBorders>
+          </w:tcPr>
+          <w:p>
+            <w:fldSimple w:instr=" MERGEFIELD  nom_encargado  \* MERGEFORMAT ">
+              <w:r>
+                <w:t>«nom_encargado»</w:t>
+              </w:r>
+            </w:fldSimple>
+          </w:p>
+        </w:tc>
+        <w:tc>
+          <w:tcPr>
+            <w:tcW w:w="709" w:type="dxa"/>
             <w:tcBorders>
               <w:top w:val="nil"/>
               <w:left w:val="single" w:sz="4" w:space="0" w:color="auto"/>
@@ -2967,18 +3203,11 @@
               <w:right w:val="single" w:sz="4" w:space="0" w:color="auto"/>
             </w:tcBorders>
           </w:tcPr>
-          <w:p>
-            <w:pPr>
-              <w:tabs>
-                <w:tab w:val="left" w:pos="284"/>
-              </w:tabs>
-              <w:ind w:right="-1"/>
-            </w:pPr>
-          </w:p>
-        </w:tc>
-        <w:tc>
-          <w:tcPr>
-            <w:tcW w:w="1808" w:type="dxa"/>
+          <w:p/>
+        </w:tc>
+        <w:tc>
+          <w:tcPr>
+            <w:tcW w:w="1676" w:type="dxa"/>
             <w:tcBorders>
               <w:top w:val="nil"/>
               <w:left w:val="single" w:sz="4" w:space="0" w:color="auto"/>
@@ -2986,21 +3215,11 @@
               <w:right w:val="nil"/>
             </w:tcBorders>
           </w:tcPr>
-          <w:p>
-            <w:pPr>
-              <w:tabs>
-                <w:tab w:val="left" w:pos="284"/>
-              </w:tabs>
-              <w:ind w:right="-1"/>
-            </w:pPr>
-            <w:r>
-              <w:t>Firma y sello:</w:t>
-            </w:r>
-          </w:p>
-        </w:tc>
-        <w:tc>
-          <w:tcPr>
-            <w:tcW w:w="1305" w:type="dxa"/>
+          <w:p/>
+        </w:tc>
+        <w:tc>
+          <w:tcPr>
+            <w:tcW w:w="1584" w:type="dxa"/>
             <w:tcBorders>
               <w:top w:val="nil"/>
               <w:left w:val="nil"/>
@@ -3008,66 +3227,76 @@
               <w:right w:val="single" w:sz="4" w:space="0" w:color="auto"/>
             </w:tcBorders>
           </w:tcPr>
-          <w:p>
-            <w:pPr>
-              <w:tabs>
-                <w:tab w:val="left" w:pos="284"/>
-              </w:tabs>
-              <w:ind w:right="-1"/>
-            </w:pPr>
-          </w:p>
+          <w:p/>
+        </w:tc>
+        <w:tc>
+          <w:tcPr>
+            <w:tcW w:w="566" w:type="dxa"/>
+            <w:tcBorders>
+              <w:left w:val="single" w:sz="4" w:space="0" w:color="auto"/>
+              <w:bottom w:val="nil"/>
+              <w:right w:val="single" w:sz="4" w:space="0" w:color="auto"/>
+            </w:tcBorders>
+          </w:tcPr>
+          <w:p/>
+        </w:tc>
+        <w:tc>
+          <w:tcPr>
+            <w:tcW w:w="1808" w:type="dxa"/>
+            <w:tcBorders>
+              <w:top w:val="nil"/>
+              <w:left w:val="single" w:sz="4" w:space="0" w:color="auto"/>
+              <w:bottom w:val="nil"/>
+            </w:tcBorders>
+          </w:tcPr>
+          <w:p/>
+        </w:tc>
+        <w:tc>
+          <w:tcPr>
+            <w:tcW w:w="1305" w:type="dxa"/>
+            <w:tcBorders>
+              <w:top w:val="nil"/>
+              <w:bottom w:val="nil"/>
+            </w:tcBorders>
+          </w:tcPr>
+          <w:p/>
         </w:tc>
       </w:tr>
       <w:tr>
         <w:trPr>
           <w:cantSplit/>
-          <w:trHeight w:val="568"/>
+          <w:trHeight w:val="268"/>
         </w:trPr>
         <w:tc>
           <w:tcPr>
-            <w:tcW w:w="1466" w:type="dxa"/>
+            <w:tcW w:w="1555" w:type="dxa"/>
             <w:tcBorders>
               <w:top w:val="nil"/>
               <w:left w:val="single" w:sz="4" w:space="0" w:color="auto"/>
-              <w:bottom w:val="nil"/>
+              <w:bottom w:val="single" w:sz="4" w:space="0" w:color="auto"/>
               <w:right w:val="nil"/>
             </w:tcBorders>
           </w:tcPr>
           <w:p>
-            <w:pPr>
-              <w:tabs>
-                <w:tab w:val="left" w:pos="284"/>
-              </w:tabs>
-              <w:ind w:right="-1"/>
-            </w:pPr>
-            <w:r>
-              <w:t>Nombre:</w:t>
-            </w:r>
-          </w:p>
-        </w:tc>
-        <w:tc>
-          <w:tcPr>
-            <w:tcW w:w="2074" w:type="dxa"/>
+            <w:r>
+              <w:t>DNI:</w:t>
+            </w:r>
+          </w:p>
+        </w:tc>
+        <w:tc>
+          <w:tcPr>
+            <w:tcW w:w="1985" w:type="dxa"/>
             <w:tcBorders>
               <w:top w:val="nil"/>
               <w:left w:val="nil"/>
-              <w:bottom w:val="nil"/>
+              <w:bottom w:val="single" w:sz="4" w:space="0" w:color="auto"/>
               <w:right w:val="single" w:sz="4" w:space="0" w:color="auto"/>
             </w:tcBorders>
           </w:tcPr>
           <w:p>
-            <w:pPr>
-              <w:tabs>
-                <w:tab w:val="left" w:pos="284"/>
-              </w:tabs>
-              <w:ind w:right="-1"/>
-            </w:pPr>
-            <w:fldSimple w:instr=" MERGEFIELD  nom_encargado  \* MERGEFORMAT ">
+            <w:fldSimple w:instr=" MERGEFIELD  doc_encargado  \* MERGEFORMAT ">
               <w:r>
-                <w:rPr>
-                  <w:noProof/>
-                </w:rPr>
-                <w:t>«nom_encargado»</w:t>
+                <w:t>«doc_encargado»</w:t>
               </w:r>
             </w:fldSimple>
           </w:p>
@@ -3082,14 +3311,7 @@
               <w:right w:val="single" w:sz="4" w:space="0" w:color="auto"/>
             </w:tcBorders>
           </w:tcPr>
-          <w:p>
-            <w:pPr>
-              <w:tabs>
-                <w:tab w:val="left" w:pos="284"/>
-              </w:tabs>
-              <w:ind w:right="-1"/>
-            </w:pPr>
-          </w:p>
+          <w:p/>
         </w:tc>
         <w:tc>
           <w:tcPr>
@@ -3097,18 +3319,11 @@
             <w:tcBorders>
               <w:top w:val="nil"/>
               <w:left w:val="single" w:sz="4" w:space="0" w:color="auto"/>
-              <w:bottom w:val="nil"/>
+              <w:bottom w:val="single" w:sz="4" w:space="0" w:color="auto"/>
               <w:right w:val="nil"/>
             </w:tcBorders>
           </w:tcPr>
-          <w:p>
-            <w:pPr>
-              <w:tabs>
-                <w:tab w:val="left" w:pos="284"/>
-              </w:tabs>
-              <w:ind w:right="-1"/>
-            </w:pPr>
-          </w:p>
+          <w:p/>
         </w:tc>
         <w:tc>
           <w:tcPr>
@@ -3116,18 +3331,11 @@
             <w:tcBorders>
               <w:top w:val="nil"/>
               <w:left w:val="nil"/>
-              <w:bottom w:val="nil"/>
+              <w:bottom w:val="single" w:sz="4" w:space="0" w:color="auto"/>
               <w:right w:val="single" w:sz="4" w:space="0" w:color="auto"/>
             </w:tcBorders>
           </w:tcPr>
-          <w:p>
-            <w:pPr>
-              <w:tabs>
-                <w:tab w:val="left" w:pos="284"/>
-              </w:tabs>
-              <w:ind w:right="-1"/>
-            </w:pPr>
-          </w:p>
+          <w:p/>
         </w:tc>
         <w:tc>
           <w:tcPr>
@@ -3139,221 +3347,28 @@
               <w:right w:val="single" w:sz="4" w:space="0" w:color="auto"/>
             </w:tcBorders>
           </w:tcPr>
-          <w:p>
-            <w:pPr>
-              <w:tabs>
-                <w:tab w:val="left" w:pos="284"/>
-              </w:tabs>
-              <w:ind w:right="-1"/>
-            </w:pPr>
-          </w:p>
+          <w:p/>
         </w:tc>
         <w:tc>
           <w:tcPr>
             <w:tcW w:w="1808" w:type="dxa"/>
-            <w:tcBorders>
-              <w:top w:val="nil"/>
-              <w:left w:val="single" w:sz="4" w:space="0" w:color="auto"/>
-              <w:bottom w:val="nil"/>
-              <w:right w:val="nil"/>
-            </w:tcBorders>
-          </w:tcPr>
-          <w:p>
-            <w:pPr>
-              <w:tabs>
-                <w:tab w:val="left" w:pos="284"/>
-              </w:tabs>
-              <w:ind w:right="-1"/>
-            </w:pPr>
-          </w:p>
-        </w:tc>
-        <w:tc>
-          <w:tcPr>
-            <w:tcW w:w="1305" w:type="dxa"/>
-            <w:tcBorders>
-              <w:top w:val="nil"/>
-              <w:left w:val="nil"/>
-              <w:bottom w:val="nil"/>
-              <w:right w:val="single" w:sz="4" w:space="0" w:color="auto"/>
-            </w:tcBorders>
-          </w:tcPr>
-          <w:p>
-            <w:pPr>
-              <w:tabs>
-                <w:tab w:val="left" w:pos="284"/>
-              </w:tabs>
-              <w:ind w:right="-1"/>
-            </w:pPr>
-          </w:p>
-        </w:tc>
-      </w:tr>
-      <w:tr>
-        <w:trPr>
-          <w:cantSplit/>
-          <w:trHeight w:val="568"/>
-        </w:trPr>
-        <w:tc>
-          <w:tcPr>
-            <w:tcW w:w="1466" w:type="dxa"/>
             <w:tcBorders>
               <w:top w:val="nil"/>
               <w:left w:val="single" w:sz="4" w:space="0" w:color="auto"/>
               <w:bottom w:val="single" w:sz="4" w:space="0" w:color="auto"/>
-              <w:right w:val="nil"/>
-            </w:tcBorders>
-          </w:tcPr>
-          <w:p>
-            <w:pPr>
-              <w:tabs>
-                <w:tab w:val="left" w:pos="284"/>
-              </w:tabs>
-              <w:ind w:right="-1"/>
-            </w:pPr>
-            <w:r>
-              <w:t>DNI:</w:t>
-            </w:r>
-          </w:p>
-        </w:tc>
-        <w:tc>
-          <w:tcPr>
-            <w:tcW w:w="2074" w:type="dxa"/>
+            </w:tcBorders>
+          </w:tcPr>
+          <w:p/>
+        </w:tc>
+        <w:tc>
+          <w:tcPr>
+            <w:tcW w:w="1305" w:type="dxa"/>
             <w:tcBorders>
               <w:top w:val="nil"/>
-              <w:left w:val="nil"/>
               <w:bottom w:val="single" w:sz="4" w:space="0" w:color="auto"/>
-              <w:right w:val="single" w:sz="4" w:space="0" w:color="auto"/>
-            </w:tcBorders>
-          </w:tcPr>
-          <w:p>
-            <w:pPr>
-              <w:tabs>
-                <w:tab w:val="left" w:pos="284"/>
-              </w:tabs>
-              <w:ind w:right="-1"/>
-            </w:pPr>
-            <w:fldSimple w:instr=" MERGEFIELD  doc_encargado  \* MERGEFORMAT ">
-              <w:r>
-                <w:rPr>
-                  <w:noProof/>
-                </w:rPr>
-                <w:t>«doc_encargado»</w:t>
-              </w:r>
-            </w:fldSimple>
-          </w:p>
-        </w:tc>
-        <w:tc>
-          <w:tcPr>
-            <w:tcW w:w="709" w:type="dxa"/>
-            <w:tcBorders>
-              <w:top w:val="nil"/>
-              <w:left w:val="single" w:sz="4" w:space="0" w:color="auto"/>
-              <w:bottom w:val="nil"/>
-              <w:right w:val="single" w:sz="4" w:space="0" w:color="auto"/>
-            </w:tcBorders>
-          </w:tcPr>
-          <w:p>
-            <w:pPr>
-              <w:tabs>
-                <w:tab w:val="left" w:pos="284"/>
-              </w:tabs>
-              <w:ind w:right="-1"/>
-            </w:pPr>
-          </w:p>
-        </w:tc>
-        <w:tc>
-          <w:tcPr>
-            <w:tcW w:w="1676" w:type="dxa"/>
-            <w:tcBorders>
-              <w:top w:val="nil"/>
-              <w:left w:val="single" w:sz="4" w:space="0" w:color="auto"/>
-              <w:bottom w:val="single" w:sz="4" w:space="0" w:color="auto"/>
-              <w:right w:val="nil"/>
-            </w:tcBorders>
-          </w:tcPr>
-          <w:p>
-            <w:pPr>
-              <w:tabs>
-                <w:tab w:val="left" w:pos="284"/>
-              </w:tabs>
-              <w:ind w:right="-1"/>
-            </w:pPr>
-          </w:p>
-        </w:tc>
-        <w:tc>
-          <w:tcPr>
-            <w:tcW w:w="1584" w:type="dxa"/>
-            <w:tcBorders>
-              <w:top w:val="nil"/>
-              <w:left w:val="nil"/>
-              <w:bottom w:val="single" w:sz="4" w:space="0" w:color="auto"/>
-              <w:right w:val="single" w:sz="4" w:space="0" w:color="auto"/>
-            </w:tcBorders>
-          </w:tcPr>
-          <w:p>
-            <w:pPr>
-              <w:tabs>
-                <w:tab w:val="left" w:pos="284"/>
-              </w:tabs>
-              <w:ind w:right="-1"/>
-            </w:pPr>
-          </w:p>
-        </w:tc>
-        <w:tc>
-          <w:tcPr>
-            <w:tcW w:w="566" w:type="dxa"/>
-            <w:tcBorders>
-              <w:top w:val="nil"/>
-              <w:left w:val="single" w:sz="4" w:space="0" w:color="auto"/>
-              <w:bottom w:val="nil"/>
-              <w:right w:val="single" w:sz="4" w:space="0" w:color="auto"/>
-            </w:tcBorders>
-          </w:tcPr>
-          <w:p>
-            <w:pPr>
-              <w:tabs>
-                <w:tab w:val="left" w:pos="284"/>
-              </w:tabs>
-              <w:ind w:right="-1"/>
-            </w:pPr>
-          </w:p>
-        </w:tc>
-        <w:tc>
-          <w:tcPr>
-            <w:tcW w:w="1808" w:type="dxa"/>
-            <w:tcBorders>
-              <w:top w:val="nil"/>
-              <w:left w:val="single" w:sz="4" w:space="0" w:color="auto"/>
-              <w:bottom w:val="single" w:sz="4" w:space="0" w:color="auto"/>
-              <w:right w:val="nil"/>
-            </w:tcBorders>
-          </w:tcPr>
-          <w:p>
-            <w:pPr>
-              <w:tabs>
-                <w:tab w:val="left" w:pos="284"/>
-              </w:tabs>
-              <w:ind w:right="-1"/>
-            </w:pPr>
-          </w:p>
-        </w:tc>
-        <w:tc>
-          <w:tcPr>
-            <w:tcW w:w="1305" w:type="dxa"/>
-            <w:tcBorders>
-              <w:top w:val="nil"/>
-              <w:left w:val="nil"/>
-              <w:bottom w:val="single" w:sz="4" w:space="0" w:color="auto"/>
-              <w:right w:val="single" w:sz="4" w:space="0" w:color="auto"/>
-            </w:tcBorders>
-          </w:tcPr>
-          <w:p>
-            <w:pPr>
-              <w:tabs>
-                <w:tab w:val="left" w:pos="284"/>
-              </w:tabs>
-              <w:ind w:right="-1"/>
-            </w:pPr>
-          </w:p>
+            </w:tcBorders>
+          </w:tcPr>
+          <w:p/>
         </w:tc>
       </w:tr>
     </w:tbl>

</xml_diff>

<commit_message>
feat: remover fondo de numero de acta de conformidad
</commit_message>
<xml_diff>
--- a/pesaje/analytica/Report/PrintActaConformidad.docx
+++ b/pesaje/analytica/Report/PrintActaConformidad.docx
@@ -67,7 +67,6 @@
               <w:bottom w:val="nil"/>
               <w:right w:val="nil"/>
             </w:tcBorders>
-            <w:shd w:val="clear" w:color="auto" w:fill="FFC000"/>
           </w:tcPr>
           <w:p>
             <w:pPr>
@@ -1795,25 +1794,7 @@
                 <w:sz w:val="16"/>
                 <w:szCs w:val="16"/>
               </w:rPr>
-              <w:t>«</w:t>
-            </w:r>
-            <w:proofErr w:type="spellStart"/>
-            <w:r>
-              <w:rPr>
-                <w:rFonts w:ascii="Calibri" w:hAnsi="Calibri" w:cs="Calibri"/>
-                <w:sz w:val="16"/>
-                <w:szCs w:val="16"/>
-              </w:rPr>
-              <w:t>item</w:t>
-            </w:r>
-            <w:proofErr w:type="spellEnd"/>
-            <w:r>
-              <w:rPr>
-                <w:rFonts w:ascii="Calibri" w:hAnsi="Calibri" w:cs="Calibri"/>
-                <w:sz w:val="16"/>
-                <w:szCs w:val="16"/>
-              </w:rPr>
-              <w:t>»</w:t>
+              <w:t>«item»</w:t>
             </w:r>
             <w:r>
               <w:rPr>
@@ -1867,25 +1848,7 @@
                 <w:sz w:val="16"/>
                 <w:szCs w:val="16"/>
               </w:rPr>
-              <w:t>«</w:t>
-            </w:r>
-            <w:proofErr w:type="spellStart"/>
-            <w:r>
-              <w:rPr>
-                <w:rFonts w:ascii="Calibri" w:hAnsi="Calibri" w:cs="Calibri"/>
-                <w:sz w:val="16"/>
-                <w:szCs w:val="16"/>
-              </w:rPr>
-              <w:t>nro_lote</w:t>
-            </w:r>
-            <w:proofErr w:type="spellEnd"/>
-            <w:r>
-              <w:rPr>
-                <w:rFonts w:ascii="Calibri" w:hAnsi="Calibri" w:cs="Calibri"/>
-                <w:sz w:val="16"/>
-                <w:szCs w:val="16"/>
-              </w:rPr>
-              <w:t>»</w:t>
+              <w:t>«nro_lote»</w:t>
             </w:r>
             <w:r>
               <w:rPr>
@@ -1939,25 +1902,7 @@
                 <w:sz w:val="16"/>
                 <w:szCs w:val="16"/>
               </w:rPr>
-              <w:t>«</w:t>
-            </w:r>
-            <w:proofErr w:type="spellStart"/>
-            <w:r>
-              <w:rPr>
-                <w:rFonts w:ascii="Calibri" w:hAnsi="Calibri" w:cs="Calibri"/>
-                <w:sz w:val="16"/>
-                <w:szCs w:val="16"/>
-              </w:rPr>
-              <w:t>cant_minero</w:t>
-            </w:r>
-            <w:proofErr w:type="spellEnd"/>
-            <w:r>
-              <w:rPr>
-                <w:rFonts w:ascii="Calibri" w:hAnsi="Calibri" w:cs="Calibri"/>
-                <w:sz w:val="16"/>
-                <w:szCs w:val="16"/>
-              </w:rPr>
-              <w:t>»</w:t>
+              <w:t>«cant_minero»</w:t>
             </w:r>
             <w:r>
               <w:rPr>
@@ -2011,25 +1956,7 @@
                 <w:sz w:val="16"/>
                 <w:szCs w:val="16"/>
               </w:rPr>
-              <w:t>«</w:t>
-            </w:r>
-            <w:proofErr w:type="spellStart"/>
-            <w:r>
-              <w:rPr>
-                <w:rFonts w:ascii="Calibri" w:hAnsi="Calibri" w:cs="Calibri"/>
-                <w:sz w:val="16"/>
-                <w:szCs w:val="16"/>
-              </w:rPr>
-              <w:t>cant</w:t>
-            </w:r>
-            <w:proofErr w:type="spellEnd"/>
-            <w:r>
-              <w:rPr>
-                <w:rFonts w:ascii="Calibri" w:hAnsi="Calibri" w:cs="Calibri"/>
-                <w:sz w:val="16"/>
-                <w:szCs w:val="16"/>
-              </w:rPr>
-              <w:t>»</w:t>
+              <w:t>«cant»</w:t>
             </w:r>
             <w:r>
               <w:rPr>
@@ -2083,25 +2010,7 @@
                 <w:sz w:val="16"/>
                 <w:szCs w:val="16"/>
               </w:rPr>
-              <w:t>«</w:t>
-            </w:r>
-            <w:proofErr w:type="spellStart"/>
-            <w:r>
-              <w:rPr>
-                <w:rFonts w:ascii="Calibri" w:hAnsi="Calibri" w:cs="Calibri"/>
-                <w:sz w:val="16"/>
-                <w:szCs w:val="16"/>
-              </w:rPr>
-              <w:t>tmh</w:t>
-            </w:r>
-            <w:proofErr w:type="spellEnd"/>
-            <w:r>
-              <w:rPr>
-                <w:rFonts w:ascii="Calibri" w:hAnsi="Calibri" w:cs="Calibri"/>
-                <w:sz w:val="16"/>
-                <w:szCs w:val="16"/>
-              </w:rPr>
-              <w:t>»</w:t>
+              <w:t>«tmh»</w:t>
             </w:r>
             <w:r>
               <w:rPr>
@@ -2209,25 +2118,7 @@
                 <w:sz w:val="16"/>
                 <w:szCs w:val="16"/>
               </w:rPr>
-              <w:t>«</w:t>
-            </w:r>
-            <w:proofErr w:type="spellStart"/>
-            <w:r>
-              <w:rPr>
-                <w:rFonts w:ascii="Calibri" w:hAnsi="Calibri" w:cs="Calibri"/>
-                <w:sz w:val="16"/>
-                <w:szCs w:val="16"/>
-              </w:rPr>
-              <w:t>nro_grr</w:t>
-            </w:r>
-            <w:proofErr w:type="spellEnd"/>
-            <w:r>
-              <w:rPr>
-                <w:rFonts w:ascii="Calibri" w:hAnsi="Calibri" w:cs="Calibri"/>
-                <w:sz w:val="16"/>
-                <w:szCs w:val="16"/>
-              </w:rPr>
-              <w:t>»</w:t>
+              <w:t>«nro_grr»</w:t>
             </w:r>
             <w:r>
               <w:rPr>
@@ -2281,25 +2172,7 @@
                 <w:sz w:val="16"/>
                 <w:szCs w:val="16"/>
               </w:rPr>
-              <w:t>«</w:t>
-            </w:r>
-            <w:proofErr w:type="spellStart"/>
-            <w:r>
-              <w:rPr>
-                <w:rFonts w:ascii="Calibri" w:hAnsi="Calibri" w:cs="Calibri"/>
-                <w:sz w:val="16"/>
-                <w:szCs w:val="16"/>
-              </w:rPr>
-              <w:t>nro_grt</w:t>
-            </w:r>
-            <w:proofErr w:type="spellEnd"/>
-            <w:r>
-              <w:rPr>
-                <w:rFonts w:ascii="Calibri" w:hAnsi="Calibri" w:cs="Calibri"/>
-                <w:sz w:val="16"/>
-                <w:szCs w:val="16"/>
-              </w:rPr>
-              <w:t>»</w:t>
+              <w:t>«nro_grt»</w:t>
             </w:r>
             <w:r>
               <w:rPr>
@@ -2353,25 +2226,7 @@
                 <w:sz w:val="16"/>
                 <w:szCs w:val="16"/>
               </w:rPr>
-              <w:t>«</w:t>
-            </w:r>
-            <w:proofErr w:type="spellStart"/>
-            <w:r>
-              <w:rPr>
-                <w:rFonts w:ascii="Calibri" w:hAnsi="Calibri" w:cs="Calibri"/>
-                <w:sz w:val="16"/>
-                <w:szCs w:val="16"/>
-              </w:rPr>
-              <w:t>observacion</w:t>
-            </w:r>
-            <w:proofErr w:type="spellEnd"/>
-            <w:r>
-              <w:rPr>
-                <w:rFonts w:ascii="Calibri" w:hAnsi="Calibri" w:cs="Calibri"/>
-                <w:sz w:val="16"/>
-                <w:szCs w:val="16"/>
-              </w:rPr>
-              <w:t>»</w:t>
+              <w:t>«observacion»</w:t>
             </w:r>
             <w:r>
               <w:rPr>

</xml_diff>

<commit_message>
feat: centrar tabla de lotes en acta de conformidad
</commit_message>
<xml_diff>
--- a/pesaje/analytica/Report/PrintActaConformidad.docx
+++ b/pesaje/analytica/Report/PrintActaConformidad.docx
@@ -1389,8 +1389,8 @@
     <w:tbl>
       <w:tblPr>
         <w:tblStyle w:val="Tablaconcuadrcula"/>
-        <w:tblW w:w="11624" w:type="dxa"/>
-        <w:tblInd w:w="-147" w:type="dxa"/>
+        <w:tblW w:w="11340" w:type="dxa"/>
+        <w:tblInd w:w="-5" w:type="dxa"/>
         <w:tblLayout w:type="fixed"/>
         <w:tblLook w:val="04A0" w:firstRow="1" w:lastRow="0" w:firstColumn="1" w:lastColumn="0" w:noHBand="0" w:noVBand="1"/>
       </w:tblPr>
@@ -1403,7 +1403,7 @@
         <w:gridCol w:w="1979"/>
         <w:gridCol w:w="1139"/>
         <w:gridCol w:w="1418"/>
-        <w:gridCol w:w="1559"/>
+        <w:gridCol w:w="1275"/>
       </w:tblGrid>
       <w:tr>
         <w:tc>
@@ -1634,7 +1634,7 @@
         </w:tc>
         <w:tc>
           <w:tcPr>
-            <w:tcW w:w="1559" w:type="dxa"/>
+            <w:tcW w:w="1275" w:type="dxa"/>
             <w:shd w:val="clear" w:color="auto" w:fill="9BC2E6"/>
           </w:tcPr>
           <w:p>
@@ -1732,8 +1732,8 @@
     <w:tbl>
       <w:tblPr>
         <w:tblStyle w:val="Tablaconcuadrcula"/>
-        <w:tblW w:w="11624" w:type="dxa"/>
-        <w:tblInd w:w="-147" w:type="dxa"/>
+        <w:tblW w:w="11340" w:type="dxa"/>
+        <w:tblInd w:w="-5" w:type="dxa"/>
         <w:tblLayout w:type="fixed"/>
         <w:tblLook w:val="04A0" w:firstRow="1" w:lastRow="0" w:firstColumn="1" w:lastColumn="0" w:noHBand="0" w:noVBand="1"/>
       </w:tblPr>
@@ -1746,7 +1746,7 @@
         <w:gridCol w:w="1979"/>
         <w:gridCol w:w="1139"/>
         <w:gridCol w:w="1418"/>
-        <w:gridCol w:w="1559"/>
+        <w:gridCol w:w="1275"/>
       </w:tblGrid>
       <w:tr>
         <w:trPr>
@@ -1794,7 +1794,25 @@
                 <w:sz w:val="16"/>
                 <w:szCs w:val="16"/>
               </w:rPr>
-              <w:t>«item»</w:t>
+              <w:t>«</w:t>
+            </w:r>
+            <w:proofErr w:type="spellStart"/>
+            <w:r>
+              <w:rPr>
+                <w:rFonts w:ascii="Calibri" w:hAnsi="Calibri" w:cs="Calibri"/>
+                <w:sz w:val="16"/>
+                <w:szCs w:val="16"/>
+              </w:rPr>
+              <w:t>item</w:t>
+            </w:r>
+            <w:proofErr w:type="spellEnd"/>
+            <w:r>
+              <w:rPr>
+                <w:rFonts w:ascii="Calibri" w:hAnsi="Calibri" w:cs="Calibri"/>
+                <w:sz w:val="16"/>
+                <w:szCs w:val="16"/>
+              </w:rPr>
+              <w:t>»</w:t>
             </w:r>
             <w:r>
               <w:rPr>
@@ -2186,7 +2204,7 @@
         </w:tc>
         <w:tc>
           <w:tcPr>
-            <w:tcW w:w="1559" w:type="dxa"/>
+            <w:tcW w:w="1275" w:type="dxa"/>
           </w:tcPr>
           <w:p>
             <w:pPr>
@@ -2305,7 +2323,7 @@
       <w:tblPr>
         <w:tblStyle w:val="Tablaconcuadrcula"/>
         <w:tblW w:w="0" w:type="auto"/>
-        <w:tblInd w:w="-147" w:type="dxa"/>
+        <w:tblInd w:w="-5" w:type="dxa"/>
         <w:tblLayout w:type="fixed"/>
         <w:tblLook w:val="04A0" w:firstRow="1" w:lastRow="0" w:firstColumn="1" w:lastColumn="0" w:noHBand="0" w:noVBand="1"/>
       </w:tblPr>

</xml_diff>

<commit_message>
feat: actualizar acta conformidad
</commit_message>
<xml_diff>
--- a/pesaje/analytica/Report/PrintActaConformidad.docx
+++ b/pesaje/analytica/Report/PrintActaConformidad.docx
@@ -1389,7 +1389,7 @@
     <w:tbl>
       <w:tblPr>
         <w:tblStyle w:val="Tablaconcuadrcula"/>
-        <w:tblW w:w="11340" w:type="dxa"/>
+        <w:tblW w:w="11482" w:type="dxa"/>
         <w:tblInd w:w="-5" w:type="dxa"/>
         <w:tblLayout w:type="fixed"/>
         <w:tblLook w:val="04A0" w:firstRow="1" w:lastRow="0" w:firstColumn="1" w:lastColumn="0" w:noHBand="0" w:noVBand="1"/>
@@ -1403,7 +1403,7 @@
         <w:gridCol w:w="1979"/>
         <w:gridCol w:w="1139"/>
         <w:gridCol w:w="1418"/>
-        <w:gridCol w:w="1275"/>
+        <w:gridCol w:w="1417"/>
       </w:tblGrid>
       <w:tr>
         <w:tc>
@@ -1634,7 +1634,7 @@
         </w:tc>
         <w:tc>
           <w:tcPr>
-            <w:tcW w:w="1275" w:type="dxa"/>
+            <w:tcW w:w="1417" w:type="dxa"/>
             <w:shd w:val="clear" w:color="auto" w:fill="9BC2E6"/>
           </w:tcPr>
           <w:p>
@@ -1732,7 +1732,7 @@
     <w:tbl>
       <w:tblPr>
         <w:tblStyle w:val="Tablaconcuadrcula"/>
-        <w:tblW w:w="11340" w:type="dxa"/>
+        <w:tblW w:w="11482" w:type="dxa"/>
         <w:tblInd w:w="-5" w:type="dxa"/>
         <w:tblLayout w:type="fixed"/>
         <w:tblLook w:val="04A0" w:firstRow="1" w:lastRow="0" w:firstColumn="1" w:lastColumn="0" w:noHBand="0" w:noVBand="1"/>
@@ -1746,7 +1746,7 @@
         <w:gridCol w:w="1979"/>
         <w:gridCol w:w="1139"/>
         <w:gridCol w:w="1418"/>
-        <w:gridCol w:w="1275"/>
+        <w:gridCol w:w="1417"/>
       </w:tblGrid>
       <w:tr>
         <w:trPr>
@@ -2204,7 +2204,7 @@
         </w:tc>
         <w:tc>
           <w:tcPr>
-            <w:tcW w:w="1275" w:type="dxa"/>
+            <w:tcW w:w="1417" w:type="dxa"/>
           </w:tcPr>
           <w:p>
             <w:pPr>

</xml_diff>